<commit_message>
Componentes funcionales en React Native
</commit_message>
<xml_diff>
--- a/Comentario sobre las prácticas.docx
+++ b/Comentario sobre las prácticas.docx
@@ -22,19 +22,45 @@
       <w:pPr>
         <w:pStyle w:val="Ttulo1"/>
       </w:pPr>
-      <w:r>
-        <w:t xml:space="preserve">Commit 1. </w:t>
-      </w:r>
-      <w:r>
-        <w:t>"Primeros pasos en React Native"</w:t>
+      <w:proofErr w:type="spellStart"/>
+      <w:r>
+        <w:t>Commit</w:t>
+      </w:r>
+      <w:proofErr w:type="spellEnd"/>
+      <w:r>
+        <w:t xml:space="preserve"> 1. </w:t>
+      </w:r>
+      <w:r>
+        <w:t xml:space="preserve">"Primeros pasos en </w:t>
+      </w:r>
+      <w:proofErr w:type="spellStart"/>
+      <w:r>
+        <w:t>React</w:t>
+      </w:r>
+      <w:proofErr w:type="spellEnd"/>
+      <w:r>
+        <w:t xml:space="preserve"> Native"</w:t>
       </w:r>
     </w:p>
     <w:p>
       <w:pPr>
         <w:jc w:val="both"/>
       </w:pPr>
-      <w:r>
-        <w:t>Commit inicial del repositorio en el que se van a hacer las prácticas correspondientes al apartado react-native de la asignatura DSM.</w:t>
+      <w:proofErr w:type="spellStart"/>
+      <w:r>
+        <w:t>Commit</w:t>
+      </w:r>
+      <w:proofErr w:type="spellEnd"/>
+      <w:r>
+        <w:t xml:space="preserve"> inicial del repositorio en el que se van a hacer las prácticas correspondientes al apartado </w:t>
+      </w:r>
+      <w:proofErr w:type="spellStart"/>
+      <w:r>
+        <w:t>react</w:t>
+      </w:r>
+      <w:proofErr w:type="spellEnd"/>
+      <w:r>
+        <w:t>-native de la asignatura DSM.</w:t>
       </w:r>
     </w:p>
     <w:p>
@@ -42,7 +68,15 @@
         <w:jc w:val="both"/>
       </w:pPr>
       <w:r>
-        <w:t>Se ha instalado Expo tanto en el repositorio como en el teléfono móvil para poder realizar el desarrollo y pruebas correctamente en tiempo real. De forma inicial la aplicación cuenta con un archivo App.js, que contiene un componente de react llamado “View”, con sus correspondientes estilos y con un texto, que es lo que se muestra cuando se visualiza la aplicación en funcionamiento.</w:t>
+        <w:t xml:space="preserve">Se ha instalado Expo tanto en el repositorio como en el teléfono móvil para poder realizar el desarrollo y pruebas correctamente en tiempo real. De forma inicial la aplicación cuenta con un archivo App.js, que contiene un componente de </w:t>
+      </w:r>
+      <w:proofErr w:type="spellStart"/>
+      <w:r>
+        <w:t>react</w:t>
+      </w:r>
+      <w:proofErr w:type="spellEnd"/>
+      <w:r>
+        <w:t xml:space="preserve"> llamado “View”, con sus correspondientes estilos y con un texto, que es lo que se muestra cuando se visualiza la aplicación en funcionamiento.</w:t>
       </w:r>
     </w:p>
     <w:p>
@@ -54,11 +88,24 @@
       <w:pPr>
         <w:pStyle w:val="Ttulo1"/>
       </w:pPr>
-      <w:r>
-        <w:t xml:space="preserve">Commit 2. </w:t>
-      </w:r>
-      <w:r>
-        <w:t>"Componentes React Native"</w:t>
+      <w:proofErr w:type="spellStart"/>
+      <w:r>
+        <w:t>Commit</w:t>
+      </w:r>
+      <w:proofErr w:type="spellEnd"/>
+      <w:r>
+        <w:t xml:space="preserve"> 2. </w:t>
+      </w:r>
+      <w:r>
+        <w:t xml:space="preserve">"Componentes </w:t>
+      </w:r>
+      <w:proofErr w:type="spellStart"/>
+      <w:r>
+        <w:t>React</w:t>
+      </w:r>
+      <w:proofErr w:type="spellEnd"/>
+      <w:r>
+        <w:t xml:space="preserve"> Native"</w:t>
       </w:r>
     </w:p>
     <w:p>
@@ -66,7 +113,15 @@
         <w:jc w:val="both"/>
       </w:pPr>
       <w:r>
-        <w:t>Continuamos avanzando con la aplicación, para estudiar los componentes de react-native y su funcionamiento hemos creado dos carpetas, una llamada componentes, donde se van a crear los nuevos componentes que vamos a usar, y otro llamado común, que contiene un documento con una lista de información que se utilizará más adelante. Además, se incluye una subcarpeta de imágenes que la aplicación irá utilizando.</w:t>
+        <w:t xml:space="preserve">Continuamos avanzando con la aplicación, para estudiar los componentes de </w:t>
+      </w:r>
+      <w:proofErr w:type="spellStart"/>
+      <w:r>
+        <w:t>react</w:t>
+      </w:r>
+      <w:proofErr w:type="spellEnd"/>
+      <w:r>
+        <w:t>-native y su funcionamiento hemos creado dos carpetas, una llamada componentes, donde se van a crear los nuevos componentes que vamos a usar, y otro llamado común, que contiene un documento con una lista de información que se utilizará más adelante. Además, se incluye una subcarpeta de imágenes que la aplicación irá utilizando.</w:t>
       </w:r>
     </w:p>
     <w:p>
@@ -74,7 +129,57 @@
         <w:jc w:val="both"/>
       </w:pPr>
       <w:r>
-        <w:t>El calendariocomponent es un componente que, utilizando list.wiew de react-native-paper, recoge los elementos de la lista de excursiones, dándoles un formato y posicionando una de las imágenes a la izquierda. Se incluyen además sus estilos. Utilizando también FlatList, un componente de react, se disponen en formato vertical.</w:t>
+        <w:t xml:space="preserve">El </w:t>
+      </w:r>
+      <w:proofErr w:type="spellStart"/>
+      <w:r>
+        <w:t>calendariocomponent</w:t>
+      </w:r>
+      <w:proofErr w:type="spellEnd"/>
+      <w:r>
+        <w:t xml:space="preserve"> es un componente que, utilizando </w:t>
+      </w:r>
+      <w:proofErr w:type="spellStart"/>
+      <w:proofErr w:type="gramStart"/>
+      <w:r>
+        <w:t>list.wiew</w:t>
+      </w:r>
+      <w:proofErr w:type="spellEnd"/>
+      <w:proofErr w:type="gramEnd"/>
+      <w:r>
+        <w:t xml:space="preserve"> de </w:t>
+      </w:r>
+      <w:proofErr w:type="spellStart"/>
+      <w:r>
+        <w:t>react</w:t>
+      </w:r>
+      <w:proofErr w:type="spellEnd"/>
+      <w:r>
+        <w:t>-native-</w:t>
+      </w:r>
+      <w:proofErr w:type="spellStart"/>
+      <w:r>
+        <w:t>paper</w:t>
+      </w:r>
+      <w:proofErr w:type="spellEnd"/>
+      <w:r>
+        <w:t xml:space="preserve">, recoge los elementos de la lista de excursiones, dándoles un formato y posicionando una de las imágenes a la izquierda. Se incluyen además sus estilos. Utilizando también </w:t>
+      </w:r>
+      <w:proofErr w:type="spellStart"/>
+      <w:r>
+        <w:t>FlatList</w:t>
+      </w:r>
+      <w:proofErr w:type="spellEnd"/>
+      <w:r>
+        <w:t xml:space="preserve">, un componente de </w:t>
+      </w:r>
+      <w:proofErr w:type="spellStart"/>
+      <w:r>
+        <w:t>react</w:t>
+      </w:r>
+      <w:proofErr w:type="spellEnd"/>
+      <w:r>
+        <w:t>, se disponen en formato vertical.</w:t>
       </w:r>
     </w:p>
     <w:p>
@@ -82,8 +187,13 @@
         <w:jc w:val="both"/>
       </w:pPr>
       <w:r>
-        <w:t>En CampobaseComponent</w:t>
-      </w:r>
+        <w:t xml:space="preserve">En </w:t>
+      </w:r>
+      <w:proofErr w:type="spellStart"/>
+      <w:r>
+        <w:t>CampobaseComponent</w:t>
+      </w:r>
+      <w:proofErr w:type="spellEnd"/>
       <w:r>
         <w:t xml:space="preserve"> se guarda la lista de excursiones y se pasan al componente calendario para que este las muestre.</w:t>
       </w:r>
@@ -93,8 +203,642 @@
         <w:jc w:val="both"/>
       </w:pPr>
       <w:r>
-        <w:t>También se ha modificado el fichero App.js para que se muestre la app correctamente, SafeAreaProvider sirve para que no se solape con la barra superior, notch y los bordes del móvil, PaperProvider activa el sistema de estilos de react native paper. En ese momento se incluye el componente campobase que, renderiza un calendario y le pasa cada una de las excursiones para que se dispongan en forma de lista como se ha explicado.</w:t>
-      </w:r>
+        <w:t xml:space="preserve">También se ha modificado el fichero App.js para que se muestre la </w:t>
+      </w:r>
+      <w:proofErr w:type="gramStart"/>
+      <w:r>
+        <w:t>app</w:t>
+      </w:r>
+      <w:proofErr w:type="gramEnd"/>
+      <w:r>
+        <w:t xml:space="preserve"> correctamente, </w:t>
+      </w:r>
+      <w:proofErr w:type="spellStart"/>
+      <w:r>
+        <w:t>SafeAreaProvider</w:t>
+      </w:r>
+      <w:proofErr w:type="spellEnd"/>
+      <w:r>
+        <w:t xml:space="preserve"> sirve para que no se solape con la barra superior, </w:t>
+      </w:r>
+      <w:proofErr w:type="spellStart"/>
+      <w:r>
+        <w:t>notch</w:t>
+      </w:r>
+      <w:proofErr w:type="spellEnd"/>
+      <w:r>
+        <w:t xml:space="preserve"> y los bordes del móvil, </w:t>
+      </w:r>
+      <w:proofErr w:type="spellStart"/>
+      <w:r>
+        <w:t>PaperProvider</w:t>
+      </w:r>
+      <w:proofErr w:type="spellEnd"/>
+      <w:r>
+        <w:t xml:space="preserve"> activa el sistema de estilos de </w:t>
+      </w:r>
+      <w:proofErr w:type="spellStart"/>
+      <w:r>
+        <w:t>react</w:t>
+      </w:r>
+      <w:proofErr w:type="spellEnd"/>
+      <w:r>
+        <w:t xml:space="preserve"> native </w:t>
+      </w:r>
+      <w:proofErr w:type="spellStart"/>
+      <w:r>
+        <w:t>paper</w:t>
+      </w:r>
+      <w:proofErr w:type="spellEnd"/>
+      <w:r>
+        <w:t xml:space="preserve">. En ese momento se incluye el componente </w:t>
+      </w:r>
+      <w:proofErr w:type="spellStart"/>
+      <w:r>
+        <w:t>campobase</w:t>
+      </w:r>
+      <w:proofErr w:type="spellEnd"/>
+      <w:r>
+        <w:t xml:space="preserve"> que, renderiza un calendario y le pasa cada una de las excursiones para que se dispongan en forma de lista como se ha explicado.</w:t>
+      </w:r>
+    </w:p>
+    <w:p>
+      <w:pPr>
+        <w:pStyle w:val="Ttulo1"/>
+        <w:jc w:val="both"/>
+      </w:pPr>
+      <w:proofErr w:type="spellStart"/>
+      <w:r>
+        <w:t>Commit</w:t>
+      </w:r>
+      <w:proofErr w:type="spellEnd"/>
+      <w:r>
+        <w:t xml:space="preserve"> 3. “</w:t>
+      </w:r>
+      <w:r>
+        <w:t xml:space="preserve">Componentes funcionales en </w:t>
+      </w:r>
+      <w:proofErr w:type="spellStart"/>
+      <w:r>
+        <w:t>React</w:t>
+      </w:r>
+      <w:proofErr w:type="spellEnd"/>
+      <w:r>
+        <w:t xml:space="preserve"> Native”</w:t>
+      </w:r>
+    </w:p>
+    <w:p>
+      <w:pPr>
+        <w:jc w:val="both"/>
+      </w:pPr>
+      <w:r>
+        <w:t xml:space="preserve">En esta parte del trabajo se va a profundizar más en los componentes funcionales de </w:t>
+      </w:r>
+      <w:proofErr w:type="spellStart"/>
+      <w:r>
+        <w:t>react</w:t>
+      </w:r>
+      <w:proofErr w:type="spellEnd"/>
+      <w:r>
+        <w:t xml:space="preserve">-native. En el </w:t>
+      </w:r>
+      <w:proofErr w:type="spellStart"/>
+      <w:r>
+        <w:t>commit</w:t>
+      </w:r>
+      <w:proofErr w:type="spellEnd"/>
+      <w:r>
+        <w:t xml:space="preserve"> anterior ya creamos uno, el calendario. En el día de hoy se va a crear otro y se va a realizar comunicación entre ellos.</w:t>
+      </w:r>
+    </w:p>
+    <w:p>
+      <w:pPr>
+        <w:jc w:val="both"/>
+      </w:pPr>
+      <w:r>
+        <w:t xml:space="preserve">El objetivo de esta parte del proyecto es crear la primera funcionalidad con interacción del usuario. Cuando se toque uno de los componentes de la lista que se creó en el día anterior se va </w:t>
+      </w:r>
+      <w:r>
+        <w:lastRenderedPageBreak/>
+        <w:t xml:space="preserve">a desplegar un componente en la parte de arriba con la información correspondiente al evento en cuestión que ha sido pulsado. </w:t>
+      </w:r>
+    </w:p>
+    <w:p>
+      <w:pPr>
+        <w:jc w:val="both"/>
+      </w:pPr>
+      <w:r>
+        <w:t xml:space="preserve">El componente se llama </w:t>
+      </w:r>
+      <w:proofErr w:type="spellStart"/>
+      <w:r>
+        <w:t>DetalleExcursionComponent</w:t>
+      </w:r>
+      <w:proofErr w:type="spellEnd"/>
+      <w:r>
+        <w:t xml:space="preserve">, que </w:t>
+      </w:r>
+      <w:r>
+        <w:t xml:space="preserve">muestra una tarjeta (Card) con los datos de una excursión (nombre, imagen y descripción) usando </w:t>
+      </w:r>
+      <w:proofErr w:type="spellStart"/>
+      <w:r>
+        <w:t>react</w:t>
+      </w:r>
+      <w:proofErr w:type="spellEnd"/>
+      <w:r>
+        <w:t>-native-</w:t>
+      </w:r>
+      <w:proofErr w:type="spellStart"/>
+      <w:r>
+        <w:t>paper</w:t>
+      </w:r>
+      <w:proofErr w:type="spellEnd"/>
+      <w:r>
+        <w:t>.</w:t>
+      </w:r>
+    </w:p>
+    <w:p>
+      <w:pPr>
+        <w:jc w:val="both"/>
+      </w:pPr>
+      <w:r>
+        <w:t xml:space="preserve">Si recibe una excursión válida por </w:t>
+      </w:r>
+      <w:proofErr w:type="spellStart"/>
+      <w:r>
+        <w:t>props</w:t>
+      </w:r>
+      <w:proofErr w:type="spellEnd"/>
+      <w:r>
+        <w:t>, la renderiza</w:t>
+      </w:r>
+      <w:r>
+        <w:t>,</w:t>
+      </w:r>
+      <w:r>
+        <w:t xml:space="preserve"> si no, devuelve una vista vacía (View).</w:t>
+      </w:r>
+      <w:r>
+        <w:t xml:space="preserve"> </w:t>
+      </w:r>
+      <w:r>
+        <w:t xml:space="preserve">Se comunica con otros componentes a través de </w:t>
+      </w:r>
+      <w:proofErr w:type="spellStart"/>
+      <w:r>
+        <w:t>props</w:t>
+      </w:r>
+      <w:proofErr w:type="spellEnd"/>
+      <w:r>
+        <w:t xml:space="preserve">: el componente padre le pasa un objeto </w:t>
+      </w:r>
+      <w:proofErr w:type="spellStart"/>
+      <w:r>
+        <w:t>excursion</w:t>
+      </w:r>
+      <w:proofErr w:type="spellEnd"/>
+      <w:r>
+        <w:t xml:space="preserve"> (</w:t>
+      </w:r>
+      <w:proofErr w:type="spellStart"/>
+      <w:proofErr w:type="gramStart"/>
+      <w:r>
+        <w:t>props.excursion</w:t>
+      </w:r>
+      <w:proofErr w:type="spellEnd"/>
+      <w:proofErr w:type="gramEnd"/>
+      <w:r>
+        <w:t>) y este lo utiliza para mostrar la información.</w:t>
+      </w:r>
+    </w:p>
+    <w:p>
+      <w:pPr>
+        <w:jc w:val="both"/>
+      </w:pPr>
+      <w:r>
+        <w:t xml:space="preserve">Además, </w:t>
+      </w:r>
+      <w:proofErr w:type="spellStart"/>
+      <w:r>
+        <w:t>DetalleExcursion</w:t>
+      </w:r>
+      <w:proofErr w:type="spellEnd"/>
+      <w:r>
+        <w:t xml:space="preserve"> actúa como intermediario, recibiendo las </w:t>
+      </w:r>
+      <w:proofErr w:type="spellStart"/>
+      <w:r>
+        <w:t>props</w:t>
+      </w:r>
+      <w:proofErr w:type="spellEnd"/>
+      <w:r>
+        <w:t xml:space="preserve"> y pasándoselas a </w:t>
+      </w:r>
+      <w:proofErr w:type="spellStart"/>
+      <w:r>
+        <w:t>RenderExcursion</w:t>
+      </w:r>
+      <w:proofErr w:type="spellEnd"/>
+      <w:r>
+        <w:t>, manteniendo así la comunicación entre componentes.</w:t>
+      </w:r>
+    </w:p>
+    <w:p>
+      <w:pPr>
+        <w:jc w:val="both"/>
+      </w:pPr>
+      <w:r>
+        <w:t>Por otra parte, modificamos el componente calendario para que cumpla las siguientes funciones:</w:t>
+      </w:r>
+    </w:p>
+    <w:p>
+      <w:pPr>
+        <w:pStyle w:val="Prrafodelista"/>
+        <w:numPr>
+          <w:ilvl w:val="0"/>
+          <w:numId w:val="5"/>
+        </w:numPr>
+        <w:jc w:val="both"/>
+      </w:pPr>
+      <w:r>
+        <w:t>Se añade un estado (</w:t>
+      </w:r>
+      <w:proofErr w:type="spellStart"/>
+      <w:r>
+        <w:t>seleccionExcursion</w:t>
+      </w:r>
+      <w:proofErr w:type="spellEnd"/>
+      <w:r>
+        <w:t xml:space="preserve">) que guarda qué excursión está seleccionada. </w:t>
+      </w:r>
+    </w:p>
+    <w:p>
+      <w:pPr>
+        <w:pStyle w:val="Prrafodelista"/>
+        <w:numPr>
+          <w:ilvl w:val="0"/>
+          <w:numId w:val="5"/>
+        </w:numPr>
+        <w:jc w:val="both"/>
+      </w:pPr>
+      <w:r>
+        <w:t xml:space="preserve">Cuando el usuario pulsa en Calendario, se llama a </w:t>
+      </w:r>
+      <w:proofErr w:type="spellStart"/>
+      <w:r>
+        <w:t>onSeleccionExcursion</w:t>
+      </w:r>
+      <w:proofErr w:type="spellEnd"/>
+      <w:r>
+        <w:t xml:space="preserve">, que actualiza ese estado con el id. </w:t>
+      </w:r>
+    </w:p>
+    <w:p>
+      <w:pPr>
+        <w:pStyle w:val="Prrafodelista"/>
+        <w:numPr>
+          <w:ilvl w:val="0"/>
+          <w:numId w:val="5"/>
+        </w:numPr>
+        <w:jc w:val="both"/>
+      </w:pPr>
+      <w:r>
+        <w:t xml:space="preserve">Luego, </w:t>
+      </w:r>
+      <w:proofErr w:type="spellStart"/>
+      <w:r>
+        <w:t>DetalleExcursion</w:t>
+      </w:r>
+      <w:proofErr w:type="spellEnd"/>
+      <w:r>
+        <w:t xml:space="preserve"> recibe por </w:t>
+      </w:r>
+      <w:proofErr w:type="spellStart"/>
+      <w:r>
+        <w:t>props</w:t>
+      </w:r>
+      <w:proofErr w:type="spellEnd"/>
+      <w:r>
+        <w:t xml:space="preserve"> la excursión filtrada según ese id y muestra su información.</w:t>
+      </w:r>
+    </w:p>
+    <w:p>
+      <w:pPr>
+        <w:spacing w:before="100" w:beforeAutospacing="1" w:after="100" w:afterAutospacing="1" w:line="240" w:lineRule="auto"/>
+        <w:jc w:val="both"/>
+        <w:rPr>
+          <w:rFonts w:eastAsia="Times New Roman" w:cstheme="minorHAnsi"/>
+          <w:lang w:eastAsia="es-ES"/>
+        </w:rPr>
+      </w:pPr>
+      <w:r>
+        <w:rPr>
+          <w:rFonts w:eastAsia="Times New Roman" w:cstheme="minorHAnsi"/>
+          <w:lang w:eastAsia="es-ES"/>
+        </w:rPr>
+        <w:t xml:space="preserve">La excursión seleccionada se obtiene mediante el método </w:t>
+      </w:r>
+      <w:proofErr w:type="spellStart"/>
+      <w:r>
+        <w:rPr>
+          <w:rFonts w:eastAsia="Times New Roman" w:cstheme="minorHAnsi"/>
+          <w:lang w:eastAsia="es-ES"/>
+        </w:rPr>
+        <w:t>filter</w:t>
+      </w:r>
+      <w:proofErr w:type="spellEnd"/>
+      <w:r>
+        <w:rPr>
+          <w:rFonts w:eastAsia="Times New Roman" w:cstheme="minorHAnsi"/>
+          <w:lang w:eastAsia="es-ES"/>
+        </w:rPr>
+        <w:t xml:space="preserve"> de JavaScript aplicado al array </w:t>
+      </w:r>
+      <w:proofErr w:type="spellStart"/>
+      <w:proofErr w:type="gramStart"/>
+      <w:r>
+        <w:rPr>
+          <w:rFonts w:eastAsia="Times New Roman" w:cstheme="minorHAnsi"/>
+          <w:lang w:eastAsia="es-ES"/>
+        </w:rPr>
+        <w:t>this.state</w:t>
+      </w:r>
+      <w:proofErr w:type="gramEnd"/>
+      <w:r>
+        <w:rPr>
+          <w:rFonts w:eastAsia="Times New Roman" w:cstheme="minorHAnsi"/>
+          <w:lang w:eastAsia="es-ES"/>
+        </w:rPr>
+        <w:t>.excursiones</w:t>
+      </w:r>
+      <w:proofErr w:type="spellEnd"/>
+      <w:r>
+        <w:rPr>
+          <w:rFonts w:eastAsia="Times New Roman" w:cstheme="minorHAnsi"/>
+          <w:lang w:eastAsia="es-ES"/>
+        </w:rPr>
+        <w:t>.</w:t>
+      </w:r>
+    </w:p>
+    <w:p>
+      <w:pPr>
+        <w:spacing w:before="100" w:beforeAutospacing="1" w:after="100" w:afterAutospacing="1" w:line="240" w:lineRule="auto"/>
+        <w:jc w:val="both"/>
+        <w:rPr>
+          <w:rFonts w:eastAsia="Times New Roman" w:cstheme="minorHAnsi"/>
+          <w:lang w:eastAsia="es-ES"/>
+        </w:rPr>
+      </w:pPr>
+      <w:r>
+        <w:rPr>
+          <w:rFonts w:eastAsia="Times New Roman" w:cstheme="minorHAnsi"/>
+          <w:lang w:eastAsia="es-ES"/>
+        </w:rPr>
+        <w:t xml:space="preserve">Este filtro recorre todas las excursiones y devuelve solo aquellas cuyo id coincide con </w:t>
+      </w:r>
+      <w:proofErr w:type="spellStart"/>
+      <w:r>
+        <w:rPr>
+          <w:rFonts w:eastAsia="Times New Roman" w:cstheme="minorHAnsi"/>
+          <w:lang w:eastAsia="es-ES"/>
+        </w:rPr>
+        <w:t>seleccionExcursion</w:t>
+      </w:r>
+      <w:proofErr w:type="spellEnd"/>
+      <w:r>
+        <w:rPr>
+          <w:rFonts w:eastAsia="Times New Roman" w:cstheme="minorHAnsi"/>
+          <w:lang w:eastAsia="es-ES"/>
+        </w:rPr>
+        <w:t xml:space="preserve">. Como </w:t>
+      </w:r>
+      <w:proofErr w:type="spellStart"/>
+      <w:r>
+        <w:rPr>
+          <w:rFonts w:eastAsia="Times New Roman" w:cstheme="minorHAnsi"/>
+          <w:lang w:eastAsia="es-ES"/>
+        </w:rPr>
+        <w:t>filter</w:t>
+      </w:r>
+      <w:proofErr w:type="spellEnd"/>
+      <w:r>
+        <w:rPr>
+          <w:rFonts w:eastAsia="Times New Roman" w:cstheme="minorHAnsi"/>
+          <w:lang w:eastAsia="es-ES"/>
+        </w:rPr>
+        <w:t xml:space="preserve"> devuelve un array, se accede al primer elemento con [0] para obtener directamente el objeto de la excursión.</w:t>
+      </w:r>
+    </w:p>
+    <w:p>
+      <w:pPr>
+        <w:spacing w:before="100" w:beforeAutospacing="1" w:after="100" w:afterAutospacing="1" w:line="240" w:lineRule="auto"/>
+        <w:jc w:val="both"/>
+        <w:rPr>
+          <w:rFonts w:eastAsia="Times New Roman" w:cstheme="minorHAnsi"/>
+          <w:lang w:eastAsia="es-ES"/>
+        </w:rPr>
+      </w:pPr>
+      <w:r>
+        <w:rPr>
+          <w:rFonts w:eastAsia="Times New Roman" w:cstheme="minorHAnsi"/>
+          <w:lang w:eastAsia="es-ES"/>
+        </w:rPr>
+        <w:t xml:space="preserve">Se definen dos funciones </w:t>
+      </w:r>
+      <w:proofErr w:type="spellStart"/>
+      <w:r>
+        <w:rPr>
+          <w:rFonts w:eastAsia="Times New Roman" w:cstheme="minorHAnsi"/>
+          <w:lang w:eastAsia="es-ES"/>
+        </w:rPr>
+        <w:t>onPress</w:t>
+      </w:r>
+      <w:proofErr w:type="spellEnd"/>
+      <w:r>
+        <w:rPr>
+          <w:rFonts w:eastAsia="Times New Roman" w:cstheme="minorHAnsi"/>
+          <w:lang w:eastAsia="es-ES"/>
+        </w:rPr>
+        <w:t xml:space="preserve"> con usos diferentes:</w:t>
+      </w:r>
+    </w:p>
+    <w:p>
+      <w:pPr>
+        <w:pStyle w:val="Prrafodelista"/>
+        <w:numPr>
+          <w:ilvl w:val="0"/>
+          <w:numId w:val="6"/>
+        </w:numPr>
+        <w:spacing w:before="100" w:beforeAutospacing="1" w:after="100" w:afterAutospacing="1" w:line="240" w:lineRule="auto"/>
+        <w:jc w:val="both"/>
+        <w:rPr>
+          <w:rFonts w:eastAsia="Times New Roman" w:cstheme="minorHAnsi"/>
+          <w:lang w:eastAsia="es-ES"/>
+        </w:rPr>
+      </w:pPr>
+      <w:proofErr w:type="spellStart"/>
+      <w:r>
+        <w:rPr>
+          <w:rFonts w:eastAsia="Times New Roman" w:cstheme="minorHAnsi"/>
+          <w:lang w:eastAsia="es-ES"/>
+        </w:rPr>
+        <w:t>onPress</w:t>
+      </w:r>
+      <w:proofErr w:type="spellEnd"/>
+      <w:r>
+        <w:rPr>
+          <w:rFonts w:eastAsia="Times New Roman" w:cstheme="minorHAnsi"/>
+          <w:lang w:eastAsia="es-ES"/>
+        </w:rPr>
+        <w:t xml:space="preserve"> de </w:t>
+      </w:r>
+      <w:proofErr w:type="spellStart"/>
+      <w:r>
+        <w:rPr>
+          <w:rFonts w:eastAsia="Times New Roman" w:cstheme="minorHAnsi"/>
+          <w:lang w:eastAsia="es-ES"/>
+        </w:rPr>
+        <w:t>List.Item</w:t>
+      </w:r>
+      <w:proofErr w:type="spellEnd"/>
+      <w:r>
+        <w:rPr>
+          <w:rFonts w:eastAsia="Times New Roman" w:cstheme="minorHAnsi"/>
+          <w:lang w:eastAsia="es-ES"/>
+        </w:rPr>
+        <w:t xml:space="preserve">: es una </w:t>
+      </w:r>
+      <w:proofErr w:type="spellStart"/>
+      <w:r>
+        <w:rPr>
+          <w:rFonts w:eastAsia="Times New Roman" w:cstheme="minorHAnsi"/>
+          <w:lang w:eastAsia="es-ES"/>
+        </w:rPr>
+        <w:t>prop</w:t>
+      </w:r>
+      <w:proofErr w:type="spellEnd"/>
+      <w:r>
+        <w:rPr>
+          <w:rFonts w:eastAsia="Times New Roman" w:cstheme="minorHAnsi"/>
+          <w:lang w:eastAsia="es-ES"/>
+        </w:rPr>
+        <w:t xml:space="preserve"> ya definida por </w:t>
+      </w:r>
+      <w:proofErr w:type="spellStart"/>
+      <w:r>
+        <w:rPr>
+          <w:rFonts w:eastAsia="Times New Roman" w:cstheme="minorHAnsi"/>
+          <w:lang w:eastAsia="es-ES"/>
+        </w:rPr>
+        <w:t>React</w:t>
+      </w:r>
+      <w:proofErr w:type="spellEnd"/>
+      <w:r>
+        <w:rPr>
+          <w:rFonts w:eastAsia="Times New Roman" w:cstheme="minorHAnsi"/>
+          <w:lang w:eastAsia="es-ES"/>
+        </w:rPr>
+        <w:t xml:space="preserve"> Native Paper, que se ejecuta automáticamente cuando el usuario pulsa el elemento. </w:t>
+      </w:r>
+    </w:p>
+    <w:p>
+      <w:pPr>
+        <w:pStyle w:val="Prrafodelista"/>
+        <w:numPr>
+          <w:ilvl w:val="0"/>
+          <w:numId w:val="6"/>
+        </w:numPr>
+        <w:spacing w:before="100" w:beforeAutospacing="1" w:after="100" w:afterAutospacing="1" w:line="240" w:lineRule="auto"/>
+        <w:jc w:val="both"/>
+        <w:rPr>
+          <w:rFonts w:eastAsia="Times New Roman" w:cstheme="minorHAnsi"/>
+          <w:lang w:eastAsia="es-ES"/>
+        </w:rPr>
+      </w:pPr>
+      <w:proofErr w:type="spellStart"/>
+      <w:r>
+        <w:rPr>
+          <w:rFonts w:eastAsia="Times New Roman" w:cstheme="minorHAnsi"/>
+          <w:lang w:eastAsia="es-ES"/>
+        </w:rPr>
+        <w:t>onPress</w:t>
+      </w:r>
+      <w:proofErr w:type="spellEnd"/>
+      <w:r>
+        <w:rPr>
+          <w:rFonts w:eastAsia="Times New Roman" w:cstheme="minorHAnsi"/>
+          <w:lang w:eastAsia="es-ES"/>
+        </w:rPr>
+        <w:t xml:space="preserve"> del componente Calendario: es una función personalizada (</w:t>
+      </w:r>
+      <w:proofErr w:type="spellStart"/>
+      <w:r>
+        <w:rPr>
+          <w:rFonts w:eastAsia="Times New Roman" w:cstheme="minorHAnsi"/>
+          <w:lang w:eastAsia="es-ES"/>
+        </w:rPr>
+        <w:t>prop</w:t>
+      </w:r>
+      <w:proofErr w:type="spellEnd"/>
+      <w:r>
+        <w:rPr>
+          <w:rFonts w:eastAsia="Times New Roman" w:cstheme="minorHAnsi"/>
+          <w:lang w:eastAsia="es-ES"/>
+        </w:rPr>
+        <w:t>) que tú defines y pasas desde el componente padre (</w:t>
+      </w:r>
+      <w:proofErr w:type="spellStart"/>
+      <w:r>
+        <w:rPr>
+          <w:rFonts w:eastAsia="Times New Roman" w:cstheme="minorHAnsi"/>
+          <w:lang w:eastAsia="es-ES"/>
+        </w:rPr>
+        <w:t>Campobase</w:t>
+      </w:r>
+      <w:proofErr w:type="spellEnd"/>
+      <w:r>
+        <w:rPr>
+          <w:rFonts w:eastAsia="Times New Roman" w:cstheme="minorHAnsi"/>
+          <w:lang w:eastAsia="es-ES"/>
+        </w:rPr>
+        <w:t>). Su nombre es arbitrario.</w:t>
+      </w:r>
+    </w:p>
+    <w:p>
+      <w:pPr>
+        <w:spacing w:before="100" w:beforeAutospacing="1" w:after="100" w:afterAutospacing="1" w:line="240" w:lineRule="auto"/>
+        <w:jc w:val="both"/>
+        <w:rPr>
+          <w:rFonts w:eastAsia="Times New Roman" w:cstheme="minorHAnsi"/>
+          <w:lang w:eastAsia="es-ES"/>
+        </w:rPr>
+      </w:pPr>
+    </w:p>
+    <w:p>
+      <w:pPr>
+        <w:spacing w:before="100" w:beforeAutospacing="1" w:after="100" w:afterAutospacing="1" w:line="240" w:lineRule="auto"/>
+        <w:jc w:val="both"/>
+        <w:rPr>
+          <w:rFonts w:eastAsia="Times New Roman" w:cstheme="minorHAnsi"/>
+          <w:lang w:eastAsia="es-ES"/>
+        </w:rPr>
+      </w:pPr>
+    </w:p>
+    <w:p>
+      <w:pPr>
+        <w:jc w:val="both"/>
+      </w:pPr>
+    </w:p>
+    <w:p>
+      <w:pPr>
+        <w:jc w:val="both"/>
+      </w:pPr>
+    </w:p>
+    <w:p>
+      <w:pPr>
+        <w:jc w:val="both"/>
+      </w:pPr>
     </w:p>
     <w:p>
       <w:pPr>
@@ -109,6 +853,706 @@
     </w:sectPr>
   </w:body>
 </w:document>
+</file>
+
+<file path=word/numbering.xml><?xml version="1.0" encoding="utf-8"?>
+<w:numbering xmlns:wpc="http://schemas.microsoft.com/office/word/2010/wordprocessingCanvas" xmlns:cx="http://schemas.microsoft.com/office/drawing/2014/chartex" xmlns:cx1="http://schemas.microsoft.com/office/drawing/2015/9/8/chartex" xmlns:cx2="http://schemas.microsoft.com/office/drawing/2015/10/21/chartex" xmlns:cx3="http://schemas.microsoft.com/office/drawing/2016/5/9/chartex" xmlns:cx4="http://schemas.microsoft.com/office/drawing/2016/5/10/chartex" xmlns:cx5="http://schemas.microsoft.com/office/drawing/2016/5/11/chartex" xmlns:cx6="http://schemas.microsoft.com/office/drawing/2016/5/12/chartex" xmlns:cx7="http://schemas.microsoft.com/office/drawing/2016/5/13/chartex" xmlns:cx8="http://schemas.microsoft.com/office/drawing/2016/5/14/chartex" xmlns:mc="http://schemas.openxmlformats.org/markup-compatibility/2006" xmlns:aink="http://schemas.microsoft.com/office/drawing/2016/ink" xmlns:am3d="http://schemas.microsoft.com/office/drawing/2017/model3d" xmlns:o="urn:schemas-microsoft-com:office:office" xmlns:oel="http://schemas.microsoft.com/office/2019/extlst" xmlns:r="http://schemas.openxmlformats.org/officeDocument/2006/relationships" xmlns:m="http://schemas.openxmlformats.org/officeDocument/2006/math" xmlns:v="urn:schemas-microsoft-com:vml" xmlns:wp14="http://schemas.microsoft.com/office/word/2010/wordprocessingDrawing" xmlns:wp="http://schemas.openxmlformats.org/drawingml/2006/wordprocessingDrawing" xmlns:w10="urn:schemas-microsoft-com:office:word" xmlns:w="http://schemas.openxmlformats.org/wordprocessingml/2006/main" xmlns:w14="http://schemas.microsoft.com/office/word/2010/wordml" xmlns:w15="http://schemas.microsoft.com/office/word/2012/wordml" xmlns:w16cex="http://schemas.microsoft.com/office/word/2018/wordml/cex" xmlns:w16cid="http://schemas.microsoft.com/office/word/2016/wordml/cid" xmlns:w16="http://schemas.microsoft.com/office/word/2018/wordml" xmlns:w16du="http://schemas.microsoft.com/office/word/2023/wordml/word16du" xmlns:w16sdtdh="http://schemas.microsoft.com/office/word/2020/wordml/sdtdatahash" xmlns:w16sdtfl="http://schemas.microsoft.com/office/word/2024/wordml/sdtformatlock" xmlns:w16se="http://schemas.microsoft.com/office/word/2015/wordml/symex" xmlns:wpg="http://schemas.microsoft.com/office/word/2010/wordprocessingGroup" xmlns:wpi="http://schemas.microsoft.com/office/word/2010/wordprocessingInk" xmlns:wne="http://schemas.microsoft.com/office/word/2006/wordml" xmlns:wps="http://schemas.microsoft.com/office/word/2010/wordprocessingShape" mc:Ignorable="w14 w15 w16se w16cid w16 w16cex w16sdtdh w16sdtfl w16du wp14">
+  <w:abstractNum w:abstractNumId="0" w15:restartNumberingAfterBreak="0">
+    <w:nsid w:val="0B7003FC"/>
+    <w:multiLevelType w:val="hybridMultilevel"/>
+    <w:tmpl w:val="18F01636"/>
+    <w:lvl w:ilvl="0" w:tplc="0C0A0001">
+      <w:start w:val="1"/>
+      <w:numFmt w:val="bullet"/>
+      <w:lvlText w:val=""/>
+      <w:lvlJc w:val="left"/>
+      <w:pPr>
+        <w:ind w:left="720" w:hanging="360"/>
+      </w:pPr>
+      <w:rPr>
+        <w:rFonts w:ascii="Symbol" w:hAnsi="Symbol" w:hint="default"/>
+      </w:rPr>
+    </w:lvl>
+    <w:lvl w:ilvl="1" w:tplc="0C0A0003">
+      <w:start w:val="1"/>
+      <w:numFmt w:val="bullet"/>
+      <w:lvlText w:val="o"/>
+      <w:lvlJc w:val="left"/>
+      <w:pPr>
+        <w:ind w:left="1440" w:hanging="360"/>
+      </w:pPr>
+      <w:rPr>
+        <w:rFonts w:ascii="Courier New" w:hAnsi="Courier New" w:cs="Courier New" w:hint="default"/>
+      </w:rPr>
+    </w:lvl>
+    <w:lvl w:ilvl="2" w:tplc="0C0A0005" w:tentative="1">
+      <w:start w:val="1"/>
+      <w:numFmt w:val="bullet"/>
+      <w:lvlText w:val=""/>
+      <w:lvlJc w:val="left"/>
+      <w:pPr>
+        <w:ind w:left="2160" w:hanging="360"/>
+      </w:pPr>
+      <w:rPr>
+        <w:rFonts w:ascii="Wingdings" w:hAnsi="Wingdings" w:hint="default"/>
+      </w:rPr>
+    </w:lvl>
+    <w:lvl w:ilvl="3" w:tplc="0C0A0001" w:tentative="1">
+      <w:start w:val="1"/>
+      <w:numFmt w:val="bullet"/>
+      <w:lvlText w:val=""/>
+      <w:lvlJc w:val="left"/>
+      <w:pPr>
+        <w:ind w:left="2880" w:hanging="360"/>
+      </w:pPr>
+      <w:rPr>
+        <w:rFonts w:ascii="Symbol" w:hAnsi="Symbol" w:hint="default"/>
+      </w:rPr>
+    </w:lvl>
+    <w:lvl w:ilvl="4" w:tplc="0C0A0003" w:tentative="1">
+      <w:start w:val="1"/>
+      <w:numFmt w:val="bullet"/>
+      <w:lvlText w:val="o"/>
+      <w:lvlJc w:val="left"/>
+      <w:pPr>
+        <w:ind w:left="3600" w:hanging="360"/>
+      </w:pPr>
+      <w:rPr>
+        <w:rFonts w:ascii="Courier New" w:hAnsi="Courier New" w:cs="Courier New" w:hint="default"/>
+      </w:rPr>
+    </w:lvl>
+    <w:lvl w:ilvl="5" w:tplc="0C0A0005" w:tentative="1">
+      <w:start w:val="1"/>
+      <w:numFmt w:val="bullet"/>
+      <w:lvlText w:val=""/>
+      <w:lvlJc w:val="left"/>
+      <w:pPr>
+        <w:ind w:left="4320" w:hanging="360"/>
+      </w:pPr>
+      <w:rPr>
+        <w:rFonts w:ascii="Wingdings" w:hAnsi="Wingdings" w:hint="default"/>
+      </w:rPr>
+    </w:lvl>
+    <w:lvl w:ilvl="6" w:tplc="0C0A0001" w:tentative="1">
+      <w:start w:val="1"/>
+      <w:numFmt w:val="bullet"/>
+      <w:lvlText w:val=""/>
+      <w:lvlJc w:val="left"/>
+      <w:pPr>
+        <w:ind w:left="5040" w:hanging="360"/>
+      </w:pPr>
+      <w:rPr>
+        <w:rFonts w:ascii="Symbol" w:hAnsi="Symbol" w:hint="default"/>
+      </w:rPr>
+    </w:lvl>
+    <w:lvl w:ilvl="7" w:tplc="0C0A0003" w:tentative="1">
+      <w:start w:val="1"/>
+      <w:numFmt w:val="bullet"/>
+      <w:lvlText w:val="o"/>
+      <w:lvlJc w:val="left"/>
+      <w:pPr>
+        <w:ind w:left="5760" w:hanging="360"/>
+      </w:pPr>
+      <w:rPr>
+        <w:rFonts w:ascii="Courier New" w:hAnsi="Courier New" w:cs="Courier New" w:hint="default"/>
+      </w:rPr>
+    </w:lvl>
+    <w:lvl w:ilvl="8" w:tplc="0C0A0005" w:tentative="1">
+      <w:start w:val="1"/>
+      <w:numFmt w:val="bullet"/>
+      <w:lvlText w:val=""/>
+      <w:lvlJc w:val="left"/>
+      <w:pPr>
+        <w:ind w:left="6480" w:hanging="360"/>
+      </w:pPr>
+      <w:rPr>
+        <w:rFonts w:ascii="Wingdings" w:hAnsi="Wingdings" w:hint="default"/>
+      </w:rPr>
+    </w:lvl>
+  </w:abstractNum>
+  <w:abstractNum w:abstractNumId="1" w15:restartNumberingAfterBreak="0">
+    <w:nsid w:val="12E162AD"/>
+    <w:multiLevelType w:val="hybridMultilevel"/>
+    <w:tmpl w:val="C59EEED6"/>
+    <w:lvl w:ilvl="0" w:tplc="656074A8">
+      <w:numFmt w:val="bullet"/>
+      <w:lvlText w:val=""/>
+      <w:lvlJc w:val="left"/>
+      <w:pPr>
+        <w:ind w:left="720" w:hanging="360"/>
+      </w:pPr>
+      <w:rPr>
+        <w:rFonts w:ascii="Calibri" w:eastAsiaTheme="minorHAnsi" w:hAnsi="Calibri" w:cs="Calibri" w:hint="default"/>
+      </w:rPr>
+    </w:lvl>
+    <w:lvl w:ilvl="1" w:tplc="0C0A0003" w:tentative="1">
+      <w:start w:val="1"/>
+      <w:numFmt w:val="bullet"/>
+      <w:lvlText w:val="o"/>
+      <w:lvlJc w:val="left"/>
+      <w:pPr>
+        <w:ind w:left="1440" w:hanging="360"/>
+      </w:pPr>
+      <w:rPr>
+        <w:rFonts w:ascii="Courier New" w:hAnsi="Courier New" w:cs="Courier New" w:hint="default"/>
+      </w:rPr>
+    </w:lvl>
+    <w:lvl w:ilvl="2" w:tplc="0C0A0005" w:tentative="1">
+      <w:start w:val="1"/>
+      <w:numFmt w:val="bullet"/>
+      <w:lvlText w:val=""/>
+      <w:lvlJc w:val="left"/>
+      <w:pPr>
+        <w:ind w:left="2160" w:hanging="360"/>
+      </w:pPr>
+      <w:rPr>
+        <w:rFonts w:ascii="Wingdings" w:hAnsi="Wingdings" w:hint="default"/>
+      </w:rPr>
+    </w:lvl>
+    <w:lvl w:ilvl="3" w:tplc="0C0A0001" w:tentative="1">
+      <w:start w:val="1"/>
+      <w:numFmt w:val="bullet"/>
+      <w:lvlText w:val=""/>
+      <w:lvlJc w:val="left"/>
+      <w:pPr>
+        <w:ind w:left="2880" w:hanging="360"/>
+      </w:pPr>
+      <w:rPr>
+        <w:rFonts w:ascii="Symbol" w:hAnsi="Symbol" w:hint="default"/>
+      </w:rPr>
+    </w:lvl>
+    <w:lvl w:ilvl="4" w:tplc="0C0A0003" w:tentative="1">
+      <w:start w:val="1"/>
+      <w:numFmt w:val="bullet"/>
+      <w:lvlText w:val="o"/>
+      <w:lvlJc w:val="left"/>
+      <w:pPr>
+        <w:ind w:left="3600" w:hanging="360"/>
+      </w:pPr>
+      <w:rPr>
+        <w:rFonts w:ascii="Courier New" w:hAnsi="Courier New" w:cs="Courier New" w:hint="default"/>
+      </w:rPr>
+    </w:lvl>
+    <w:lvl w:ilvl="5" w:tplc="0C0A0005" w:tentative="1">
+      <w:start w:val="1"/>
+      <w:numFmt w:val="bullet"/>
+      <w:lvlText w:val=""/>
+      <w:lvlJc w:val="left"/>
+      <w:pPr>
+        <w:ind w:left="4320" w:hanging="360"/>
+      </w:pPr>
+      <w:rPr>
+        <w:rFonts w:ascii="Wingdings" w:hAnsi="Wingdings" w:hint="default"/>
+      </w:rPr>
+    </w:lvl>
+    <w:lvl w:ilvl="6" w:tplc="0C0A0001" w:tentative="1">
+      <w:start w:val="1"/>
+      <w:numFmt w:val="bullet"/>
+      <w:lvlText w:val=""/>
+      <w:lvlJc w:val="left"/>
+      <w:pPr>
+        <w:ind w:left="5040" w:hanging="360"/>
+      </w:pPr>
+      <w:rPr>
+        <w:rFonts w:ascii="Symbol" w:hAnsi="Symbol" w:hint="default"/>
+      </w:rPr>
+    </w:lvl>
+    <w:lvl w:ilvl="7" w:tplc="0C0A0003" w:tentative="1">
+      <w:start w:val="1"/>
+      <w:numFmt w:val="bullet"/>
+      <w:lvlText w:val="o"/>
+      <w:lvlJc w:val="left"/>
+      <w:pPr>
+        <w:ind w:left="5760" w:hanging="360"/>
+      </w:pPr>
+      <w:rPr>
+        <w:rFonts w:ascii="Courier New" w:hAnsi="Courier New" w:cs="Courier New" w:hint="default"/>
+      </w:rPr>
+    </w:lvl>
+    <w:lvl w:ilvl="8" w:tplc="0C0A0005" w:tentative="1">
+      <w:start w:val="1"/>
+      <w:numFmt w:val="bullet"/>
+      <w:lvlText w:val=""/>
+      <w:lvlJc w:val="left"/>
+      <w:pPr>
+        <w:ind w:left="6480" w:hanging="360"/>
+      </w:pPr>
+      <w:rPr>
+        <w:rFonts w:ascii="Wingdings" w:hAnsi="Wingdings" w:hint="default"/>
+      </w:rPr>
+    </w:lvl>
+  </w:abstractNum>
+  <w:abstractNum w:abstractNumId="2" w15:restartNumberingAfterBreak="0">
+    <w:nsid w:val="325472AD"/>
+    <w:multiLevelType w:val="hybridMultilevel"/>
+    <w:tmpl w:val="4878754C"/>
+    <w:lvl w:ilvl="0" w:tplc="0C0A0001">
+      <w:start w:val="1"/>
+      <w:numFmt w:val="bullet"/>
+      <w:lvlText w:val=""/>
+      <w:lvlJc w:val="left"/>
+      <w:pPr>
+        <w:ind w:left="720" w:hanging="360"/>
+      </w:pPr>
+      <w:rPr>
+        <w:rFonts w:ascii="Symbol" w:hAnsi="Symbol" w:hint="default"/>
+      </w:rPr>
+    </w:lvl>
+    <w:lvl w:ilvl="1" w:tplc="0C0A0003" w:tentative="1">
+      <w:start w:val="1"/>
+      <w:numFmt w:val="bullet"/>
+      <w:lvlText w:val="o"/>
+      <w:lvlJc w:val="left"/>
+      <w:pPr>
+        <w:ind w:left="1440" w:hanging="360"/>
+      </w:pPr>
+      <w:rPr>
+        <w:rFonts w:ascii="Courier New" w:hAnsi="Courier New" w:cs="Courier New" w:hint="default"/>
+      </w:rPr>
+    </w:lvl>
+    <w:lvl w:ilvl="2" w:tplc="0C0A0005" w:tentative="1">
+      <w:start w:val="1"/>
+      <w:numFmt w:val="bullet"/>
+      <w:lvlText w:val=""/>
+      <w:lvlJc w:val="left"/>
+      <w:pPr>
+        <w:ind w:left="2160" w:hanging="360"/>
+      </w:pPr>
+      <w:rPr>
+        <w:rFonts w:ascii="Wingdings" w:hAnsi="Wingdings" w:hint="default"/>
+      </w:rPr>
+    </w:lvl>
+    <w:lvl w:ilvl="3" w:tplc="0C0A0001" w:tentative="1">
+      <w:start w:val="1"/>
+      <w:numFmt w:val="bullet"/>
+      <w:lvlText w:val=""/>
+      <w:lvlJc w:val="left"/>
+      <w:pPr>
+        <w:ind w:left="2880" w:hanging="360"/>
+      </w:pPr>
+      <w:rPr>
+        <w:rFonts w:ascii="Symbol" w:hAnsi="Symbol" w:hint="default"/>
+      </w:rPr>
+    </w:lvl>
+    <w:lvl w:ilvl="4" w:tplc="0C0A0003" w:tentative="1">
+      <w:start w:val="1"/>
+      <w:numFmt w:val="bullet"/>
+      <w:lvlText w:val="o"/>
+      <w:lvlJc w:val="left"/>
+      <w:pPr>
+        <w:ind w:left="3600" w:hanging="360"/>
+      </w:pPr>
+      <w:rPr>
+        <w:rFonts w:ascii="Courier New" w:hAnsi="Courier New" w:cs="Courier New" w:hint="default"/>
+      </w:rPr>
+    </w:lvl>
+    <w:lvl w:ilvl="5" w:tplc="0C0A0005" w:tentative="1">
+      <w:start w:val="1"/>
+      <w:numFmt w:val="bullet"/>
+      <w:lvlText w:val=""/>
+      <w:lvlJc w:val="left"/>
+      <w:pPr>
+        <w:ind w:left="4320" w:hanging="360"/>
+      </w:pPr>
+      <w:rPr>
+        <w:rFonts w:ascii="Wingdings" w:hAnsi="Wingdings" w:hint="default"/>
+      </w:rPr>
+    </w:lvl>
+    <w:lvl w:ilvl="6" w:tplc="0C0A0001" w:tentative="1">
+      <w:start w:val="1"/>
+      <w:numFmt w:val="bullet"/>
+      <w:lvlText w:val=""/>
+      <w:lvlJc w:val="left"/>
+      <w:pPr>
+        <w:ind w:left="5040" w:hanging="360"/>
+      </w:pPr>
+      <w:rPr>
+        <w:rFonts w:ascii="Symbol" w:hAnsi="Symbol" w:hint="default"/>
+      </w:rPr>
+    </w:lvl>
+    <w:lvl w:ilvl="7" w:tplc="0C0A0003" w:tentative="1">
+      <w:start w:val="1"/>
+      <w:numFmt w:val="bullet"/>
+      <w:lvlText w:val="o"/>
+      <w:lvlJc w:val="left"/>
+      <w:pPr>
+        <w:ind w:left="5760" w:hanging="360"/>
+      </w:pPr>
+      <w:rPr>
+        <w:rFonts w:ascii="Courier New" w:hAnsi="Courier New" w:cs="Courier New" w:hint="default"/>
+      </w:rPr>
+    </w:lvl>
+    <w:lvl w:ilvl="8" w:tplc="0C0A0005" w:tentative="1">
+      <w:start w:val="1"/>
+      <w:numFmt w:val="bullet"/>
+      <w:lvlText w:val=""/>
+      <w:lvlJc w:val="left"/>
+      <w:pPr>
+        <w:ind w:left="6480" w:hanging="360"/>
+      </w:pPr>
+      <w:rPr>
+        <w:rFonts w:ascii="Wingdings" w:hAnsi="Wingdings" w:hint="default"/>
+      </w:rPr>
+    </w:lvl>
+  </w:abstractNum>
+  <w:abstractNum w:abstractNumId="3" w15:restartNumberingAfterBreak="0">
+    <w:nsid w:val="3ACC6F0A"/>
+    <w:multiLevelType w:val="hybridMultilevel"/>
+    <w:tmpl w:val="5DBA38D0"/>
+    <w:lvl w:ilvl="0" w:tplc="0C0A0001">
+      <w:start w:val="1"/>
+      <w:numFmt w:val="bullet"/>
+      <w:lvlText w:val=""/>
+      <w:lvlJc w:val="left"/>
+      <w:pPr>
+        <w:ind w:left="1440" w:hanging="360"/>
+      </w:pPr>
+      <w:rPr>
+        <w:rFonts w:ascii="Symbol" w:hAnsi="Symbol" w:hint="default"/>
+      </w:rPr>
+    </w:lvl>
+    <w:lvl w:ilvl="1" w:tplc="0C0A0003" w:tentative="1">
+      <w:start w:val="1"/>
+      <w:numFmt w:val="bullet"/>
+      <w:lvlText w:val="o"/>
+      <w:lvlJc w:val="left"/>
+      <w:pPr>
+        <w:ind w:left="2160" w:hanging="360"/>
+      </w:pPr>
+      <w:rPr>
+        <w:rFonts w:ascii="Courier New" w:hAnsi="Courier New" w:cs="Courier New" w:hint="default"/>
+      </w:rPr>
+    </w:lvl>
+    <w:lvl w:ilvl="2" w:tplc="0C0A0005" w:tentative="1">
+      <w:start w:val="1"/>
+      <w:numFmt w:val="bullet"/>
+      <w:lvlText w:val=""/>
+      <w:lvlJc w:val="left"/>
+      <w:pPr>
+        <w:ind w:left="2880" w:hanging="360"/>
+      </w:pPr>
+      <w:rPr>
+        <w:rFonts w:ascii="Wingdings" w:hAnsi="Wingdings" w:hint="default"/>
+      </w:rPr>
+    </w:lvl>
+    <w:lvl w:ilvl="3" w:tplc="0C0A0001" w:tentative="1">
+      <w:start w:val="1"/>
+      <w:numFmt w:val="bullet"/>
+      <w:lvlText w:val=""/>
+      <w:lvlJc w:val="left"/>
+      <w:pPr>
+        <w:ind w:left="3600" w:hanging="360"/>
+      </w:pPr>
+      <w:rPr>
+        <w:rFonts w:ascii="Symbol" w:hAnsi="Symbol" w:hint="default"/>
+      </w:rPr>
+    </w:lvl>
+    <w:lvl w:ilvl="4" w:tplc="0C0A0003" w:tentative="1">
+      <w:start w:val="1"/>
+      <w:numFmt w:val="bullet"/>
+      <w:lvlText w:val="o"/>
+      <w:lvlJc w:val="left"/>
+      <w:pPr>
+        <w:ind w:left="4320" w:hanging="360"/>
+      </w:pPr>
+      <w:rPr>
+        <w:rFonts w:ascii="Courier New" w:hAnsi="Courier New" w:cs="Courier New" w:hint="default"/>
+      </w:rPr>
+    </w:lvl>
+    <w:lvl w:ilvl="5" w:tplc="0C0A0005" w:tentative="1">
+      <w:start w:val="1"/>
+      <w:numFmt w:val="bullet"/>
+      <w:lvlText w:val=""/>
+      <w:lvlJc w:val="left"/>
+      <w:pPr>
+        <w:ind w:left="5040" w:hanging="360"/>
+      </w:pPr>
+      <w:rPr>
+        <w:rFonts w:ascii="Wingdings" w:hAnsi="Wingdings" w:hint="default"/>
+      </w:rPr>
+    </w:lvl>
+    <w:lvl w:ilvl="6" w:tplc="0C0A0001" w:tentative="1">
+      <w:start w:val="1"/>
+      <w:numFmt w:val="bullet"/>
+      <w:lvlText w:val=""/>
+      <w:lvlJc w:val="left"/>
+      <w:pPr>
+        <w:ind w:left="5760" w:hanging="360"/>
+      </w:pPr>
+      <w:rPr>
+        <w:rFonts w:ascii="Symbol" w:hAnsi="Symbol" w:hint="default"/>
+      </w:rPr>
+    </w:lvl>
+    <w:lvl w:ilvl="7" w:tplc="0C0A0003" w:tentative="1">
+      <w:start w:val="1"/>
+      <w:numFmt w:val="bullet"/>
+      <w:lvlText w:val="o"/>
+      <w:lvlJc w:val="left"/>
+      <w:pPr>
+        <w:ind w:left="6480" w:hanging="360"/>
+      </w:pPr>
+      <w:rPr>
+        <w:rFonts w:ascii="Courier New" w:hAnsi="Courier New" w:cs="Courier New" w:hint="default"/>
+      </w:rPr>
+    </w:lvl>
+    <w:lvl w:ilvl="8" w:tplc="0C0A0005" w:tentative="1">
+      <w:start w:val="1"/>
+      <w:numFmt w:val="bullet"/>
+      <w:lvlText w:val=""/>
+      <w:lvlJc w:val="left"/>
+      <w:pPr>
+        <w:ind w:left="7200" w:hanging="360"/>
+      </w:pPr>
+      <w:rPr>
+        <w:rFonts w:ascii="Wingdings" w:hAnsi="Wingdings" w:hint="default"/>
+      </w:rPr>
+    </w:lvl>
+  </w:abstractNum>
+  <w:abstractNum w:abstractNumId="4" w15:restartNumberingAfterBreak="0">
+    <w:nsid w:val="5A6A6B00"/>
+    <w:multiLevelType w:val="hybridMultilevel"/>
+    <w:tmpl w:val="7420735E"/>
+    <w:lvl w:ilvl="0" w:tplc="0C0A0001">
+      <w:start w:val="1"/>
+      <w:numFmt w:val="bullet"/>
+      <w:lvlText w:val=""/>
+      <w:lvlJc w:val="left"/>
+      <w:pPr>
+        <w:ind w:left="720" w:hanging="360"/>
+      </w:pPr>
+      <w:rPr>
+        <w:rFonts w:ascii="Symbol" w:hAnsi="Symbol" w:hint="default"/>
+      </w:rPr>
+    </w:lvl>
+    <w:lvl w:ilvl="1" w:tplc="0C0A0003" w:tentative="1">
+      <w:start w:val="1"/>
+      <w:numFmt w:val="bullet"/>
+      <w:lvlText w:val="o"/>
+      <w:lvlJc w:val="left"/>
+      <w:pPr>
+        <w:ind w:left="1440" w:hanging="360"/>
+      </w:pPr>
+      <w:rPr>
+        <w:rFonts w:ascii="Courier New" w:hAnsi="Courier New" w:cs="Courier New" w:hint="default"/>
+      </w:rPr>
+    </w:lvl>
+    <w:lvl w:ilvl="2" w:tplc="0C0A0005" w:tentative="1">
+      <w:start w:val="1"/>
+      <w:numFmt w:val="bullet"/>
+      <w:lvlText w:val=""/>
+      <w:lvlJc w:val="left"/>
+      <w:pPr>
+        <w:ind w:left="2160" w:hanging="360"/>
+      </w:pPr>
+      <w:rPr>
+        <w:rFonts w:ascii="Wingdings" w:hAnsi="Wingdings" w:hint="default"/>
+      </w:rPr>
+    </w:lvl>
+    <w:lvl w:ilvl="3" w:tplc="0C0A0001" w:tentative="1">
+      <w:start w:val="1"/>
+      <w:numFmt w:val="bullet"/>
+      <w:lvlText w:val=""/>
+      <w:lvlJc w:val="left"/>
+      <w:pPr>
+        <w:ind w:left="2880" w:hanging="360"/>
+      </w:pPr>
+      <w:rPr>
+        <w:rFonts w:ascii="Symbol" w:hAnsi="Symbol" w:hint="default"/>
+      </w:rPr>
+    </w:lvl>
+    <w:lvl w:ilvl="4" w:tplc="0C0A0003" w:tentative="1">
+      <w:start w:val="1"/>
+      <w:numFmt w:val="bullet"/>
+      <w:lvlText w:val="o"/>
+      <w:lvlJc w:val="left"/>
+      <w:pPr>
+        <w:ind w:left="3600" w:hanging="360"/>
+      </w:pPr>
+      <w:rPr>
+        <w:rFonts w:ascii="Courier New" w:hAnsi="Courier New" w:cs="Courier New" w:hint="default"/>
+      </w:rPr>
+    </w:lvl>
+    <w:lvl w:ilvl="5" w:tplc="0C0A0005" w:tentative="1">
+      <w:start w:val="1"/>
+      <w:numFmt w:val="bullet"/>
+      <w:lvlText w:val=""/>
+      <w:lvlJc w:val="left"/>
+      <w:pPr>
+        <w:ind w:left="4320" w:hanging="360"/>
+      </w:pPr>
+      <w:rPr>
+        <w:rFonts w:ascii="Wingdings" w:hAnsi="Wingdings" w:hint="default"/>
+      </w:rPr>
+    </w:lvl>
+    <w:lvl w:ilvl="6" w:tplc="0C0A0001" w:tentative="1">
+      <w:start w:val="1"/>
+      <w:numFmt w:val="bullet"/>
+      <w:lvlText w:val=""/>
+      <w:lvlJc w:val="left"/>
+      <w:pPr>
+        <w:ind w:left="5040" w:hanging="360"/>
+      </w:pPr>
+      <w:rPr>
+        <w:rFonts w:ascii="Symbol" w:hAnsi="Symbol" w:hint="default"/>
+      </w:rPr>
+    </w:lvl>
+    <w:lvl w:ilvl="7" w:tplc="0C0A0003" w:tentative="1">
+      <w:start w:val="1"/>
+      <w:numFmt w:val="bullet"/>
+      <w:lvlText w:val="o"/>
+      <w:lvlJc w:val="left"/>
+      <w:pPr>
+        <w:ind w:left="5760" w:hanging="360"/>
+      </w:pPr>
+      <w:rPr>
+        <w:rFonts w:ascii="Courier New" w:hAnsi="Courier New" w:cs="Courier New" w:hint="default"/>
+      </w:rPr>
+    </w:lvl>
+    <w:lvl w:ilvl="8" w:tplc="0C0A0005" w:tentative="1">
+      <w:start w:val="1"/>
+      <w:numFmt w:val="bullet"/>
+      <w:lvlText w:val=""/>
+      <w:lvlJc w:val="left"/>
+      <w:pPr>
+        <w:ind w:left="6480" w:hanging="360"/>
+      </w:pPr>
+      <w:rPr>
+        <w:rFonts w:ascii="Wingdings" w:hAnsi="Wingdings" w:hint="default"/>
+      </w:rPr>
+    </w:lvl>
+  </w:abstractNum>
+  <w:abstractNum w:abstractNumId="5" w15:restartNumberingAfterBreak="0">
+    <w:nsid w:val="78E12896"/>
+    <w:multiLevelType w:val="hybridMultilevel"/>
+    <w:tmpl w:val="936299E4"/>
+    <w:lvl w:ilvl="0" w:tplc="0C0A0001">
+      <w:start w:val="1"/>
+      <w:numFmt w:val="bullet"/>
+      <w:lvlText w:val=""/>
+      <w:lvlJc w:val="left"/>
+      <w:pPr>
+        <w:ind w:left="720" w:hanging="360"/>
+      </w:pPr>
+      <w:rPr>
+        <w:rFonts w:ascii="Symbol" w:hAnsi="Symbol" w:hint="default"/>
+      </w:rPr>
+    </w:lvl>
+    <w:lvl w:ilvl="1" w:tplc="0C0A0003" w:tentative="1">
+      <w:start w:val="1"/>
+      <w:numFmt w:val="bullet"/>
+      <w:lvlText w:val="o"/>
+      <w:lvlJc w:val="left"/>
+      <w:pPr>
+        <w:ind w:left="1440" w:hanging="360"/>
+      </w:pPr>
+      <w:rPr>
+        <w:rFonts w:ascii="Courier New" w:hAnsi="Courier New" w:cs="Courier New" w:hint="default"/>
+      </w:rPr>
+    </w:lvl>
+    <w:lvl w:ilvl="2" w:tplc="0C0A0005" w:tentative="1">
+      <w:start w:val="1"/>
+      <w:numFmt w:val="bullet"/>
+      <w:lvlText w:val=""/>
+      <w:lvlJc w:val="left"/>
+      <w:pPr>
+        <w:ind w:left="2160" w:hanging="360"/>
+      </w:pPr>
+      <w:rPr>
+        <w:rFonts w:ascii="Wingdings" w:hAnsi="Wingdings" w:hint="default"/>
+      </w:rPr>
+    </w:lvl>
+    <w:lvl w:ilvl="3" w:tplc="0C0A0001" w:tentative="1">
+      <w:start w:val="1"/>
+      <w:numFmt w:val="bullet"/>
+      <w:lvlText w:val=""/>
+      <w:lvlJc w:val="left"/>
+      <w:pPr>
+        <w:ind w:left="2880" w:hanging="360"/>
+      </w:pPr>
+      <w:rPr>
+        <w:rFonts w:ascii="Symbol" w:hAnsi="Symbol" w:hint="default"/>
+      </w:rPr>
+    </w:lvl>
+    <w:lvl w:ilvl="4" w:tplc="0C0A0003" w:tentative="1">
+      <w:start w:val="1"/>
+      <w:numFmt w:val="bullet"/>
+      <w:lvlText w:val="o"/>
+      <w:lvlJc w:val="left"/>
+      <w:pPr>
+        <w:ind w:left="3600" w:hanging="360"/>
+      </w:pPr>
+      <w:rPr>
+        <w:rFonts w:ascii="Courier New" w:hAnsi="Courier New" w:cs="Courier New" w:hint="default"/>
+      </w:rPr>
+    </w:lvl>
+    <w:lvl w:ilvl="5" w:tplc="0C0A0005" w:tentative="1">
+      <w:start w:val="1"/>
+      <w:numFmt w:val="bullet"/>
+      <w:lvlText w:val=""/>
+      <w:lvlJc w:val="left"/>
+      <w:pPr>
+        <w:ind w:left="4320" w:hanging="360"/>
+      </w:pPr>
+      <w:rPr>
+        <w:rFonts w:ascii="Wingdings" w:hAnsi="Wingdings" w:hint="default"/>
+      </w:rPr>
+    </w:lvl>
+    <w:lvl w:ilvl="6" w:tplc="0C0A0001" w:tentative="1">
+      <w:start w:val="1"/>
+      <w:numFmt w:val="bullet"/>
+      <w:lvlText w:val=""/>
+      <w:lvlJc w:val="left"/>
+      <w:pPr>
+        <w:ind w:left="5040" w:hanging="360"/>
+      </w:pPr>
+      <w:rPr>
+        <w:rFonts w:ascii="Symbol" w:hAnsi="Symbol" w:hint="default"/>
+      </w:rPr>
+    </w:lvl>
+    <w:lvl w:ilvl="7" w:tplc="0C0A0003" w:tentative="1">
+      <w:start w:val="1"/>
+      <w:numFmt w:val="bullet"/>
+      <w:lvlText w:val="o"/>
+      <w:lvlJc w:val="left"/>
+      <w:pPr>
+        <w:ind w:left="5760" w:hanging="360"/>
+      </w:pPr>
+      <w:rPr>
+        <w:rFonts w:ascii="Courier New" w:hAnsi="Courier New" w:cs="Courier New" w:hint="default"/>
+      </w:rPr>
+    </w:lvl>
+    <w:lvl w:ilvl="8" w:tplc="0C0A0005" w:tentative="1">
+      <w:start w:val="1"/>
+      <w:numFmt w:val="bullet"/>
+      <w:lvlText w:val=""/>
+      <w:lvlJc w:val="left"/>
+      <w:pPr>
+        <w:ind w:left="6480" w:hanging="360"/>
+      </w:pPr>
+      <w:rPr>
+        <w:rFonts w:ascii="Wingdings" w:hAnsi="Wingdings" w:hint="default"/>
+      </w:rPr>
+    </w:lvl>
+  </w:abstractNum>
+  <w:num w:numId="1" w16cid:durableId="1174687561">
+    <w:abstractNumId w:val="4"/>
+  </w:num>
+  <w:num w:numId="2" w16cid:durableId="1452284289">
+    <w:abstractNumId w:val="1"/>
+  </w:num>
+  <w:num w:numId="3" w16cid:durableId="1368523310">
+    <w:abstractNumId w:val="3"/>
+  </w:num>
+  <w:num w:numId="4" w16cid:durableId="1622690477">
+    <w:abstractNumId w:val="0"/>
+  </w:num>
+  <w:num w:numId="5" w16cid:durableId="559099641">
+    <w:abstractNumId w:val="2"/>
+  </w:num>
+  <w:num w:numId="6" w16cid:durableId="423036140">
+    <w:abstractNumId w:val="5"/>
+  </w:num>
+</w:numbering>
 </file>
 
 <file path=word/styles.xml><?xml version="1.0" encoding="utf-8"?>
@@ -1025,6 +2469,43 @@
       <w:spacing w:val="5"/>
     </w:rPr>
   </w:style>
+  <w:style w:type="paragraph" w:styleId="NormalWeb">
+    <w:name w:val="Normal (Web)"/>
+    <w:basedOn w:val="Normal"/>
+    <w:uiPriority w:val="99"/>
+    <w:semiHidden/>
+    <w:unhideWhenUsed/>
+    <w:rsid w:val="00186D22"/>
+    <w:rPr>
+      <w:rFonts w:ascii="Times New Roman" w:hAnsi="Times New Roman" w:cs="Times New Roman"/>
+      <w:sz w:val="24"/>
+      <w:szCs w:val="24"/>
+    </w:rPr>
+  </w:style>
+  <w:style w:type="character" w:styleId="CdigoHTML">
+    <w:name w:val="HTML Code"/>
+    <w:basedOn w:val="Fuentedeprrafopredeter"/>
+    <w:uiPriority w:val="99"/>
+    <w:semiHidden/>
+    <w:unhideWhenUsed/>
+    <w:rsid w:val="000C34EB"/>
+    <w:rPr>
+      <w:rFonts w:ascii="Courier New" w:eastAsia="Times New Roman" w:hAnsi="Courier New" w:cs="Courier New"/>
+      <w:sz w:val="20"/>
+      <w:szCs w:val="20"/>
+    </w:rPr>
+  </w:style>
+  <w:style w:type="character" w:styleId="Fuerte">
+    <w:name w:val="Strong"/>
+    <w:basedOn w:val="Fuentedeprrafopredeter"/>
+    <w:uiPriority w:val="22"/>
+    <w:qFormat/>
+    <w:rsid w:val="000C34EB"/>
+    <w:rPr>
+      <w:b/>
+      <w:bCs/>
+    </w:rPr>
+  </w:style>
 </w:styles>
 </file>
 

</xml_diff>

<commit_message>
Commit 04: “Stack Navigation”
</commit_message>
<xml_diff>
--- a/Comentario sobre las prácticas.docx
+++ b/Comentario sobre las prácticas.docx
@@ -140,12 +140,10 @@
         <w:t xml:space="preserve"> es un componente que, utilizando </w:t>
       </w:r>
       <w:proofErr w:type="spellStart"/>
-      <w:proofErr w:type="gramStart"/>
       <w:r>
         <w:t>list.wiew</w:t>
       </w:r>
       <w:proofErr w:type="spellEnd"/>
-      <w:proofErr w:type="gramEnd"/>
       <w:r>
         <w:t xml:space="preserve"> de </w:t>
       </w:r>
@@ -203,15 +201,7 @@
         <w:jc w:val="both"/>
       </w:pPr>
       <w:r>
-        <w:t xml:space="preserve">También se ha modificado el fichero App.js para que se muestre la </w:t>
-      </w:r>
-      <w:proofErr w:type="gramStart"/>
-      <w:r>
-        <w:t>app</w:t>
-      </w:r>
-      <w:proofErr w:type="gramEnd"/>
-      <w:r>
-        <w:t xml:space="preserve"> correctamente, </w:t>
+        <w:t xml:space="preserve">También se ha modificado el fichero App.js para que se muestre la app correctamente, </w:t>
       </w:r>
       <w:proofErr w:type="spellStart"/>
       <w:r>
@@ -402,12 +392,10 @@
         <w:t xml:space="preserve"> (</w:t>
       </w:r>
       <w:proofErr w:type="spellStart"/>
-      <w:proofErr w:type="gramStart"/>
       <w:r>
         <w:t>props.excursion</w:t>
       </w:r>
       <w:proofErr w:type="spellEnd"/>
-      <w:proofErr w:type="gramEnd"/>
       <w:r>
         <w:t>) y este lo utiliza para mostrar la información.</w:t>
       </w:r>
@@ -556,21 +544,12 @@
         <w:t xml:space="preserve"> de JavaScript aplicado al array </w:t>
       </w:r>
       <w:proofErr w:type="spellStart"/>
-      <w:proofErr w:type="gramStart"/>
       <w:r>
         <w:rPr>
           <w:rFonts w:eastAsia="Times New Roman" w:cstheme="minorHAnsi"/>
           <w:lang w:eastAsia="es-ES"/>
         </w:rPr>
-        <w:t>this.state</w:t>
-      </w:r>
-      <w:proofErr w:type="gramEnd"/>
-      <w:r>
-        <w:rPr>
-          <w:rFonts w:eastAsia="Times New Roman" w:cstheme="minorHAnsi"/>
-          <w:lang w:eastAsia="es-ES"/>
-        </w:rPr>
-        <w:t>.excursiones</w:t>
+        <w:t>this.state.excursiones</w:t>
       </w:r>
       <w:proofErr w:type="spellEnd"/>
       <w:r>
@@ -804,6 +783,715 @@
         </w:rPr>
         <w:t>). Su nombre es arbitrario.</w:t>
       </w:r>
+    </w:p>
+    <w:p>
+      <w:pPr>
+        <w:pStyle w:val="Ttulo1"/>
+        <w:rPr>
+          <w:rFonts w:eastAsia="Times New Roman"/>
+          <w:lang w:eastAsia="es-ES"/>
+        </w:rPr>
+      </w:pPr>
+      <w:proofErr w:type="spellStart"/>
+      <w:r>
+        <w:rPr>
+          <w:rFonts w:eastAsia="Times New Roman"/>
+          <w:lang w:eastAsia="es-ES"/>
+        </w:rPr>
+        <w:t>Commit</w:t>
+      </w:r>
+      <w:proofErr w:type="spellEnd"/>
+      <w:r>
+        <w:rPr>
+          <w:rFonts w:eastAsia="Times New Roman"/>
+          <w:lang w:eastAsia="es-ES"/>
+        </w:rPr>
+        <w:t xml:space="preserve"> 04: “Stack </w:t>
+      </w:r>
+      <w:proofErr w:type="spellStart"/>
+      <w:r>
+        <w:rPr>
+          <w:rFonts w:eastAsia="Times New Roman"/>
+          <w:lang w:eastAsia="es-ES"/>
+        </w:rPr>
+        <w:t>Navigation</w:t>
+      </w:r>
+      <w:proofErr w:type="spellEnd"/>
+      <w:r>
+        <w:rPr>
+          <w:rFonts w:eastAsia="Times New Roman"/>
+          <w:lang w:eastAsia="es-ES"/>
+        </w:rPr>
+        <w:t>”</w:t>
+      </w:r>
+    </w:p>
+    <w:p>
+      <w:pPr>
+        <w:rPr>
+          <w:lang w:eastAsia="es-ES"/>
+        </w:rPr>
+      </w:pPr>
+    </w:p>
+    <w:p>
+      <w:pPr>
+        <w:jc w:val="both"/>
+        <w:rPr>
+          <w:lang w:eastAsia="es-ES"/>
+        </w:rPr>
+      </w:pPr>
+      <w:r>
+        <w:rPr>
+          <w:lang w:eastAsia="es-ES"/>
+        </w:rPr>
+        <w:t xml:space="preserve">En este </w:t>
+      </w:r>
+      <w:proofErr w:type="spellStart"/>
+      <w:r>
+        <w:rPr>
+          <w:lang w:eastAsia="es-ES"/>
+        </w:rPr>
+        <w:t>commit</w:t>
+      </w:r>
+      <w:proofErr w:type="spellEnd"/>
+      <w:r>
+        <w:rPr>
+          <w:lang w:eastAsia="es-ES"/>
+        </w:rPr>
+        <w:t xml:space="preserve"> se han modificado los archivos que veníamos trabajando, como son </w:t>
+      </w:r>
+      <w:proofErr w:type="spellStart"/>
+      <w:r>
+        <w:rPr>
+          <w:lang w:eastAsia="es-ES"/>
+        </w:rPr>
+        <w:t>campobasecomponent</w:t>
+      </w:r>
+      <w:proofErr w:type="spellEnd"/>
+      <w:r>
+        <w:rPr>
+          <w:lang w:eastAsia="es-ES"/>
+        </w:rPr>
+        <w:t>, el calendario y el componente que detalla las excursiones. El objetivo es crear una pila de navegación que permita a la aplicación “superponer” diferentes pantallas.</w:t>
+      </w:r>
+    </w:p>
+    <w:p>
+      <w:pPr>
+        <w:jc w:val="both"/>
+        <w:rPr>
+          <w:lang w:eastAsia="es-ES"/>
+        </w:rPr>
+      </w:pPr>
+      <w:r>
+        <w:rPr>
+          <w:lang w:eastAsia="es-ES"/>
+        </w:rPr>
+        <w:t xml:space="preserve">En el archivo </w:t>
+      </w:r>
+      <w:proofErr w:type="spellStart"/>
+      <w:r>
+        <w:rPr>
+          <w:lang w:eastAsia="es-ES"/>
+        </w:rPr>
+        <w:t>campobase</w:t>
+      </w:r>
+      <w:proofErr w:type="spellEnd"/>
+      <w:r>
+        <w:rPr>
+          <w:lang w:eastAsia="es-ES"/>
+        </w:rPr>
+        <w:t xml:space="preserve"> se crea el navegador tipo pila, concretamente en la línea:</w:t>
+      </w:r>
+      <w:r>
+        <w:rPr>
+          <w:lang w:eastAsia="es-ES"/>
+        </w:rPr>
+        <w:br/>
+      </w:r>
+      <w:r>
+        <w:rPr>
+          <w:lang w:eastAsia="es-ES"/>
+        </w:rPr>
+        <w:br/>
+      </w:r>
+      <w:r>
+        <w:rPr>
+          <w:lang w:eastAsia="es-ES"/>
+        </w:rPr>
+        <w:drawing>
+          <wp:inline distT="0" distB="0" distL="0" distR="0" wp14:anchorId="6456BC01" wp14:editId="6E775DE2">
+            <wp:extent cx="3254022" cy="358171"/>
+            <wp:effectExtent l="0" t="0" r="3810" b="3810"/>
+            <wp:docPr id="1228532829" name="Imagen 1"/>
+            <wp:cNvGraphicFramePr>
+              <a:graphicFrameLocks xmlns:a="http://schemas.openxmlformats.org/drawingml/2006/main" noChangeAspect="1"/>
+            </wp:cNvGraphicFramePr>
+            <a:graphic xmlns:a="http://schemas.openxmlformats.org/drawingml/2006/main">
+              <a:graphicData uri="http://schemas.openxmlformats.org/drawingml/2006/picture">
+                <pic:pic xmlns:pic="http://schemas.openxmlformats.org/drawingml/2006/picture">
+                  <pic:nvPicPr>
+                    <pic:cNvPr id="1228532829" name=""/>
+                    <pic:cNvPicPr/>
+                  </pic:nvPicPr>
+                  <pic:blipFill>
+                    <a:blip r:embed="rId6"/>
+                    <a:stretch>
+                      <a:fillRect/>
+                    </a:stretch>
+                  </pic:blipFill>
+                  <pic:spPr>
+                    <a:xfrm>
+                      <a:off x="0" y="0"/>
+                      <a:ext cx="3254022" cy="358171"/>
+                    </a:xfrm>
+                    <a:prstGeom prst="rect">
+                      <a:avLst/>
+                    </a:prstGeom>
+                  </pic:spPr>
+                </pic:pic>
+              </a:graphicData>
+            </a:graphic>
+          </wp:inline>
+        </w:drawing>
+      </w:r>
+    </w:p>
+    <w:p>
+      <w:pPr>
+        <w:jc w:val="both"/>
+        <w:rPr>
+          <w:lang w:eastAsia="es-ES"/>
+        </w:rPr>
+      </w:pPr>
+      <w:r>
+        <w:rPr>
+          <w:lang w:eastAsia="es-ES"/>
+        </w:rPr>
+        <w:t>La pila funciona de tal forma que cuando entras a una pantalla esta se añade encima, en lo alto de la pila, y al volver hacia atrás se elimina esta entrada superior.</w:t>
+      </w:r>
+      <w:r>
+        <w:rPr>
+          <w:lang w:eastAsia="es-ES"/>
+        </w:rPr>
+        <w:t xml:space="preserve"> </w:t>
+      </w:r>
+    </w:p>
+    <w:p>
+      <w:pPr>
+        <w:jc w:val="both"/>
+        <w:rPr>
+          <w:lang w:eastAsia="es-ES"/>
+        </w:rPr>
+      </w:pPr>
+      <w:r>
+        <w:rPr>
+          <w:lang w:eastAsia="es-ES"/>
+        </w:rPr>
+        <w:lastRenderedPageBreak/>
+        <w:t xml:space="preserve">Para entender lo que se esta haciendo se plantean </w:t>
+      </w:r>
+      <w:r>
+        <w:rPr>
+          <w:lang w:eastAsia="es-ES"/>
+        </w:rPr>
+        <w:t xml:space="preserve">diferentes </w:t>
+      </w:r>
+      <w:r>
+        <w:rPr>
+          <w:lang w:eastAsia="es-ES"/>
+        </w:rPr>
+        <w:t>preguntas</w:t>
+      </w:r>
+      <w:r>
+        <w:rPr>
+          <w:lang w:eastAsia="es-ES"/>
+        </w:rPr>
+        <w:t>:</w:t>
+      </w:r>
+      <w:r>
+        <w:rPr>
+          <w:lang w:eastAsia="es-ES"/>
+        </w:rPr>
+        <w:br/>
+      </w:r>
+    </w:p>
+    <w:p>
+      <w:pPr>
+        <w:jc w:val="both"/>
+        <w:rPr>
+          <w:b/>
+          <w:bCs/>
+          <w:lang w:eastAsia="es-ES"/>
+        </w:rPr>
+      </w:pPr>
+      <w:r>
+        <w:rPr>
+          <w:b/>
+          <w:bCs/>
+          <w:lang w:eastAsia="es-ES"/>
+        </w:rPr>
+        <w:t xml:space="preserve">Comprender la forma en que se crea un menú de navegación en </w:t>
+      </w:r>
+      <w:proofErr w:type="spellStart"/>
+      <w:r>
+        <w:rPr>
+          <w:b/>
+          <w:bCs/>
+          <w:lang w:eastAsia="es-ES"/>
+        </w:rPr>
+        <w:t>stack</w:t>
+      </w:r>
+      <w:proofErr w:type="spellEnd"/>
+      <w:r>
+        <w:rPr>
+          <w:b/>
+          <w:bCs/>
+          <w:lang w:eastAsia="es-ES"/>
+        </w:rPr>
+        <w:t xml:space="preserve"> mediante el componente </w:t>
+      </w:r>
+      <w:proofErr w:type="spellStart"/>
+      <w:r>
+        <w:rPr>
+          <w:b/>
+          <w:bCs/>
+          <w:lang w:eastAsia="es-ES"/>
+        </w:rPr>
+        <w:t>createNativeStackNavigator</w:t>
+      </w:r>
+      <w:proofErr w:type="spellEnd"/>
+      <w:r>
+        <w:rPr>
+          <w:b/>
+          <w:bCs/>
+          <w:lang w:eastAsia="es-ES"/>
+        </w:rPr>
+        <w:t xml:space="preserve">. o ¿Qué es el </w:t>
+      </w:r>
+      <w:proofErr w:type="spellStart"/>
+      <w:r>
+        <w:rPr>
+          <w:b/>
+          <w:bCs/>
+          <w:lang w:eastAsia="es-ES"/>
+        </w:rPr>
+        <w:t>NavigationContainer</w:t>
+      </w:r>
+      <w:proofErr w:type="spellEnd"/>
+      <w:r>
+        <w:rPr>
+          <w:b/>
+          <w:bCs/>
+          <w:lang w:eastAsia="es-ES"/>
+        </w:rPr>
+        <w:t xml:space="preserve">? o ¿Qué son las </w:t>
+      </w:r>
+      <w:proofErr w:type="spellStart"/>
+      <w:r>
+        <w:rPr>
+          <w:b/>
+          <w:bCs/>
+          <w:lang w:eastAsia="es-ES"/>
+        </w:rPr>
+        <w:t>Screens</w:t>
+      </w:r>
+      <w:proofErr w:type="spellEnd"/>
+      <w:r>
+        <w:rPr>
+          <w:b/>
+          <w:bCs/>
+          <w:lang w:eastAsia="es-ES"/>
+        </w:rPr>
+        <w:t>?</w:t>
+      </w:r>
+    </w:p>
+    <w:p>
+      <w:pPr>
+        <w:jc w:val="both"/>
+        <w:rPr>
+          <w:b/>
+          <w:bCs/>
+          <w:lang w:eastAsia="es-ES"/>
+        </w:rPr>
+      </w:pPr>
+      <w:r>
+        <w:rPr>
+          <w:b/>
+          <w:bCs/>
+          <w:lang w:eastAsia="es-ES"/>
+        </w:rPr>
+        <w:t xml:space="preserve">Analizar la manera en que Calendario envía un parámetro a </w:t>
+      </w:r>
+      <w:proofErr w:type="spellStart"/>
+      <w:r>
+        <w:rPr>
+          <w:b/>
+          <w:bCs/>
+          <w:lang w:eastAsia="es-ES"/>
+        </w:rPr>
+        <w:t>DetalleExcursion</w:t>
+      </w:r>
+      <w:proofErr w:type="spellEnd"/>
+      <w:r>
+        <w:rPr>
+          <w:b/>
+          <w:bCs/>
+          <w:lang w:eastAsia="es-ES"/>
+        </w:rPr>
+        <w:t xml:space="preserve"> y la forma en que este componente es capaz de obtenerlo y hacer uso de él. En concreto, analizar cómo cada Screen recibe la propiedad </w:t>
+      </w:r>
+      <w:proofErr w:type="spellStart"/>
+      <w:r>
+        <w:rPr>
+          <w:b/>
+          <w:bCs/>
+          <w:lang w:eastAsia="es-ES"/>
+        </w:rPr>
+        <w:t>route</w:t>
+      </w:r>
+      <w:proofErr w:type="spellEnd"/>
+      <w:r>
+        <w:rPr>
+          <w:b/>
+          <w:bCs/>
+          <w:lang w:eastAsia="es-ES"/>
+        </w:rPr>
+        <w:t xml:space="preserve">. Calendario navega hacia </w:t>
+      </w:r>
+      <w:proofErr w:type="spellStart"/>
+      <w:r>
+        <w:rPr>
+          <w:b/>
+          <w:bCs/>
+          <w:lang w:eastAsia="es-ES"/>
+        </w:rPr>
+        <w:t>DetalleExcursion</w:t>
+      </w:r>
+      <w:proofErr w:type="spellEnd"/>
+      <w:r>
+        <w:rPr>
+          <w:b/>
+          <w:bCs/>
+          <w:lang w:eastAsia="es-ES"/>
+        </w:rPr>
+        <w:t xml:space="preserve"> enviando el identificador de la excursión en </w:t>
+      </w:r>
+      <w:proofErr w:type="spellStart"/>
+      <w:r>
+        <w:rPr>
+          <w:b/>
+          <w:bCs/>
+          <w:lang w:eastAsia="es-ES"/>
+        </w:rPr>
+        <w:t>route.params</w:t>
+      </w:r>
+      <w:proofErr w:type="spellEnd"/>
+      <w:r>
+        <w:rPr>
+          <w:b/>
+          <w:bCs/>
+          <w:lang w:eastAsia="es-ES"/>
+        </w:rPr>
+        <w:t>, y la pantalla de detalle recupera dicho identificador para localizar la excursión correspondiente..</w:t>
+      </w:r>
+    </w:p>
+    <w:p>
+      <w:pPr>
+        <w:jc w:val="both"/>
+        <w:rPr>
+          <w:lang w:eastAsia="es-ES"/>
+        </w:rPr>
+      </w:pPr>
+      <w:r>
+        <w:rPr>
+          <w:lang w:eastAsia="es-ES"/>
+        </w:rPr>
+        <w:t xml:space="preserve">El </w:t>
+      </w:r>
+      <w:proofErr w:type="spellStart"/>
+      <w:r>
+        <w:rPr>
+          <w:lang w:eastAsia="es-ES"/>
+        </w:rPr>
+        <w:t>NavigationContainer</w:t>
+      </w:r>
+      <w:proofErr w:type="spellEnd"/>
+      <w:r>
+        <w:rPr>
+          <w:lang w:eastAsia="es-ES"/>
+        </w:rPr>
+        <w:t xml:space="preserve"> gestiona el estado de la navegación, es el componente principal que permite el cambio entre pantallas. Es esencial envolver todo el código en este contenedor para que funcione correctamente. </w:t>
+      </w:r>
+    </w:p>
+    <w:p>
+      <w:pPr>
+        <w:jc w:val="both"/>
+        <w:rPr>
+          <w:lang w:eastAsia="es-ES"/>
+        </w:rPr>
+      </w:pPr>
+      <w:r>
+        <w:rPr>
+          <w:lang w:eastAsia="es-ES"/>
+        </w:rPr>
+        <w:t xml:space="preserve">En el interior de este componente se encuentran las </w:t>
+      </w:r>
+      <w:proofErr w:type="spellStart"/>
+      <w:r>
+        <w:rPr>
+          <w:lang w:eastAsia="es-ES"/>
+        </w:rPr>
+        <w:t>screens</w:t>
+      </w:r>
+      <w:proofErr w:type="spellEnd"/>
+      <w:r>
+        <w:rPr>
+          <w:lang w:eastAsia="es-ES"/>
+        </w:rPr>
+        <w:t xml:space="preserve">, </w:t>
+      </w:r>
+      <w:r>
+        <w:rPr>
+          <w:lang w:eastAsia="es-ES"/>
+        </w:rPr>
+        <w:t xml:space="preserve">cada una constituye una pantalla dentro de la aplicación.  En nuestro caso tenemos dos, una llamada calendario, que muestra la lista de excursiones disponibles, y cuando se le da </w:t>
+      </w:r>
+      <w:proofErr w:type="spellStart"/>
+      <w:r>
+        <w:rPr>
+          <w:lang w:eastAsia="es-ES"/>
+        </w:rPr>
+        <w:t>click</w:t>
+      </w:r>
+      <w:proofErr w:type="spellEnd"/>
+      <w:r>
+        <w:rPr>
+          <w:lang w:eastAsia="es-ES"/>
+        </w:rPr>
+        <w:t xml:space="preserve"> a una de ellas se abre la llamada detalle excursión, que muestra los detalles de la excursión que se ha pulsado. Esta información se recoge en la siguiente línea, presente en </w:t>
+      </w:r>
+      <w:proofErr w:type="spellStart"/>
+      <w:r>
+        <w:rPr>
+          <w:lang w:eastAsia="es-ES"/>
+        </w:rPr>
+        <w:t>calendariocomponent</w:t>
+      </w:r>
+      <w:proofErr w:type="spellEnd"/>
+      <w:r>
+        <w:rPr>
+          <w:lang w:eastAsia="es-ES"/>
+        </w:rPr>
+        <w:t>:</w:t>
+      </w:r>
+    </w:p>
+    <w:p>
+      <w:pPr>
+        <w:jc w:val="both"/>
+        <w:rPr>
+          <w:lang w:eastAsia="es-ES"/>
+        </w:rPr>
+      </w:pPr>
+      <w:r>
+        <w:rPr>
+          <w:lang w:eastAsia="es-ES"/>
+        </w:rPr>
+        <w:drawing>
+          <wp:inline distT="0" distB="0" distL="0" distR="0" wp14:anchorId="7DD41CFD" wp14:editId="4D6919A2">
+            <wp:extent cx="5258256" cy="190517"/>
+            <wp:effectExtent l="0" t="0" r="0" b="0"/>
+            <wp:docPr id="255358079" name="Imagen 1"/>
+            <wp:cNvGraphicFramePr>
+              <a:graphicFrameLocks xmlns:a="http://schemas.openxmlformats.org/drawingml/2006/main" noChangeAspect="1"/>
+            </wp:cNvGraphicFramePr>
+            <a:graphic xmlns:a="http://schemas.openxmlformats.org/drawingml/2006/main">
+              <a:graphicData uri="http://schemas.openxmlformats.org/drawingml/2006/picture">
+                <pic:pic xmlns:pic="http://schemas.openxmlformats.org/drawingml/2006/picture">
+                  <pic:nvPicPr>
+                    <pic:cNvPr id="255358079" name=""/>
+                    <pic:cNvPicPr/>
+                  </pic:nvPicPr>
+                  <pic:blipFill>
+                    <a:blip r:embed="rId7"/>
+                    <a:stretch>
+                      <a:fillRect/>
+                    </a:stretch>
+                  </pic:blipFill>
+                  <pic:spPr>
+                    <a:xfrm>
+                      <a:off x="0" y="0"/>
+                      <a:ext cx="5258256" cy="190517"/>
+                    </a:xfrm>
+                    <a:prstGeom prst="rect">
+                      <a:avLst/>
+                    </a:prstGeom>
+                  </pic:spPr>
+                </pic:pic>
+              </a:graphicData>
+            </a:graphic>
+          </wp:inline>
+        </w:drawing>
+      </w:r>
+    </w:p>
+    <w:p>
+      <w:pPr>
+        <w:jc w:val="both"/>
+        <w:rPr>
+          <w:lang w:eastAsia="es-ES"/>
+        </w:rPr>
+      </w:pPr>
+      <w:r>
+        <w:rPr>
+          <w:lang w:eastAsia="es-ES"/>
+        </w:rPr>
+        <w:t xml:space="preserve">Este id se recoge en </w:t>
+      </w:r>
+      <w:proofErr w:type="spellStart"/>
+      <w:r>
+        <w:rPr>
+          <w:lang w:eastAsia="es-ES"/>
+        </w:rPr>
+        <w:t>DetalleExcursionComponent</w:t>
+      </w:r>
+      <w:proofErr w:type="spellEnd"/>
+      <w:r>
+        <w:rPr>
+          <w:lang w:eastAsia="es-ES"/>
+        </w:rPr>
+        <w:t xml:space="preserve"> mediante:</w:t>
+      </w:r>
+    </w:p>
+    <w:p>
+      <w:pPr>
+        <w:jc w:val="both"/>
+        <w:rPr>
+          <w:lang w:eastAsia="es-ES"/>
+        </w:rPr>
+      </w:pPr>
+      <w:r>
+        <w:rPr>
+          <w:lang w:eastAsia="es-ES"/>
+        </w:rPr>
+        <w:drawing>
+          <wp:inline distT="0" distB="0" distL="0" distR="0" wp14:anchorId="7FF00B48" wp14:editId="3C3A2FE3">
+            <wp:extent cx="5400040" cy="888365"/>
+            <wp:effectExtent l="0" t="0" r="0" b="6985"/>
+            <wp:docPr id="1865784248" name="Imagen 1"/>
+            <wp:cNvGraphicFramePr>
+              <a:graphicFrameLocks xmlns:a="http://schemas.openxmlformats.org/drawingml/2006/main" noChangeAspect="1"/>
+            </wp:cNvGraphicFramePr>
+            <a:graphic xmlns:a="http://schemas.openxmlformats.org/drawingml/2006/main">
+              <a:graphicData uri="http://schemas.openxmlformats.org/drawingml/2006/picture">
+                <pic:pic xmlns:pic="http://schemas.openxmlformats.org/drawingml/2006/picture">
+                  <pic:nvPicPr>
+                    <pic:cNvPr id="1865784248" name=""/>
+                    <pic:cNvPicPr/>
+                  </pic:nvPicPr>
+                  <pic:blipFill>
+                    <a:blip r:embed="rId8"/>
+                    <a:stretch>
+                      <a:fillRect/>
+                    </a:stretch>
+                  </pic:blipFill>
+                  <pic:spPr>
+                    <a:xfrm>
+                      <a:off x="0" y="0"/>
+                      <a:ext cx="5400040" cy="888365"/>
+                    </a:xfrm>
+                    <a:prstGeom prst="rect">
+                      <a:avLst/>
+                    </a:prstGeom>
+                  </pic:spPr>
+                </pic:pic>
+              </a:graphicData>
+            </a:graphic>
+          </wp:inline>
+        </w:drawing>
+      </w:r>
+    </w:p>
+    <w:p>
+      <w:pPr>
+        <w:jc w:val="both"/>
+        <w:rPr>
+          <w:lang w:eastAsia="es-ES"/>
+        </w:rPr>
+      </w:pPr>
+      <w:r>
+        <w:rPr>
+          <w:lang w:eastAsia="es-ES"/>
+        </w:rPr>
+        <w:t xml:space="preserve">Route </w:t>
+      </w:r>
+      <w:proofErr w:type="spellStart"/>
+      <w:r>
+        <w:rPr>
+          <w:lang w:eastAsia="es-ES"/>
+        </w:rPr>
+        <w:t>params</w:t>
+      </w:r>
+      <w:proofErr w:type="spellEnd"/>
+      <w:r>
+        <w:rPr>
+          <w:lang w:eastAsia="es-ES"/>
+        </w:rPr>
+        <w:t xml:space="preserve"> contiene los datos enviados de la navegación.</w:t>
+      </w:r>
+      <w:r>
+        <w:rPr>
+          <w:lang w:eastAsia="es-ES"/>
+        </w:rPr>
+        <w:t xml:space="preserve"> </w:t>
+      </w:r>
+    </w:p>
+    <w:p>
+      <w:pPr>
+        <w:jc w:val="both"/>
+        <w:rPr>
+          <w:lang w:eastAsia="es-ES"/>
+        </w:rPr>
+      </w:pPr>
+      <w:r>
+        <w:rPr>
+          <w:lang w:eastAsia="es-ES"/>
+        </w:rPr>
+        <w:t xml:space="preserve">El </w:t>
+      </w:r>
+      <w:proofErr w:type="spellStart"/>
+      <w:r>
+        <w:rPr>
+          <w:lang w:eastAsia="es-ES"/>
+        </w:rPr>
+        <w:t>excursiónid</w:t>
+      </w:r>
+      <w:proofErr w:type="spellEnd"/>
+      <w:r>
+        <w:rPr>
+          <w:lang w:eastAsia="es-ES"/>
+        </w:rPr>
+        <w:t xml:space="preserve"> recibido se convierte a número, mediante el que se accede al array de excursiones y se le pasa ese índice al componente que renderiza la pantalla.</w:t>
+      </w:r>
+    </w:p>
+    <w:p>
+      <w:pPr>
+        <w:jc w:val="both"/>
+        <w:rPr>
+          <w:lang w:eastAsia="es-ES"/>
+        </w:rPr>
+      </w:pPr>
+    </w:p>
+    <w:p>
+      <w:pPr>
+        <w:jc w:val="both"/>
+        <w:rPr>
+          <w:lang w:eastAsia="es-ES"/>
+        </w:rPr>
+      </w:pPr>
+    </w:p>
+    <w:p>
+      <w:pPr>
+        <w:jc w:val="both"/>
+        <w:rPr>
+          <w:lang w:eastAsia="es-ES"/>
+        </w:rPr>
+      </w:pPr>
     </w:p>
     <w:p>
       <w:pPr>
@@ -2802,4 +3490,16 @@
     </a:ext>
   </a:extLst>
 </a:theme>
+</file>
+
+<file path=customXml/item1.xml><?xml version="1.0" encoding="utf-8"?>
+<b:Sources xmlns:b="http://schemas.openxmlformats.org/officeDocument/2006/bibliography" xmlns="http://schemas.openxmlformats.org/officeDocument/2006/bibliography" SelectedStyle="\APASixthEditionOfficeOnline.xsl" StyleName="APA" Version="6"/>
+</file>
+
+<file path=customXml/itemProps1.xml><?xml version="1.0" encoding="utf-8"?>
+<ds:datastoreItem xmlns:ds="http://schemas.openxmlformats.org/officeDocument/2006/customXml" ds:itemID="{1E723F32-E8A9-447B-9FDA-8873FD712019}">
+  <ds:schemaRefs>
+    <ds:schemaRef ds:uri="http://schemas.openxmlformats.org/officeDocument/2006/bibliography"/>
+  </ds:schemaRefs>
+</ds:datastoreItem>
 </file>
</xml_diff>

<commit_message>
Commit 05: “Drawer Navigation”
</commit_message>
<xml_diff>
--- a/Comentario sobre las prácticas.docx
+++ b/Comentario sobre las prácticas.docx
@@ -22,61 +22,27 @@
       <w:pPr>
         <w:pStyle w:val="Ttulo1"/>
       </w:pPr>
-      <w:proofErr w:type="spellStart"/>
-      <w:r>
-        <w:t>Commit</w:t>
-      </w:r>
-      <w:proofErr w:type="spellEnd"/>
-      <w:r>
-        <w:t xml:space="preserve"> 1. </w:t>
-      </w:r>
-      <w:r>
-        <w:t xml:space="preserve">"Primeros pasos en </w:t>
-      </w:r>
-      <w:proofErr w:type="spellStart"/>
-      <w:r>
-        <w:t>React</w:t>
-      </w:r>
-      <w:proofErr w:type="spellEnd"/>
-      <w:r>
-        <w:t xml:space="preserve"> Native"</w:t>
-      </w:r>
-    </w:p>
-    <w:p>
-      <w:pPr>
-        <w:jc w:val="both"/>
-      </w:pPr>
-      <w:proofErr w:type="spellStart"/>
-      <w:r>
-        <w:t>Commit</w:t>
-      </w:r>
-      <w:proofErr w:type="spellEnd"/>
-      <w:r>
-        <w:t xml:space="preserve"> inicial del repositorio en el que se van a hacer las prácticas correspondientes al apartado </w:t>
-      </w:r>
-      <w:proofErr w:type="spellStart"/>
-      <w:r>
-        <w:t>react</w:t>
-      </w:r>
-      <w:proofErr w:type="spellEnd"/>
-      <w:r>
-        <w:t>-native de la asignatura DSM.</w:t>
-      </w:r>
-    </w:p>
-    <w:p>
-      <w:pPr>
-        <w:jc w:val="both"/>
-      </w:pPr>
-      <w:r>
-        <w:t xml:space="preserve">Se ha instalado Expo tanto en el repositorio como en el teléfono móvil para poder realizar el desarrollo y pruebas correctamente en tiempo real. De forma inicial la aplicación cuenta con un archivo App.js, que contiene un componente de </w:t>
-      </w:r>
-      <w:proofErr w:type="spellStart"/>
-      <w:r>
-        <w:t>react</w:t>
-      </w:r>
-      <w:proofErr w:type="spellEnd"/>
-      <w:r>
-        <w:t xml:space="preserve"> llamado “View”, con sus correspondientes estilos y con un texto, que es lo que se muestra cuando se visualiza la aplicación en funcionamiento.</w:t>
+      <w:r>
+        <w:t xml:space="preserve">Commit 1. </w:t>
+      </w:r>
+      <w:r>
+        <w:t>"Primeros pasos en React Native"</w:t>
+      </w:r>
+    </w:p>
+    <w:p>
+      <w:pPr>
+        <w:jc w:val="both"/>
+      </w:pPr>
+      <w:r>
+        <w:t>Commit inicial del repositorio en el que se van a hacer las prácticas correspondientes al apartado react-native de la asignatura DSM.</w:t>
+      </w:r>
+    </w:p>
+    <w:p>
+      <w:pPr>
+        <w:jc w:val="both"/>
+      </w:pPr>
+      <w:r>
+        <w:t>Se ha instalado Expo tanto en el repositorio como en el teléfono móvil para poder realizar el desarrollo y pruebas correctamente en tiempo real. De forma inicial la aplicación cuenta con un archivo App.js, que contiene un componente de react llamado “View”, con sus correspondientes estilos y con un texto, que es lo que se muestra cuando se visualiza la aplicación en funcionamiento.</w:t>
       </w:r>
     </w:p>
     <w:p>
@@ -88,110 +54,36 @@
       <w:pPr>
         <w:pStyle w:val="Ttulo1"/>
       </w:pPr>
-      <w:proofErr w:type="spellStart"/>
-      <w:r>
-        <w:t>Commit</w:t>
-      </w:r>
-      <w:proofErr w:type="spellEnd"/>
-      <w:r>
-        <w:t xml:space="preserve"> 2. </w:t>
-      </w:r>
-      <w:r>
-        <w:t xml:space="preserve">"Componentes </w:t>
-      </w:r>
-      <w:proofErr w:type="spellStart"/>
-      <w:r>
-        <w:t>React</w:t>
-      </w:r>
-      <w:proofErr w:type="spellEnd"/>
-      <w:r>
-        <w:t xml:space="preserve"> Native"</w:t>
-      </w:r>
-    </w:p>
-    <w:p>
-      <w:pPr>
-        <w:jc w:val="both"/>
-      </w:pPr>
-      <w:r>
-        <w:t xml:space="preserve">Continuamos avanzando con la aplicación, para estudiar los componentes de </w:t>
-      </w:r>
-      <w:proofErr w:type="spellStart"/>
-      <w:r>
-        <w:t>react</w:t>
-      </w:r>
-      <w:proofErr w:type="spellEnd"/>
-      <w:r>
-        <w:t>-native y su funcionamiento hemos creado dos carpetas, una llamada componentes, donde se van a crear los nuevos componentes que vamos a usar, y otro llamado común, que contiene un documento con una lista de información que se utilizará más adelante. Además, se incluye una subcarpeta de imágenes que la aplicación irá utilizando.</w:t>
-      </w:r>
-    </w:p>
-    <w:p>
-      <w:pPr>
-        <w:jc w:val="both"/>
-      </w:pPr>
-      <w:r>
-        <w:t xml:space="preserve">El </w:t>
-      </w:r>
-      <w:proofErr w:type="spellStart"/>
-      <w:r>
-        <w:t>calendariocomponent</w:t>
-      </w:r>
-      <w:proofErr w:type="spellEnd"/>
-      <w:r>
-        <w:t xml:space="preserve"> es un componente que, utilizando </w:t>
-      </w:r>
-      <w:proofErr w:type="spellStart"/>
-      <w:r>
-        <w:t>list.wiew</w:t>
-      </w:r>
-      <w:proofErr w:type="spellEnd"/>
-      <w:r>
-        <w:t xml:space="preserve"> de </w:t>
-      </w:r>
-      <w:proofErr w:type="spellStart"/>
-      <w:r>
-        <w:t>react</w:t>
-      </w:r>
-      <w:proofErr w:type="spellEnd"/>
-      <w:r>
-        <w:t>-native-</w:t>
-      </w:r>
-      <w:proofErr w:type="spellStart"/>
-      <w:r>
-        <w:t>paper</w:t>
-      </w:r>
-      <w:proofErr w:type="spellEnd"/>
-      <w:r>
-        <w:t xml:space="preserve">, recoge los elementos de la lista de excursiones, dándoles un formato y posicionando una de las imágenes a la izquierda. Se incluyen además sus estilos. Utilizando también </w:t>
-      </w:r>
-      <w:proofErr w:type="spellStart"/>
-      <w:r>
-        <w:t>FlatList</w:t>
-      </w:r>
-      <w:proofErr w:type="spellEnd"/>
-      <w:r>
-        <w:t xml:space="preserve">, un componente de </w:t>
-      </w:r>
-      <w:proofErr w:type="spellStart"/>
-      <w:r>
-        <w:t>react</w:t>
-      </w:r>
-      <w:proofErr w:type="spellEnd"/>
-      <w:r>
-        <w:t>, se disponen en formato vertical.</w:t>
-      </w:r>
-    </w:p>
-    <w:p>
-      <w:pPr>
-        <w:jc w:val="both"/>
-      </w:pPr>
-      <w:r>
-        <w:t xml:space="preserve">En </w:t>
-      </w:r>
-      <w:proofErr w:type="spellStart"/>
-      <w:r>
-        <w:t>CampobaseComponent</w:t>
-      </w:r>
-      <w:proofErr w:type="spellEnd"/>
+      <w:r>
+        <w:t xml:space="preserve">Commit 2. </w:t>
+      </w:r>
+      <w:r>
+        <w:t>"Componentes React Native"</w:t>
+      </w:r>
+    </w:p>
+    <w:p>
+      <w:pPr>
+        <w:jc w:val="both"/>
+      </w:pPr>
+      <w:r>
+        <w:t>Continuamos avanzando con la aplicación, para estudiar los componentes de react-native y su funcionamiento hemos creado dos carpetas, una llamada componentes, donde se van a crear los nuevos componentes que vamos a usar, y otro llamado común, que contiene un documento con una lista de información que se utilizará más adelante. Además, se incluye una subcarpeta de imágenes que la aplicación irá utilizando.</w:t>
+      </w:r>
+    </w:p>
+    <w:p>
+      <w:pPr>
+        <w:jc w:val="both"/>
+      </w:pPr>
+      <w:r>
+        <w:t>El calendariocomponent es un componente que, utilizando list.wiew de react-native-paper, recoge los elementos de la lista de excursiones, dándoles un formato y posicionando una de las imágenes a la izquierda. Se incluyen además sus estilos. Utilizando también FlatList, un componente de react, se disponen en formato vertical.</w:t>
+      </w:r>
+    </w:p>
+    <w:p>
+      <w:pPr>
+        <w:jc w:val="both"/>
+      </w:pPr>
+      <w:r>
+        <w:t>En CampobaseComponent</w:t>
+      </w:r>
       <w:r>
         <w:t xml:space="preserve"> se guarda la lista de excursiones y se pasan al componente calendario para que este las muestre.</w:t>
       </w:r>
@@ -201,55 +93,7 @@
         <w:jc w:val="both"/>
       </w:pPr>
       <w:r>
-        <w:t xml:space="preserve">También se ha modificado el fichero App.js para que se muestre la app correctamente, </w:t>
-      </w:r>
-      <w:proofErr w:type="spellStart"/>
-      <w:r>
-        <w:t>SafeAreaProvider</w:t>
-      </w:r>
-      <w:proofErr w:type="spellEnd"/>
-      <w:r>
-        <w:t xml:space="preserve"> sirve para que no se solape con la barra superior, </w:t>
-      </w:r>
-      <w:proofErr w:type="spellStart"/>
-      <w:r>
-        <w:t>notch</w:t>
-      </w:r>
-      <w:proofErr w:type="spellEnd"/>
-      <w:r>
-        <w:t xml:space="preserve"> y los bordes del móvil, </w:t>
-      </w:r>
-      <w:proofErr w:type="spellStart"/>
-      <w:r>
-        <w:t>PaperProvider</w:t>
-      </w:r>
-      <w:proofErr w:type="spellEnd"/>
-      <w:r>
-        <w:t xml:space="preserve"> activa el sistema de estilos de </w:t>
-      </w:r>
-      <w:proofErr w:type="spellStart"/>
-      <w:r>
-        <w:t>react</w:t>
-      </w:r>
-      <w:proofErr w:type="spellEnd"/>
-      <w:r>
-        <w:t xml:space="preserve"> native </w:t>
-      </w:r>
-      <w:proofErr w:type="spellStart"/>
-      <w:r>
-        <w:t>paper</w:t>
-      </w:r>
-      <w:proofErr w:type="spellEnd"/>
-      <w:r>
-        <w:t xml:space="preserve">. En ese momento se incluye el componente </w:t>
-      </w:r>
-      <w:proofErr w:type="spellStart"/>
-      <w:r>
-        <w:t>campobase</w:t>
-      </w:r>
-      <w:proofErr w:type="spellEnd"/>
-      <w:r>
-        <w:t xml:space="preserve"> que, renderiza un calendario y le pasa cada una de las excursiones para que se dispongan en forma de lista como se ha explicado.</w:t>
+        <w:t>También se ha modificado el fichero App.js para que se muestre la app correctamente, SafeAreaProvider sirve para que no se solape con la barra superior, notch y los bordes del móvil, PaperProvider activa el sistema de estilos de react native paper. En ese momento se incluye el componente campobase que, renderiza un calendario y le pasa cada una de las excursiones para que se dispongan en forma de lista como se ha explicado.</w:t>
       </w:r>
     </w:p>
     <w:p>
@@ -257,48 +101,19 @@
         <w:pStyle w:val="Ttulo1"/>
         <w:jc w:val="both"/>
       </w:pPr>
-      <w:proofErr w:type="spellStart"/>
-      <w:r>
-        <w:t>Commit</w:t>
-      </w:r>
-      <w:proofErr w:type="spellEnd"/>
-      <w:r>
-        <w:t xml:space="preserve"> 3. “</w:t>
-      </w:r>
-      <w:r>
-        <w:t xml:space="preserve">Componentes funcionales en </w:t>
-      </w:r>
-      <w:proofErr w:type="spellStart"/>
-      <w:r>
-        <w:t>React</w:t>
-      </w:r>
-      <w:proofErr w:type="spellEnd"/>
-      <w:r>
-        <w:t xml:space="preserve"> Native”</w:t>
-      </w:r>
-    </w:p>
-    <w:p>
-      <w:pPr>
-        <w:jc w:val="both"/>
-      </w:pPr>
-      <w:r>
-        <w:t xml:space="preserve">En esta parte del trabajo se va a profundizar más en los componentes funcionales de </w:t>
-      </w:r>
-      <w:proofErr w:type="spellStart"/>
-      <w:r>
-        <w:t>react</w:t>
-      </w:r>
-      <w:proofErr w:type="spellEnd"/>
-      <w:r>
-        <w:t xml:space="preserve">-native. En el </w:t>
-      </w:r>
-      <w:proofErr w:type="spellStart"/>
-      <w:r>
-        <w:t>commit</w:t>
-      </w:r>
-      <w:proofErr w:type="spellEnd"/>
-      <w:r>
-        <w:t xml:space="preserve"> anterior ya creamos uno, el calendario. En el día de hoy se va a crear otro y se va a realizar comunicación entre ellos.</w:t>
+      <w:r>
+        <w:t>Commit 3. “</w:t>
+      </w:r>
+      <w:r>
+        <w:t>Componentes funcionales en React Native”</w:t>
+      </w:r>
+    </w:p>
+    <w:p>
+      <w:pPr>
+        <w:jc w:val="both"/>
+      </w:pPr>
+      <w:r>
+        <w:t>En esta parte del trabajo se va a profundizar más en los componentes funcionales de react-native. En el commit anterior ya creamos uno, el calendario. En el día de hoy se va a crear otro y se va a realizar comunicación entre ellos.</w:t>
       </w:r>
     </w:p>
     <w:p>
@@ -318,50 +133,18 @@
         <w:jc w:val="both"/>
       </w:pPr>
       <w:r>
-        <w:t xml:space="preserve">El componente se llama </w:t>
-      </w:r>
-      <w:proofErr w:type="spellStart"/>
-      <w:r>
-        <w:t>DetalleExcursionComponent</w:t>
-      </w:r>
-      <w:proofErr w:type="spellEnd"/>
-      <w:r>
-        <w:t xml:space="preserve">, que </w:t>
-      </w:r>
-      <w:r>
-        <w:t xml:space="preserve">muestra una tarjeta (Card) con los datos de una excursión (nombre, imagen y descripción) usando </w:t>
-      </w:r>
-      <w:proofErr w:type="spellStart"/>
-      <w:r>
-        <w:t>react</w:t>
-      </w:r>
-      <w:proofErr w:type="spellEnd"/>
-      <w:r>
-        <w:t>-native-</w:t>
-      </w:r>
-      <w:proofErr w:type="spellStart"/>
-      <w:r>
-        <w:t>paper</w:t>
-      </w:r>
-      <w:proofErr w:type="spellEnd"/>
-      <w:r>
-        <w:t>.</w:t>
-      </w:r>
-    </w:p>
-    <w:p>
-      <w:pPr>
-        <w:jc w:val="both"/>
-      </w:pPr>
-      <w:r>
-        <w:t xml:space="preserve">Si recibe una excursión válida por </w:t>
-      </w:r>
-      <w:proofErr w:type="spellStart"/>
-      <w:r>
-        <w:t>props</w:t>
-      </w:r>
-      <w:proofErr w:type="spellEnd"/>
-      <w:r>
-        <w:t>, la renderiza</w:t>
+        <w:t xml:space="preserve">El componente se llama DetalleExcursionComponent, que </w:t>
+      </w:r>
+      <w:r>
+        <w:t>muestra una tarjeta (Card) con los datos de una excursión (nombre, imagen y descripción) usando react-native-paper.</w:t>
+      </w:r>
+    </w:p>
+    <w:p>
+      <w:pPr>
+        <w:jc w:val="both"/>
+      </w:pPr>
+      <w:r>
+        <w:t>Si recibe una excursión válida por props, la renderiza</w:t>
       </w:r>
       <w:r>
         <w:t>,</w:t>
@@ -373,63 +156,15 @@
         <w:t xml:space="preserve"> </w:t>
       </w:r>
       <w:r>
-        <w:t xml:space="preserve">Se comunica con otros componentes a través de </w:t>
-      </w:r>
-      <w:proofErr w:type="spellStart"/>
-      <w:r>
-        <w:t>props</w:t>
-      </w:r>
-      <w:proofErr w:type="spellEnd"/>
-      <w:r>
-        <w:t xml:space="preserve">: el componente padre le pasa un objeto </w:t>
-      </w:r>
-      <w:proofErr w:type="spellStart"/>
-      <w:r>
-        <w:t>excursion</w:t>
-      </w:r>
-      <w:proofErr w:type="spellEnd"/>
-      <w:r>
-        <w:t xml:space="preserve"> (</w:t>
-      </w:r>
-      <w:proofErr w:type="spellStart"/>
-      <w:r>
-        <w:t>props.excursion</w:t>
-      </w:r>
-      <w:proofErr w:type="spellEnd"/>
-      <w:r>
-        <w:t>) y este lo utiliza para mostrar la información.</w:t>
-      </w:r>
-    </w:p>
-    <w:p>
-      <w:pPr>
-        <w:jc w:val="both"/>
-      </w:pPr>
-      <w:r>
-        <w:t xml:space="preserve">Además, </w:t>
-      </w:r>
-      <w:proofErr w:type="spellStart"/>
-      <w:r>
-        <w:t>DetalleExcursion</w:t>
-      </w:r>
-      <w:proofErr w:type="spellEnd"/>
-      <w:r>
-        <w:t xml:space="preserve"> actúa como intermediario, recibiendo las </w:t>
-      </w:r>
-      <w:proofErr w:type="spellStart"/>
-      <w:r>
-        <w:t>props</w:t>
-      </w:r>
-      <w:proofErr w:type="spellEnd"/>
-      <w:r>
-        <w:t xml:space="preserve"> y pasándoselas a </w:t>
-      </w:r>
-      <w:proofErr w:type="spellStart"/>
-      <w:r>
-        <w:t>RenderExcursion</w:t>
-      </w:r>
-      <w:proofErr w:type="spellEnd"/>
-      <w:r>
-        <w:t>, manteniendo así la comunicación entre componentes.</w:t>
+        <w:t>Se comunica con otros componentes a través de props: el componente padre le pasa un objeto excursion (props.excursion) y este lo utiliza para mostrar la información.</w:t>
+      </w:r>
+    </w:p>
+    <w:p>
+      <w:pPr>
+        <w:jc w:val="both"/>
+      </w:pPr>
+      <w:r>
+        <w:t>Además, DetalleExcursion actúa como intermediario, recibiendo las props y pasándoselas a RenderExcursion, manteniendo así la comunicación entre componentes.</w:t>
       </w:r>
     </w:p>
     <w:p>
@@ -450,15 +185,7 @@
         <w:jc w:val="both"/>
       </w:pPr>
       <w:r>
-        <w:t>Se añade un estado (</w:t>
-      </w:r>
-      <w:proofErr w:type="spellStart"/>
-      <w:r>
-        <w:t>seleccionExcursion</w:t>
-      </w:r>
-      <w:proofErr w:type="spellEnd"/>
-      <w:r>
-        <w:t xml:space="preserve">) que guarda qué excursión está seleccionada. </w:t>
+        <w:t xml:space="preserve">Se añade un estado (seleccionExcursion) que guarda qué excursión está seleccionada. </w:t>
       </w:r>
     </w:p>
     <w:p>
@@ -471,15 +198,7 @@
         <w:jc w:val="both"/>
       </w:pPr>
       <w:r>
-        <w:t xml:space="preserve">Cuando el usuario pulsa en Calendario, se llama a </w:t>
-      </w:r>
-      <w:proofErr w:type="spellStart"/>
-      <w:r>
-        <w:t>onSeleccionExcursion</w:t>
-      </w:r>
-      <w:proofErr w:type="spellEnd"/>
-      <w:r>
-        <w:t xml:space="preserve">, que actualiza ese estado con el id. </w:t>
+        <w:t xml:space="preserve">Cuando el usuario pulsa en Calendario, se llama a onSeleccionExcursion, que actualiza ese estado con el id. </w:t>
       </w:r>
     </w:p>
     <w:p>
@@ -492,23 +211,7 @@
         <w:jc w:val="both"/>
       </w:pPr>
       <w:r>
-        <w:t xml:space="preserve">Luego, </w:t>
-      </w:r>
-      <w:proofErr w:type="spellStart"/>
-      <w:r>
-        <w:t>DetalleExcursion</w:t>
-      </w:r>
-      <w:proofErr w:type="spellEnd"/>
-      <w:r>
-        <w:t xml:space="preserve"> recibe por </w:t>
-      </w:r>
-      <w:proofErr w:type="spellStart"/>
-      <w:r>
-        <w:t>props</w:t>
-      </w:r>
-      <w:proofErr w:type="spellEnd"/>
-      <w:r>
-        <w:t xml:space="preserve"> la excursión filtrada según ese id y muestra su información.</w:t>
+        <w:t>Luego, DetalleExcursion recibe por props la excursión filtrada según ese id y muestra su información.</w:t>
       </w:r>
     </w:p>
     <w:p>
@@ -525,121 +228,41 @@
           <w:rFonts w:eastAsia="Times New Roman" w:cstheme="minorHAnsi"/>
           <w:lang w:eastAsia="es-ES"/>
         </w:rPr>
-        <w:t xml:space="preserve">La excursión seleccionada se obtiene mediante el método </w:t>
-      </w:r>
-      <w:proofErr w:type="spellStart"/>
-      <w:r>
+        <w:t>La excursión seleccionada se obtiene mediante el método filter de JavaScript aplicado al array this.state.excursiones.</w:t>
+      </w:r>
+    </w:p>
+    <w:p>
+      <w:pPr>
+        <w:spacing w:before="100" w:beforeAutospacing="1" w:after="100" w:afterAutospacing="1" w:line="240" w:lineRule="auto"/>
+        <w:jc w:val="both"/>
         <w:rPr>
           <w:rFonts w:eastAsia="Times New Roman" w:cstheme="minorHAnsi"/>
           <w:lang w:eastAsia="es-ES"/>
         </w:rPr>
-        <w:t>filter</w:t>
-      </w:r>
-      <w:proofErr w:type="spellEnd"/>
+      </w:pPr>
       <w:r>
         <w:rPr>
           <w:rFonts w:eastAsia="Times New Roman" w:cstheme="minorHAnsi"/>
           <w:lang w:eastAsia="es-ES"/>
         </w:rPr>
-        <w:t xml:space="preserve"> de JavaScript aplicado al array </w:t>
-      </w:r>
-      <w:proofErr w:type="spellStart"/>
-      <w:r>
+        <w:t>Este filtro recorre todas las excursiones y devuelve solo aquellas cuyo id coincide con seleccionExcursion. Como filter devuelve un array, se accede al primer elemento con [0] para obtener directamente el objeto de la excursión.</w:t>
+      </w:r>
+    </w:p>
+    <w:p>
+      <w:pPr>
+        <w:spacing w:before="100" w:beforeAutospacing="1" w:after="100" w:afterAutospacing="1" w:line="240" w:lineRule="auto"/>
+        <w:jc w:val="both"/>
         <w:rPr>
           <w:rFonts w:eastAsia="Times New Roman" w:cstheme="minorHAnsi"/>
           <w:lang w:eastAsia="es-ES"/>
         </w:rPr>
-        <w:t>this.state.excursiones</w:t>
-      </w:r>
-      <w:proofErr w:type="spellEnd"/>
+      </w:pPr>
       <w:r>
         <w:rPr>
           <w:rFonts w:eastAsia="Times New Roman" w:cstheme="minorHAnsi"/>
           <w:lang w:eastAsia="es-ES"/>
         </w:rPr>
-        <w:t>.</w:t>
-      </w:r>
-    </w:p>
-    <w:p>
-      <w:pPr>
-        <w:spacing w:before="100" w:beforeAutospacing="1" w:after="100" w:afterAutospacing="1" w:line="240" w:lineRule="auto"/>
-        <w:jc w:val="both"/>
-        <w:rPr>
-          <w:rFonts w:eastAsia="Times New Roman" w:cstheme="minorHAnsi"/>
-          <w:lang w:eastAsia="es-ES"/>
-        </w:rPr>
-      </w:pPr>
-      <w:r>
-        <w:rPr>
-          <w:rFonts w:eastAsia="Times New Roman" w:cstheme="minorHAnsi"/>
-          <w:lang w:eastAsia="es-ES"/>
-        </w:rPr>
-        <w:t xml:space="preserve">Este filtro recorre todas las excursiones y devuelve solo aquellas cuyo id coincide con </w:t>
-      </w:r>
-      <w:proofErr w:type="spellStart"/>
-      <w:r>
-        <w:rPr>
-          <w:rFonts w:eastAsia="Times New Roman" w:cstheme="minorHAnsi"/>
-          <w:lang w:eastAsia="es-ES"/>
-        </w:rPr>
-        <w:t>seleccionExcursion</w:t>
-      </w:r>
-      <w:proofErr w:type="spellEnd"/>
-      <w:r>
-        <w:rPr>
-          <w:rFonts w:eastAsia="Times New Roman" w:cstheme="minorHAnsi"/>
-          <w:lang w:eastAsia="es-ES"/>
-        </w:rPr>
-        <w:t xml:space="preserve">. Como </w:t>
-      </w:r>
-      <w:proofErr w:type="spellStart"/>
-      <w:r>
-        <w:rPr>
-          <w:rFonts w:eastAsia="Times New Roman" w:cstheme="minorHAnsi"/>
-          <w:lang w:eastAsia="es-ES"/>
-        </w:rPr>
-        <w:t>filter</w:t>
-      </w:r>
-      <w:proofErr w:type="spellEnd"/>
-      <w:r>
-        <w:rPr>
-          <w:rFonts w:eastAsia="Times New Roman" w:cstheme="minorHAnsi"/>
-          <w:lang w:eastAsia="es-ES"/>
-        </w:rPr>
-        <w:t xml:space="preserve"> devuelve un array, se accede al primer elemento con [0] para obtener directamente el objeto de la excursión.</w:t>
-      </w:r>
-    </w:p>
-    <w:p>
-      <w:pPr>
-        <w:spacing w:before="100" w:beforeAutospacing="1" w:after="100" w:afterAutospacing="1" w:line="240" w:lineRule="auto"/>
-        <w:jc w:val="both"/>
-        <w:rPr>
-          <w:rFonts w:eastAsia="Times New Roman" w:cstheme="minorHAnsi"/>
-          <w:lang w:eastAsia="es-ES"/>
-        </w:rPr>
-      </w:pPr>
-      <w:r>
-        <w:rPr>
-          <w:rFonts w:eastAsia="Times New Roman" w:cstheme="minorHAnsi"/>
-          <w:lang w:eastAsia="es-ES"/>
-        </w:rPr>
-        <w:t xml:space="preserve">Se definen dos funciones </w:t>
-      </w:r>
-      <w:proofErr w:type="spellStart"/>
-      <w:r>
-        <w:rPr>
-          <w:rFonts w:eastAsia="Times New Roman" w:cstheme="minorHAnsi"/>
-          <w:lang w:eastAsia="es-ES"/>
-        </w:rPr>
-        <w:t>onPress</w:t>
-      </w:r>
-      <w:proofErr w:type="spellEnd"/>
-      <w:r>
-        <w:rPr>
-          <w:rFonts w:eastAsia="Times New Roman" w:cstheme="minorHAnsi"/>
-          <w:lang w:eastAsia="es-ES"/>
-        </w:rPr>
-        <w:t xml:space="preserve"> con usos diferentes:</w:t>
+        <w:t>Se definen dos funciones onPress con usos diferentes:</w:t>
       </w:r>
     </w:p>
     <w:p>
@@ -656,69 +279,12 @@
           <w:lang w:eastAsia="es-ES"/>
         </w:rPr>
       </w:pPr>
-      <w:proofErr w:type="spellStart"/>
       <w:r>
         <w:rPr>
           <w:rFonts w:eastAsia="Times New Roman" w:cstheme="minorHAnsi"/>
           <w:lang w:eastAsia="es-ES"/>
         </w:rPr>
-        <w:t>onPress</w:t>
-      </w:r>
-      <w:proofErr w:type="spellEnd"/>
-      <w:r>
-        <w:rPr>
-          <w:rFonts w:eastAsia="Times New Roman" w:cstheme="minorHAnsi"/>
-          <w:lang w:eastAsia="es-ES"/>
-        </w:rPr>
-        <w:t xml:space="preserve"> de </w:t>
-      </w:r>
-      <w:proofErr w:type="spellStart"/>
-      <w:r>
-        <w:rPr>
-          <w:rFonts w:eastAsia="Times New Roman" w:cstheme="minorHAnsi"/>
-          <w:lang w:eastAsia="es-ES"/>
-        </w:rPr>
-        <w:t>List.Item</w:t>
-      </w:r>
-      <w:proofErr w:type="spellEnd"/>
-      <w:r>
-        <w:rPr>
-          <w:rFonts w:eastAsia="Times New Roman" w:cstheme="minorHAnsi"/>
-          <w:lang w:eastAsia="es-ES"/>
-        </w:rPr>
-        <w:t xml:space="preserve">: es una </w:t>
-      </w:r>
-      <w:proofErr w:type="spellStart"/>
-      <w:r>
-        <w:rPr>
-          <w:rFonts w:eastAsia="Times New Roman" w:cstheme="minorHAnsi"/>
-          <w:lang w:eastAsia="es-ES"/>
-        </w:rPr>
-        <w:t>prop</w:t>
-      </w:r>
-      <w:proofErr w:type="spellEnd"/>
-      <w:r>
-        <w:rPr>
-          <w:rFonts w:eastAsia="Times New Roman" w:cstheme="minorHAnsi"/>
-          <w:lang w:eastAsia="es-ES"/>
-        </w:rPr>
-        <w:t xml:space="preserve"> ya definida por </w:t>
-      </w:r>
-      <w:proofErr w:type="spellStart"/>
-      <w:r>
-        <w:rPr>
-          <w:rFonts w:eastAsia="Times New Roman" w:cstheme="minorHAnsi"/>
-          <w:lang w:eastAsia="es-ES"/>
-        </w:rPr>
-        <w:t>React</w:t>
-      </w:r>
-      <w:proofErr w:type="spellEnd"/>
-      <w:r>
-        <w:rPr>
-          <w:rFonts w:eastAsia="Times New Roman" w:cstheme="minorHAnsi"/>
-          <w:lang w:eastAsia="es-ES"/>
-        </w:rPr>
-        <w:t xml:space="preserve"> Native Paper, que se ejecuta automáticamente cuando el usuario pulsa el elemento. </w:t>
+        <w:t xml:space="preserve">onPress de List.Item: es una prop ya definida por React Native Paper, que se ejecuta automáticamente cuando el usuario pulsa el elemento. </w:t>
       </w:r>
     </w:p>
     <w:p>
@@ -735,53 +301,12 @@
           <w:lang w:eastAsia="es-ES"/>
         </w:rPr>
       </w:pPr>
-      <w:proofErr w:type="spellStart"/>
       <w:r>
         <w:rPr>
           <w:rFonts w:eastAsia="Times New Roman" w:cstheme="minorHAnsi"/>
           <w:lang w:eastAsia="es-ES"/>
         </w:rPr>
-        <w:t>onPress</w:t>
-      </w:r>
-      <w:proofErr w:type="spellEnd"/>
-      <w:r>
-        <w:rPr>
-          <w:rFonts w:eastAsia="Times New Roman" w:cstheme="minorHAnsi"/>
-          <w:lang w:eastAsia="es-ES"/>
-        </w:rPr>
-        <w:t xml:space="preserve"> del componente Calendario: es una función personalizada (</w:t>
-      </w:r>
-      <w:proofErr w:type="spellStart"/>
-      <w:r>
-        <w:rPr>
-          <w:rFonts w:eastAsia="Times New Roman" w:cstheme="minorHAnsi"/>
-          <w:lang w:eastAsia="es-ES"/>
-        </w:rPr>
-        <w:t>prop</w:t>
-      </w:r>
-      <w:proofErr w:type="spellEnd"/>
-      <w:r>
-        <w:rPr>
-          <w:rFonts w:eastAsia="Times New Roman" w:cstheme="minorHAnsi"/>
-          <w:lang w:eastAsia="es-ES"/>
-        </w:rPr>
-        <w:t>) que tú defines y pasas desde el componente padre (</w:t>
-      </w:r>
-      <w:proofErr w:type="spellStart"/>
-      <w:r>
-        <w:rPr>
-          <w:rFonts w:eastAsia="Times New Roman" w:cstheme="minorHAnsi"/>
-          <w:lang w:eastAsia="es-ES"/>
-        </w:rPr>
-        <w:t>Campobase</w:t>
-      </w:r>
-      <w:proofErr w:type="spellEnd"/>
-      <w:r>
-        <w:rPr>
-          <w:rFonts w:eastAsia="Times New Roman" w:cstheme="minorHAnsi"/>
-          <w:lang w:eastAsia="es-ES"/>
-        </w:rPr>
-        <w:t>). Su nombre es arbitrario.</w:t>
+        <w:t>onPress del componente Calendario: es una función personalizada (prop) que tú defines y pasas desde el componente padre (Campobase). Su nombre es arbitrario.</w:t>
       </w:r>
     </w:p>
     <w:p>
@@ -792,114 +317,47 @@
           <w:lang w:eastAsia="es-ES"/>
         </w:rPr>
       </w:pPr>
-      <w:proofErr w:type="spellStart"/>
       <w:r>
         <w:rPr>
           <w:rFonts w:eastAsia="Times New Roman"/>
           <w:lang w:eastAsia="es-ES"/>
         </w:rPr>
-        <w:t>Commit</w:t>
-      </w:r>
-      <w:proofErr w:type="spellEnd"/>
-      <w:r>
-        <w:rPr>
-          <w:rFonts w:eastAsia="Times New Roman"/>
-          <w:lang w:eastAsia="es-ES"/>
-        </w:rPr>
-        <w:t xml:space="preserve"> 04: “Stack </w:t>
-      </w:r>
-      <w:proofErr w:type="spellStart"/>
-      <w:r>
-        <w:rPr>
-          <w:rFonts w:eastAsia="Times New Roman"/>
-          <w:lang w:eastAsia="es-ES"/>
-        </w:rPr>
-        <w:t>Navigation</w:t>
-      </w:r>
-      <w:proofErr w:type="spellEnd"/>
-      <w:r>
-        <w:rPr>
-          <w:rFonts w:eastAsia="Times New Roman"/>
-          <w:lang w:eastAsia="es-ES"/>
-        </w:rPr>
-        <w:t>”</w:t>
-      </w:r>
-    </w:p>
-    <w:p>
-      <w:pPr>
-        <w:rPr>
-          <w:lang w:eastAsia="es-ES"/>
-        </w:rPr>
-      </w:pPr>
-    </w:p>
-    <w:p>
-      <w:pPr>
-        <w:jc w:val="both"/>
-        <w:rPr>
-          <w:lang w:eastAsia="es-ES"/>
-        </w:rPr>
-      </w:pPr>
-      <w:r>
-        <w:rPr>
-          <w:lang w:eastAsia="es-ES"/>
-        </w:rPr>
-        <w:t xml:space="preserve">En este </w:t>
-      </w:r>
-      <w:proofErr w:type="spellStart"/>
-      <w:r>
-        <w:rPr>
-          <w:lang w:eastAsia="es-ES"/>
-        </w:rPr>
-        <w:t>commit</w:t>
-      </w:r>
-      <w:proofErr w:type="spellEnd"/>
-      <w:r>
-        <w:rPr>
-          <w:lang w:eastAsia="es-ES"/>
-        </w:rPr>
-        <w:t xml:space="preserve"> se han modificado los archivos que veníamos trabajando, como son </w:t>
-      </w:r>
-      <w:proofErr w:type="spellStart"/>
-      <w:r>
-        <w:rPr>
-          <w:lang w:eastAsia="es-ES"/>
-        </w:rPr>
-        <w:t>campobasecomponent</w:t>
-      </w:r>
-      <w:proofErr w:type="spellEnd"/>
-      <w:r>
-        <w:rPr>
-          <w:lang w:eastAsia="es-ES"/>
-        </w:rPr>
-        <w:t>, el calendario y el componente que detalla las excursiones. El objetivo es crear una pila de navegación que permita a la aplicación “superponer” diferentes pantallas.</w:t>
-      </w:r>
-    </w:p>
-    <w:p>
-      <w:pPr>
-        <w:jc w:val="both"/>
-        <w:rPr>
-          <w:lang w:eastAsia="es-ES"/>
-        </w:rPr>
-      </w:pPr>
-      <w:r>
-        <w:rPr>
-          <w:lang w:eastAsia="es-ES"/>
-        </w:rPr>
-        <w:t xml:space="preserve">En el archivo </w:t>
-      </w:r>
-      <w:proofErr w:type="spellStart"/>
-      <w:r>
-        <w:rPr>
-          <w:lang w:eastAsia="es-ES"/>
-        </w:rPr>
-        <w:t>campobase</w:t>
-      </w:r>
-      <w:proofErr w:type="spellEnd"/>
-      <w:r>
-        <w:rPr>
-          <w:lang w:eastAsia="es-ES"/>
-        </w:rPr>
-        <w:t xml:space="preserve"> se crea el navegador tipo pila, concretamente en la línea:</w:t>
+        <w:t>Commit 04: “Stack Navigation”</w:t>
+      </w:r>
+    </w:p>
+    <w:p>
+      <w:pPr>
+        <w:rPr>
+          <w:lang w:eastAsia="es-ES"/>
+        </w:rPr>
+      </w:pPr>
+    </w:p>
+    <w:p>
+      <w:pPr>
+        <w:jc w:val="both"/>
+        <w:rPr>
+          <w:lang w:eastAsia="es-ES"/>
+        </w:rPr>
+      </w:pPr>
+      <w:r>
+        <w:rPr>
+          <w:lang w:eastAsia="es-ES"/>
+        </w:rPr>
+        <w:t>En este commit se han modificado los archivos que veníamos trabajando, como son campobasecomponent, el calendario y el componente que detalla las excursiones. El objetivo es crear una pila de navegación que permita a la aplicación “superponer” diferentes pantallas.</w:t>
+      </w:r>
+    </w:p>
+    <w:p>
+      <w:pPr>
+        <w:jc w:val="both"/>
+        <w:rPr>
+          <w:lang w:eastAsia="es-ES"/>
+        </w:rPr>
+      </w:pPr>
+      <w:r>
+        <w:rPr>
+          <w:lang w:eastAsia="es-ES"/>
+        </w:rPr>
+        <w:t>En el archivo campobase se crea el navegador tipo pila, concretamente en la línea:</w:t>
       </w:r>
       <w:r>
         <w:rPr>
@@ -915,6 +373,7 @@
       </w:r>
       <w:r>
         <w:rPr>
+          <w:noProof/>
           <w:lang w:eastAsia="es-ES"/>
         </w:rPr>
         <w:drawing>
@@ -1028,270 +487,71 @@
           <w:bCs/>
           <w:lang w:eastAsia="es-ES"/>
         </w:rPr>
-        <w:t xml:space="preserve">Comprender la forma en que se crea un menú de navegación en </w:t>
-      </w:r>
-      <w:proofErr w:type="spellStart"/>
-      <w:r>
+        <w:t>Comprender la forma en que se crea un menú de navegación en stack mediante el componente createNativeStackNavigator. o ¿Qué es el NavigationContainer? o ¿Qué son las Screens?</w:t>
+      </w:r>
+    </w:p>
+    <w:p>
+      <w:pPr>
+        <w:jc w:val="both"/>
         <w:rPr>
           <w:b/>
           <w:bCs/>
           <w:lang w:eastAsia="es-ES"/>
         </w:rPr>
-        <w:t>stack</w:t>
-      </w:r>
-      <w:proofErr w:type="spellEnd"/>
+      </w:pPr>
       <w:r>
         <w:rPr>
           <w:b/>
           <w:bCs/>
           <w:lang w:eastAsia="es-ES"/>
         </w:rPr>
-        <w:t xml:space="preserve"> mediante el componente </w:t>
-      </w:r>
-      <w:proofErr w:type="spellStart"/>
-      <w:r>
-        <w:rPr>
-          <w:b/>
-          <w:bCs/>
-          <w:lang w:eastAsia="es-ES"/>
-        </w:rPr>
-        <w:t>createNativeStackNavigator</w:t>
-      </w:r>
-      <w:proofErr w:type="spellEnd"/>
-      <w:r>
-        <w:rPr>
-          <w:b/>
-          <w:bCs/>
-          <w:lang w:eastAsia="es-ES"/>
-        </w:rPr>
-        <w:t xml:space="preserve">. o ¿Qué es el </w:t>
-      </w:r>
-      <w:proofErr w:type="spellStart"/>
-      <w:r>
-        <w:rPr>
-          <w:b/>
-          <w:bCs/>
-          <w:lang w:eastAsia="es-ES"/>
-        </w:rPr>
-        <w:t>NavigationContainer</w:t>
-      </w:r>
-      <w:proofErr w:type="spellEnd"/>
-      <w:r>
-        <w:rPr>
-          <w:b/>
-          <w:bCs/>
-          <w:lang w:eastAsia="es-ES"/>
-        </w:rPr>
-        <w:t xml:space="preserve">? o ¿Qué son las </w:t>
-      </w:r>
-      <w:proofErr w:type="spellStart"/>
-      <w:r>
-        <w:rPr>
-          <w:b/>
-          <w:bCs/>
-          <w:lang w:eastAsia="es-ES"/>
-        </w:rPr>
-        <w:t>Screens</w:t>
-      </w:r>
-      <w:proofErr w:type="spellEnd"/>
-      <w:r>
-        <w:rPr>
-          <w:b/>
-          <w:bCs/>
-          <w:lang w:eastAsia="es-ES"/>
-        </w:rPr>
-        <w:t>?</w:t>
-      </w:r>
-    </w:p>
-    <w:p>
-      <w:pPr>
-        <w:jc w:val="both"/>
-        <w:rPr>
-          <w:b/>
-          <w:bCs/>
-          <w:lang w:eastAsia="es-ES"/>
-        </w:rPr>
-      </w:pPr>
-      <w:r>
-        <w:rPr>
-          <w:b/>
-          <w:bCs/>
-          <w:lang w:eastAsia="es-ES"/>
-        </w:rPr>
-        <w:t xml:space="preserve">Analizar la manera en que Calendario envía un parámetro a </w:t>
-      </w:r>
-      <w:proofErr w:type="spellStart"/>
-      <w:r>
-        <w:rPr>
-          <w:b/>
-          <w:bCs/>
-          <w:lang w:eastAsia="es-ES"/>
-        </w:rPr>
-        <w:t>DetalleExcursion</w:t>
-      </w:r>
-      <w:proofErr w:type="spellEnd"/>
-      <w:r>
-        <w:rPr>
-          <w:b/>
-          <w:bCs/>
-          <w:lang w:eastAsia="es-ES"/>
-        </w:rPr>
-        <w:t xml:space="preserve"> y la forma en que este componente es capaz de obtenerlo y hacer uso de él. En concreto, analizar cómo cada Screen recibe la propiedad </w:t>
-      </w:r>
-      <w:proofErr w:type="spellStart"/>
-      <w:r>
-        <w:rPr>
-          <w:b/>
-          <w:bCs/>
-          <w:lang w:eastAsia="es-ES"/>
-        </w:rPr>
-        <w:t>route</w:t>
-      </w:r>
-      <w:proofErr w:type="spellEnd"/>
-      <w:r>
-        <w:rPr>
-          <w:b/>
-          <w:bCs/>
-          <w:lang w:eastAsia="es-ES"/>
-        </w:rPr>
-        <w:t xml:space="preserve">. Calendario navega hacia </w:t>
-      </w:r>
-      <w:proofErr w:type="spellStart"/>
-      <w:r>
-        <w:rPr>
-          <w:b/>
-          <w:bCs/>
-          <w:lang w:eastAsia="es-ES"/>
-        </w:rPr>
-        <w:t>DetalleExcursion</w:t>
-      </w:r>
-      <w:proofErr w:type="spellEnd"/>
-      <w:r>
-        <w:rPr>
-          <w:b/>
-          <w:bCs/>
-          <w:lang w:eastAsia="es-ES"/>
-        </w:rPr>
-        <w:t xml:space="preserve"> enviando el identificador de la excursión en </w:t>
-      </w:r>
-      <w:proofErr w:type="spellStart"/>
-      <w:r>
-        <w:rPr>
-          <w:b/>
-          <w:bCs/>
-          <w:lang w:eastAsia="es-ES"/>
-        </w:rPr>
-        <w:t>route.params</w:t>
-      </w:r>
-      <w:proofErr w:type="spellEnd"/>
-      <w:r>
-        <w:rPr>
-          <w:b/>
-          <w:bCs/>
-          <w:lang w:eastAsia="es-ES"/>
-        </w:rPr>
-        <w:t>, y la pantalla de detalle recupera dicho identificador para localizar la excursión correspondiente..</w:t>
-      </w:r>
-    </w:p>
-    <w:p>
-      <w:pPr>
-        <w:jc w:val="both"/>
-        <w:rPr>
-          <w:lang w:eastAsia="es-ES"/>
-        </w:rPr>
-      </w:pPr>
-      <w:r>
-        <w:rPr>
-          <w:lang w:eastAsia="es-ES"/>
-        </w:rPr>
-        <w:t xml:space="preserve">El </w:t>
-      </w:r>
-      <w:proofErr w:type="spellStart"/>
-      <w:r>
-        <w:rPr>
-          <w:lang w:eastAsia="es-ES"/>
-        </w:rPr>
-        <w:t>NavigationContainer</w:t>
-      </w:r>
-      <w:proofErr w:type="spellEnd"/>
-      <w:r>
-        <w:rPr>
-          <w:lang w:eastAsia="es-ES"/>
-        </w:rPr>
-        <w:t xml:space="preserve"> gestiona el estado de la navegación, es el componente principal que permite el cambio entre pantallas. Es esencial envolver todo el código en este contenedor para que funcione correctamente. </w:t>
-      </w:r>
-    </w:p>
-    <w:p>
-      <w:pPr>
-        <w:jc w:val="both"/>
-        <w:rPr>
-          <w:lang w:eastAsia="es-ES"/>
-        </w:rPr>
-      </w:pPr>
-      <w:r>
-        <w:rPr>
-          <w:lang w:eastAsia="es-ES"/>
-        </w:rPr>
-        <w:t xml:space="preserve">En el interior de este componente se encuentran las </w:t>
-      </w:r>
-      <w:proofErr w:type="spellStart"/>
-      <w:r>
-        <w:rPr>
-          <w:lang w:eastAsia="es-ES"/>
-        </w:rPr>
-        <w:t>screens</w:t>
-      </w:r>
-      <w:proofErr w:type="spellEnd"/>
-      <w:r>
-        <w:rPr>
-          <w:lang w:eastAsia="es-ES"/>
-        </w:rPr>
-        <w:t xml:space="preserve">, </w:t>
-      </w:r>
-      <w:r>
-        <w:rPr>
-          <w:lang w:eastAsia="es-ES"/>
-        </w:rPr>
-        <w:t xml:space="preserve">cada una constituye una pantalla dentro de la aplicación.  En nuestro caso tenemos dos, una llamada calendario, que muestra la lista de excursiones disponibles, y cuando se le da </w:t>
-      </w:r>
-      <w:proofErr w:type="spellStart"/>
-      <w:r>
-        <w:rPr>
-          <w:lang w:eastAsia="es-ES"/>
-        </w:rPr>
-        <w:t>click</w:t>
-      </w:r>
-      <w:proofErr w:type="spellEnd"/>
-      <w:r>
-        <w:rPr>
-          <w:lang w:eastAsia="es-ES"/>
-        </w:rPr>
-        <w:t xml:space="preserve"> a una de ellas se abre la llamada detalle excursión, que muestra los detalles de la excursión que se ha pulsado. Esta información se recoge en la siguiente línea, presente en </w:t>
-      </w:r>
-      <w:proofErr w:type="spellStart"/>
-      <w:r>
-        <w:rPr>
-          <w:lang w:eastAsia="es-ES"/>
-        </w:rPr>
-        <w:t>calendariocomponent</w:t>
-      </w:r>
-      <w:proofErr w:type="spellEnd"/>
-      <w:r>
-        <w:rPr>
-          <w:lang w:eastAsia="es-ES"/>
-        </w:rPr>
-        <w:t>:</w:t>
-      </w:r>
-    </w:p>
-    <w:p>
-      <w:pPr>
-        <w:jc w:val="both"/>
-        <w:rPr>
-          <w:lang w:eastAsia="es-ES"/>
-        </w:rPr>
-      </w:pPr>
-      <w:r>
-        <w:rPr>
+        <w:t>Analizar la manera en que Calendario envía un parámetro a DetalleExcursion y la forma en que este componente es capaz de obtenerlo y hacer uso de él. En concreto, analizar cómo cada Screen recibe la propiedad route. Calendario navega hacia DetalleExcursion enviando el identificador de la excursión en route.params, y la pantalla de detalle recupera dicho identificador para localizar la excursión correspondiente..</w:t>
+      </w:r>
+    </w:p>
+    <w:p>
+      <w:pPr>
+        <w:jc w:val="both"/>
+        <w:rPr>
+          <w:lang w:eastAsia="es-ES"/>
+        </w:rPr>
+      </w:pPr>
+      <w:r>
+        <w:rPr>
+          <w:lang w:eastAsia="es-ES"/>
+        </w:rPr>
+        <w:t xml:space="preserve">El NavigationContainer gestiona el estado de la navegación, es el componente principal que permite el cambio entre pantallas. Es esencial envolver todo el código en este contenedor para que funcione correctamente. </w:t>
+      </w:r>
+    </w:p>
+    <w:p>
+      <w:pPr>
+        <w:jc w:val="both"/>
+        <w:rPr>
+          <w:lang w:eastAsia="es-ES"/>
+        </w:rPr>
+      </w:pPr>
+      <w:r>
+        <w:rPr>
+          <w:lang w:eastAsia="es-ES"/>
+        </w:rPr>
+        <w:t xml:space="preserve">En el interior de este componente se encuentran las screens, </w:t>
+      </w:r>
+      <w:r>
+        <w:rPr>
+          <w:lang w:eastAsia="es-ES"/>
+        </w:rPr>
+        <w:t>cada una constituye una pantalla dentro de la aplicación.  En nuestro caso tenemos dos, una llamada calendario, que muestra la lista de excursiones disponibles, y cuando se le da click a una de ellas se abre la llamada detalle excursión, que muestra los detalles de la excursión que se ha pulsado. Esta información se recoge en la siguiente línea, presente en calendariocomponent:</w:t>
+      </w:r>
+    </w:p>
+    <w:p>
+      <w:pPr>
+        <w:jc w:val="both"/>
+        <w:rPr>
+          <w:lang w:eastAsia="es-ES"/>
+        </w:rPr>
+      </w:pPr>
+      <w:r>
+        <w:rPr>
+          <w:noProof/>
           <w:lang w:eastAsia="es-ES"/>
         </w:rPr>
         <w:drawing>
@@ -1342,32 +602,19 @@
         <w:rPr>
           <w:lang w:eastAsia="es-ES"/>
         </w:rPr>
-        <w:t xml:space="preserve">Este id se recoge en </w:t>
-      </w:r>
-      <w:proofErr w:type="spellStart"/>
-      <w:r>
-        <w:rPr>
-          <w:lang w:eastAsia="es-ES"/>
-        </w:rPr>
-        <w:t>DetalleExcursionComponent</w:t>
-      </w:r>
-      <w:proofErr w:type="spellEnd"/>
-      <w:r>
-        <w:rPr>
-          <w:lang w:eastAsia="es-ES"/>
-        </w:rPr>
-        <w:t xml:space="preserve"> mediante:</w:t>
-      </w:r>
-    </w:p>
-    <w:p>
-      <w:pPr>
-        <w:jc w:val="both"/>
-        <w:rPr>
-          <w:lang w:eastAsia="es-ES"/>
-        </w:rPr>
-      </w:pPr>
-      <w:r>
-        <w:rPr>
+        <w:t>Este id se recoge en DetalleExcursionComponent mediante:</w:t>
+      </w:r>
+    </w:p>
+    <w:p>
+      <w:pPr>
+        <w:jc w:val="both"/>
+        <w:rPr>
+          <w:lang w:eastAsia="es-ES"/>
+        </w:rPr>
+      </w:pPr>
+      <w:r>
+        <w:rPr>
+          <w:noProof/>
           <w:lang w:eastAsia="es-ES"/>
         </w:rPr>
         <w:drawing>
@@ -1418,21 +665,7 @@
         <w:rPr>
           <w:lang w:eastAsia="es-ES"/>
         </w:rPr>
-        <w:t xml:space="preserve">Route </w:t>
-      </w:r>
-      <w:proofErr w:type="spellStart"/>
-      <w:r>
-        <w:rPr>
-          <w:lang w:eastAsia="es-ES"/>
-        </w:rPr>
-        <w:t>params</w:t>
-      </w:r>
-      <w:proofErr w:type="spellEnd"/>
-      <w:r>
-        <w:rPr>
-          <w:lang w:eastAsia="es-ES"/>
-        </w:rPr>
-        <w:t xml:space="preserve"> contiene los datos enviados de la navegación.</w:t>
+        <w:t>Route params contiene los datos enviados de la navegación.</w:t>
       </w:r>
       <w:r>
         <w:rPr>
@@ -1452,22 +685,203 @@
         <w:rPr>
           <w:lang w:eastAsia="es-ES"/>
         </w:rPr>
-        <w:t xml:space="preserve">El </w:t>
-      </w:r>
-      <w:proofErr w:type="spellStart"/>
-      <w:r>
-        <w:rPr>
-          <w:lang w:eastAsia="es-ES"/>
-        </w:rPr>
-        <w:t>excursiónid</w:t>
-      </w:r>
-      <w:proofErr w:type="spellEnd"/>
-      <w:r>
-        <w:rPr>
-          <w:lang w:eastAsia="es-ES"/>
-        </w:rPr>
-        <w:t xml:space="preserve"> recibido se convierte a número, mediante el que se accede al array de excursiones y se le pasa ese índice al componente que renderiza la pantalla.</w:t>
-      </w:r>
+        <w:t>El excursiónid recibido se convierte a número, mediante el que se accede al array de excursiones y se le pasa ese índice al componente que renderiza la pantalla.</w:t>
+      </w:r>
+    </w:p>
+    <w:p>
+      <w:pPr>
+        <w:pStyle w:val="Ttulo1"/>
+        <w:rPr>
+          <w:lang w:eastAsia="es-ES"/>
+        </w:rPr>
+      </w:pPr>
+      <w:r>
+        <w:rPr>
+          <w:lang w:eastAsia="es-ES"/>
+        </w:rPr>
+        <w:t>Commit 05: “Drawer Navigation”</w:t>
+      </w:r>
+    </w:p>
+    <w:p>
+      <w:pPr>
+        <w:rPr>
+          <w:lang w:eastAsia="es-ES"/>
+        </w:rPr>
+      </w:pPr>
+    </w:p>
+    <w:p>
+      <w:pPr>
+        <w:jc w:val="both"/>
+        <w:rPr>
+          <w:lang w:eastAsia="es-ES"/>
+        </w:rPr>
+      </w:pPr>
+      <w:r>
+        <w:rPr>
+          <w:lang w:eastAsia="es-ES"/>
+        </w:rPr>
+        <w:t>En este commit se va a implementar una barra lateral en la aplicación que cambie entre vistas, una de ellas la que teníamos implementada hasta el commit anterior, llamada Calendario Gaztaroa, que muestra una lista de los eventos disponibles en la que puedes clickar para mostrar más información, la otra llamada Campo Base con una lista de paneles informativos con una imagen.</w:t>
+      </w:r>
+    </w:p>
+    <w:p>
+      <w:pPr>
+        <w:jc w:val="both"/>
+        <w:rPr>
+          <w:lang w:eastAsia="es-ES"/>
+        </w:rPr>
+      </w:pPr>
+      <w:r>
+        <w:rPr>
+          <w:lang w:eastAsia="es-ES"/>
+        </w:rPr>
+        <w:t>Se han añadido tres ficheros, dos de ellos contienen jsons informativos referentes a actividades y cabeceras. El otro es un fichero que contiene un nuevo componente</w:t>
+      </w:r>
+      <w:r>
+        <w:rPr>
+          <w:lang w:eastAsia="es-ES"/>
+        </w:rPr>
+        <w:t>, HomeComponent</w:t>
+      </w:r>
+      <w:r>
+        <w:rPr>
+          <w:lang w:eastAsia="es-ES"/>
+        </w:rPr>
+        <w:t>, que renderiza la interfaz según la información de los json. Se accede a el en Campo Base desde el Drawer.</w:t>
+      </w:r>
+    </w:p>
+    <w:p>
+      <w:pPr>
+        <w:pStyle w:val="Prrafodelista"/>
+        <w:numPr>
+          <w:ilvl w:val="0"/>
+          <w:numId w:val="7"/>
+        </w:numPr>
+        <w:jc w:val="both"/>
+        <w:rPr>
+          <w:b/>
+          <w:bCs/>
+          <w:lang w:eastAsia="es-ES"/>
+        </w:rPr>
+      </w:pPr>
+      <w:r>
+        <w:rPr>
+          <w:b/>
+          <w:bCs/>
+          <w:lang w:eastAsia="es-ES"/>
+        </w:rPr>
+        <w:lastRenderedPageBreak/>
+        <w:t>Dentro del NavigationContainer debe renderizarse un único árbol de navegación. Por ello, cuando necesitamos combinar varios navegadores, debemos anidarlos (nest navigators). Obsérvese en el código, y en la documentación señalada al final del ejercicio, la forma en que se resuelve esta cuestión.</w:t>
+      </w:r>
+    </w:p>
+    <w:p>
+      <w:pPr>
+        <w:pStyle w:val="Prrafodelista"/>
+        <w:numPr>
+          <w:ilvl w:val="0"/>
+          <w:numId w:val="7"/>
+        </w:numPr>
+        <w:jc w:val="both"/>
+        <w:rPr>
+          <w:b/>
+          <w:bCs/>
+          <w:lang w:eastAsia="es-ES"/>
+        </w:rPr>
+      </w:pPr>
+      <w:r>
+        <w:rPr>
+          <w:b/>
+          <w:bCs/>
+          <w:lang w:eastAsia="es-ES"/>
+        </w:rPr>
+        <w:t xml:space="preserve">Nótese que hemos añadido un stack navigator para el componente Home que acabamos de crear. </w:t>
+      </w:r>
+    </w:p>
+    <w:p>
+      <w:pPr>
+        <w:pStyle w:val="Prrafodelista"/>
+        <w:numPr>
+          <w:ilvl w:val="0"/>
+          <w:numId w:val="7"/>
+        </w:numPr>
+        <w:jc w:val="both"/>
+        <w:rPr>
+          <w:b/>
+          <w:bCs/>
+          <w:lang w:eastAsia="es-ES"/>
+        </w:rPr>
+      </w:pPr>
+      <w:r>
+        <w:rPr>
+          <w:b/>
+          <w:bCs/>
+          <w:lang w:eastAsia="es-ES"/>
+        </w:rPr>
+        <w:t>En el Drawer.Navigator establecemos headerShown: false para evitar que el drawer genere una cabecera adicional, ya que la cabecera que queremos mostrar es la de cada Stack.Navigator interno.</w:t>
+      </w:r>
+    </w:p>
+    <w:p>
+      <w:pPr>
+        <w:jc w:val="both"/>
+        <w:rPr>
+          <w:lang w:eastAsia="es-ES"/>
+        </w:rPr>
+      </w:pPr>
+      <w:r>
+        <w:rPr>
+          <w:lang w:eastAsia="es-ES"/>
+        </w:rPr>
+        <w:t>Dentro del NavigationContainer existe un único árbol de navegación encargado de gestionar el estado de la navegación de la aplicación. Si se intentasen usar varios del mismo nivel simultáneamente se producirían conflictos en la gestión de las rutas. Es por eso que se anidan navegadores, Drawer actúa como principal y dentro de cada una de sus opciones se renderiza un Stack Navigator.</w:t>
+      </w:r>
+    </w:p>
+    <w:p>
+      <w:pPr>
+        <w:jc w:val="both"/>
+        <w:rPr>
+          <w:lang w:eastAsia="es-ES"/>
+        </w:rPr>
+      </w:pPr>
+      <w:r>
+        <w:rPr>
+          <w:lang w:eastAsia="es-ES"/>
+        </w:rPr>
+        <w:t xml:space="preserve">El componente home también contiene un stack navigator para mantener una estructura homogénea. De esta forma se mantiene la coherencia con el resto de las secciones y, aunque no hacemos uso de ella, se podría usar una sola cabecera gestionada automáticamente. También facilita la </w:t>
+      </w:r>
+      <w:r>
+        <w:rPr>
+          <w:lang w:eastAsia="es-ES"/>
+        </w:rPr>
+        <w:t>ampliación futura, donde se podrían añadir más pantallas dentro de home.</w:t>
+      </w:r>
+    </w:p>
+    <w:p>
+      <w:pPr>
+        <w:jc w:val="both"/>
+        <w:rPr>
+          <w:lang w:eastAsia="es-ES"/>
+        </w:rPr>
+      </w:pPr>
+      <w:r>
+        <w:rPr>
+          <w:lang w:eastAsia="es-ES"/>
+        </w:rPr>
+        <w:t>Drawer por defecto crea su propia cabecera. Si esta opción esta desactivada se mostrarían dos cabeceras distintas, una de drawer y otra de cada stack interno. Se opta por esconder la del drawer.</w:t>
+      </w:r>
+    </w:p>
+    <w:p>
+      <w:pPr>
+        <w:jc w:val="both"/>
+        <w:rPr>
+          <w:lang w:eastAsia="es-ES"/>
+        </w:rPr>
+      </w:pPr>
+    </w:p>
+    <w:p>
+      <w:pPr>
+        <w:jc w:val="both"/>
+        <w:rPr>
+          <w:lang w:eastAsia="es-ES"/>
+        </w:rPr>
+      </w:pPr>
     </w:p>
     <w:p>
       <w:pPr>
@@ -1884,6 +1298,119 @@
     </w:lvl>
   </w:abstractNum>
   <w:abstractNum w:abstractNumId="3" w15:restartNumberingAfterBreak="0">
+    <w:nsid w:val="36DD7F07"/>
+    <w:multiLevelType w:val="hybridMultilevel"/>
+    <w:tmpl w:val="CF686978"/>
+    <w:lvl w:ilvl="0" w:tplc="0C0A0001">
+      <w:start w:val="1"/>
+      <w:numFmt w:val="bullet"/>
+      <w:lvlText w:val=""/>
+      <w:lvlJc w:val="left"/>
+      <w:pPr>
+        <w:ind w:left="720" w:hanging="360"/>
+      </w:pPr>
+      <w:rPr>
+        <w:rFonts w:ascii="Symbol" w:hAnsi="Symbol" w:hint="default"/>
+      </w:rPr>
+    </w:lvl>
+    <w:lvl w:ilvl="1" w:tplc="0C0A0003" w:tentative="1">
+      <w:start w:val="1"/>
+      <w:numFmt w:val="bullet"/>
+      <w:lvlText w:val="o"/>
+      <w:lvlJc w:val="left"/>
+      <w:pPr>
+        <w:ind w:left="1440" w:hanging="360"/>
+      </w:pPr>
+      <w:rPr>
+        <w:rFonts w:ascii="Courier New" w:hAnsi="Courier New" w:cs="Courier New" w:hint="default"/>
+      </w:rPr>
+    </w:lvl>
+    <w:lvl w:ilvl="2" w:tplc="0C0A0005" w:tentative="1">
+      <w:start w:val="1"/>
+      <w:numFmt w:val="bullet"/>
+      <w:lvlText w:val=""/>
+      <w:lvlJc w:val="left"/>
+      <w:pPr>
+        <w:ind w:left="2160" w:hanging="360"/>
+      </w:pPr>
+      <w:rPr>
+        <w:rFonts w:ascii="Wingdings" w:hAnsi="Wingdings" w:hint="default"/>
+      </w:rPr>
+    </w:lvl>
+    <w:lvl w:ilvl="3" w:tplc="0C0A0001" w:tentative="1">
+      <w:start w:val="1"/>
+      <w:numFmt w:val="bullet"/>
+      <w:lvlText w:val=""/>
+      <w:lvlJc w:val="left"/>
+      <w:pPr>
+        <w:ind w:left="2880" w:hanging="360"/>
+      </w:pPr>
+      <w:rPr>
+        <w:rFonts w:ascii="Symbol" w:hAnsi="Symbol" w:hint="default"/>
+      </w:rPr>
+    </w:lvl>
+    <w:lvl w:ilvl="4" w:tplc="0C0A0003" w:tentative="1">
+      <w:start w:val="1"/>
+      <w:numFmt w:val="bullet"/>
+      <w:lvlText w:val="o"/>
+      <w:lvlJc w:val="left"/>
+      <w:pPr>
+        <w:ind w:left="3600" w:hanging="360"/>
+      </w:pPr>
+      <w:rPr>
+        <w:rFonts w:ascii="Courier New" w:hAnsi="Courier New" w:cs="Courier New" w:hint="default"/>
+      </w:rPr>
+    </w:lvl>
+    <w:lvl w:ilvl="5" w:tplc="0C0A0005" w:tentative="1">
+      <w:start w:val="1"/>
+      <w:numFmt w:val="bullet"/>
+      <w:lvlText w:val=""/>
+      <w:lvlJc w:val="left"/>
+      <w:pPr>
+        <w:ind w:left="4320" w:hanging="360"/>
+      </w:pPr>
+      <w:rPr>
+        <w:rFonts w:ascii="Wingdings" w:hAnsi="Wingdings" w:hint="default"/>
+      </w:rPr>
+    </w:lvl>
+    <w:lvl w:ilvl="6" w:tplc="0C0A0001" w:tentative="1">
+      <w:start w:val="1"/>
+      <w:numFmt w:val="bullet"/>
+      <w:lvlText w:val=""/>
+      <w:lvlJc w:val="left"/>
+      <w:pPr>
+        <w:ind w:left="5040" w:hanging="360"/>
+      </w:pPr>
+      <w:rPr>
+        <w:rFonts w:ascii="Symbol" w:hAnsi="Symbol" w:hint="default"/>
+      </w:rPr>
+    </w:lvl>
+    <w:lvl w:ilvl="7" w:tplc="0C0A0003" w:tentative="1">
+      <w:start w:val="1"/>
+      <w:numFmt w:val="bullet"/>
+      <w:lvlText w:val="o"/>
+      <w:lvlJc w:val="left"/>
+      <w:pPr>
+        <w:ind w:left="5760" w:hanging="360"/>
+      </w:pPr>
+      <w:rPr>
+        <w:rFonts w:ascii="Courier New" w:hAnsi="Courier New" w:cs="Courier New" w:hint="default"/>
+      </w:rPr>
+    </w:lvl>
+    <w:lvl w:ilvl="8" w:tplc="0C0A0005" w:tentative="1">
+      <w:start w:val="1"/>
+      <w:numFmt w:val="bullet"/>
+      <w:lvlText w:val=""/>
+      <w:lvlJc w:val="left"/>
+      <w:pPr>
+        <w:ind w:left="6480" w:hanging="360"/>
+      </w:pPr>
+      <w:rPr>
+        <w:rFonts w:ascii="Wingdings" w:hAnsi="Wingdings" w:hint="default"/>
+      </w:rPr>
+    </w:lvl>
+  </w:abstractNum>
+  <w:abstractNum w:abstractNumId="4" w15:restartNumberingAfterBreak="0">
     <w:nsid w:val="3ACC6F0A"/>
     <w:multiLevelType w:val="hybridMultilevel"/>
     <w:tmpl w:val="5DBA38D0"/>
@@ -1996,7 +1523,7 @@
       </w:rPr>
     </w:lvl>
   </w:abstractNum>
-  <w:abstractNum w:abstractNumId="4" w15:restartNumberingAfterBreak="0">
+  <w:abstractNum w:abstractNumId="5" w15:restartNumberingAfterBreak="0">
     <w:nsid w:val="5A6A6B00"/>
     <w:multiLevelType w:val="hybridMultilevel"/>
     <w:tmpl w:val="7420735E"/>
@@ -2109,7 +1636,7 @@
       </w:rPr>
     </w:lvl>
   </w:abstractNum>
-  <w:abstractNum w:abstractNumId="5" w15:restartNumberingAfterBreak="0">
+  <w:abstractNum w:abstractNumId="6" w15:restartNumberingAfterBreak="0">
     <w:nsid w:val="78E12896"/>
     <w:multiLevelType w:val="hybridMultilevel"/>
     <w:tmpl w:val="936299E4"/>
@@ -2223,13 +1750,13 @@
     </w:lvl>
   </w:abstractNum>
   <w:num w:numId="1" w16cid:durableId="1174687561">
-    <w:abstractNumId w:val="4"/>
+    <w:abstractNumId w:val="5"/>
   </w:num>
   <w:num w:numId="2" w16cid:durableId="1452284289">
     <w:abstractNumId w:val="1"/>
   </w:num>
   <w:num w:numId="3" w16cid:durableId="1368523310">
-    <w:abstractNumId w:val="3"/>
+    <w:abstractNumId w:val="4"/>
   </w:num>
   <w:num w:numId="4" w16cid:durableId="1622690477">
     <w:abstractNumId w:val="0"/>
@@ -2238,7 +1765,10 @@
     <w:abstractNumId w:val="2"/>
   </w:num>
   <w:num w:numId="6" w16cid:durableId="423036140">
-    <w:abstractNumId w:val="5"/>
+    <w:abstractNumId w:val="6"/>
+  </w:num>
+  <w:num w:numId="7" w16cid:durableId="1493718539">
+    <w:abstractNumId w:val="3"/>
   </w:num>
 </w:numbering>
 </file>

</xml_diff>

<commit_message>
Commit 06: “Ejercicio Componentes y Navegacion”
</commit_message>
<xml_diff>
--- a/Comentario sobre las prácticas.docx
+++ b/Comentario sobre las prácticas.docx
@@ -864,8 +864,164 @@
         <w:rPr>
           <w:lang w:eastAsia="es-ES"/>
         </w:rPr>
-        <w:t>Drawer por defecto crea su propia cabecera. Si esta opción esta desactivada se mostrarían dos cabeceras distintas, una de drawer y otra de cada stack interno. Se opta por esconder la del drawer.</w:t>
-      </w:r>
+        <w:t>Drawer por defecto crea su propia cabecera. Si esta opción esta desactivada se mostrarían dos cabeceras distintas, una de drawer y otra de cada stack interno. Se opta por esconder la del drawer</w:t>
+      </w:r>
+    </w:p>
+    <w:p>
+      <w:pPr>
+        <w:pStyle w:val="Ttulo1"/>
+        <w:rPr>
+          <w:lang w:eastAsia="es-ES"/>
+        </w:rPr>
+      </w:pPr>
+      <w:r>
+        <w:rPr>
+          <w:lang w:eastAsia="es-ES"/>
+        </w:rPr>
+        <w:t>Commit 06: “Ejercicio Componentes y Navegacion”</w:t>
+      </w:r>
+    </w:p>
+    <w:p>
+      <w:pPr>
+        <w:rPr>
+          <w:lang w:eastAsia="es-ES"/>
+        </w:rPr>
+      </w:pPr>
+    </w:p>
+    <w:p>
+      <w:pPr>
+        <w:jc w:val="both"/>
+        <w:rPr>
+          <w:lang w:eastAsia="es-ES"/>
+        </w:rPr>
+      </w:pPr>
+      <w:r>
+        <w:rPr>
+          <w:lang w:eastAsia="es-ES"/>
+        </w:rPr>
+        <w:t>El objetivo de esta práctica es añadir dos componentes más a la navegación desde cero, creando su estructura y añadiéndolos a la navegación que ya hemos implementado. Uno de los componentes muestra una página de contacto y la otra comenta la historia del club. Como punto adicional, se ha retocado un poco los estilos de la pagina principal que se hizo en la práctica anterior.</w:t>
+      </w:r>
+    </w:p>
+    <w:p>
+      <w:pPr>
+        <w:jc w:val="both"/>
+        <w:rPr>
+          <w:lang w:eastAsia="es-ES"/>
+        </w:rPr>
+      </w:pPr>
+      <w:r>
+        <w:rPr>
+          <w:lang w:eastAsia="es-ES"/>
+        </w:rPr>
+        <w:t>Se ha creado el fichero ContactoComponent.js. Este es un componente de clase que utiliza scrollview para permitir el desplazamiento del contenido por la pantalla. Para la visualización se ha utilizado una carta de React Native Paper con sus apartados Card.title, Card.content y text que permite agrupar la información de forma clara y estructurada.</w:t>
+      </w:r>
+    </w:p>
+    <w:p>
+      <w:pPr>
+        <w:jc w:val="both"/>
+        <w:rPr>
+          <w:lang w:eastAsia="es-ES"/>
+        </w:rPr>
+      </w:pPr>
+      <w:r>
+        <w:rPr>
+          <w:lang w:eastAsia="es-ES"/>
+        </w:rPr>
+        <w:t xml:space="preserve">También se ha creado el fichero QuienesSomosComponent.js, que muestra un texto descriptivo sobre el origen del club así como una lista de actividades. </w:t>
+      </w:r>
+    </w:p>
+    <w:p>
+      <w:pPr>
+        <w:jc w:val="both"/>
+        <w:rPr>
+          <w:lang w:eastAsia="es-ES"/>
+        </w:rPr>
+      </w:pPr>
+      <w:r>
+        <w:rPr>
+          <w:lang w:eastAsia="es-ES"/>
+        </w:rPr>
+        <w:t>La historia se ha implementado como componente funcional</w:t>
+      </w:r>
+      <w:r>
+        <w:rPr>
+          <w:lang w:eastAsia="es-ES"/>
+        </w:rPr>
+        <w:t xml:space="preserve"> con una card. Este solo renderiza información estática sin estados.</w:t>
+      </w:r>
+    </w:p>
+    <w:p>
+      <w:pPr>
+        <w:jc w:val="both"/>
+        <w:rPr>
+          <w:lang w:eastAsia="es-ES"/>
+        </w:rPr>
+      </w:pPr>
+      <w:r>
+        <w:rPr>
+          <w:lang w:eastAsia="es-ES"/>
+        </w:rPr>
+        <w:t xml:space="preserve">La lista de actividades de QuienesSomos se ha implementado como componente de clase. Este emplea una flat list  con sus ítems que llegan desde actividades.js. Actividades.js se importa, lo que permite acceder al array dentro del componente. </w:t>
+      </w:r>
+    </w:p>
+    <w:p>
+      <w:pPr>
+        <w:jc w:val="both"/>
+        <w:rPr>
+          <w:lang w:eastAsia="es-ES"/>
+        </w:rPr>
+      </w:pPr>
+      <w:r>
+        <w:rPr>
+          <w:lang w:eastAsia="es-ES"/>
+        </w:rPr>
+        <w:lastRenderedPageBreak/>
+        <w:t>Estos nuevos componentes se han añadido al drawer ya existente, de forma que se pueda navegar por ellos y acceder desde el menú lateral. Se han usado navegadores anidados al igual que se hacía con los componentes ya existentes, para ello, las opciones del drawer apuntan a un stack navigator.</w:t>
+      </w:r>
+    </w:p>
+    <w:p>
+      <w:pPr>
+        <w:jc w:val="both"/>
+        <w:rPr>
+          <w:lang w:eastAsia="es-ES"/>
+        </w:rPr>
+      </w:pPr>
+      <w:r>
+        <w:rPr>
+          <w:lang w:eastAsia="es-ES"/>
+        </w:rPr>
+        <w:t>Por últ</w:t>
+      </w:r>
+      <w:r>
+        <w:rPr>
+          <w:lang w:eastAsia="es-ES"/>
+        </w:rPr>
+        <w:t>imo, se han modificado los componentes Home y DetalleExcursion, cambiando los estilos para conseguir una mejora visual. Se ha usado ImageBackground de react-native, lo que permite usar una imagen como fondo y renderizar contenido encima de ella. Se ha superpuesto de esta forma el texto a la imagen.</w:t>
+      </w:r>
+    </w:p>
+    <w:p>
+      <w:pPr>
+        <w:jc w:val="both"/>
+        <w:rPr>
+          <w:lang w:eastAsia="es-ES"/>
+        </w:rPr>
+      </w:pPr>
+    </w:p>
+    <w:p>
+      <w:pPr>
+        <w:jc w:val="both"/>
+        <w:rPr>
+          <w:lang w:eastAsia="es-ES"/>
+        </w:rPr>
+      </w:pPr>
+    </w:p>
+    <w:p>
+      <w:pPr>
+        <w:jc w:val="both"/>
+        <w:rPr>
+          <w:lang w:eastAsia="es-ES"/>
+        </w:rPr>
+      </w:pPr>
     </w:p>
     <w:p>
       <w:pPr>
@@ -2374,6 +2530,7 @@
   <w:style w:type="character" w:default="1" w:styleId="Fuentedeprrafopredeter">
     <w:name w:val="Default Paragraph Font"/>
     <w:uiPriority w:val="1"/>
+    <w:semiHidden/>
     <w:unhideWhenUsed/>
   </w:style>
   <w:style w:type="table" w:default="1" w:styleId="Tablanormal">

</xml_diff>

<commit_message>
Commit 07: “Botones o Iconos”
</commit_message>
<xml_diff>
--- a/Comentario sobre las prácticas.docx
+++ b/Comentario sobre las prácticas.docx
@@ -22,27 +22,61 @@
       <w:pPr>
         <w:pStyle w:val="Ttulo1"/>
       </w:pPr>
-      <w:r>
-        <w:t xml:space="preserve">Commit 1. </w:t>
-      </w:r>
-      <w:r>
-        <w:t>"Primeros pasos en React Native"</w:t>
-      </w:r>
-    </w:p>
-    <w:p>
-      <w:pPr>
-        <w:jc w:val="both"/>
-      </w:pPr>
-      <w:r>
-        <w:t>Commit inicial del repositorio en el que se van a hacer las prácticas correspondientes al apartado react-native de la asignatura DSM.</w:t>
-      </w:r>
-    </w:p>
-    <w:p>
-      <w:pPr>
-        <w:jc w:val="both"/>
-      </w:pPr>
-      <w:r>
-        <w:t>Se ha instalado Expo tanto en el repositorio como en el teléfono móvil para poder realizar el desarrollo y pruebas correctamente en tiempo real. De forma inicial la aplicación cuenta con un archivo App.js, que contiene un componente de react llamado “View”, con sus correspondientes estilos y con un texto, que es lo que se muestra cuando se visualiza la aplicación en funcionamiento.</w:t>
+      <w:proofErr w:type="spellStart"/>
+      <w:r>
+        <w:t>Commit</w:t>
+      </w:r>
+      <w:proofErr w:type="spellEnd"/>
+      <w:r>
+        <w:t xml:space="preserve"> 1. </w:t>
+      </w:r>
+      <w:r>
+        <w:t xml:space="preserve">"Primeros pasos en </w:t>
+      </w:r>
+      <w:proofErr w:type="spellStart"/>
+      <w:r>
+        <w:t>React</w:t>
+      </w:r>
+      <w:proofErr w:type="spellEnd"/>
+      <w:r>
+        <w:t xml:space="preserve"> Native"</w:t>
+      </w:r>
+    </w:p>
+    <w:p>
+      <w:pPr>
+        <w:jc w:val="both"/>
+      </w:pPr>
+      <w:proofErr w:type="spellStart"/>
+      <w:r>
+        <w:t>Commit</w:t>
+      </w:r>
+      <w:proofErr w:type="spellEnd"/>
+      <w:r>
+        <w:t xml:space="preserve"> inicial del repositorio en el que se van a hacer las prácticas correspondientes al apartado </w:t>
+      </w:r>
+      <w:proofErr w:type="spellStart"/>
+      <w:r>
+        <w:t>react</w:t>
+      </w:r>
+      <w:proofErr w:type="spellEnd"/>
+      <w:r>
+        <w:t>-native de la asignatura DSM.</w:t>
+      </w:r>
+    </w:p>
+    <w:p>
+      <w:pPr>
+        <w:jc w:val="both"/>
+      </w:pPr>
+      <w:r>
+        <w:t xml:space="preserve">Se ha instalado Expo tanto en el repositorio como en el teléfono móvil para poder realizar el desarrollo y pruebas correctamente en tiempo real. De forma inicial la aplicación cuenta con un archivo App.js, que contiene un componente de </w:t>
+      </w:r>
+      <w:proofErr w:type="spellStart"/>
+      <w:r>
+        <w:t>react</w:t>
+      </w:r>
+      <w:proofErr w:type="spellEnd"/>
+      <w:r>
+        <w:t xml:space="preserve"> llamado “View”, con sus correspondientes estilos y con un texto, que es lo que se muestra cuando se visualiza la aplicación en funcionamiento.</w:t>
       </w:r>
     </w:p>
     <w:p>
@@ -54,36 +88,110 @@
       <w:pPr>
         <w:pStyle w:val="Ttulo1"/>
       </w:pPr>
-      <w:r>
-        <w:t xml:space="preserve">Commit 2. </w:t>
-      </w:r>
-      <w:r>
-        <w:t>"Componentes React Native"</w:t>
-      </w:r>
-    </w:p>
-    <w:p>
-      <w:pPr>
-        <w:jc w:val="both"/>
-      </w:pPr>
-      <w:r>
-        <w:t>Continuamos avanzando con la aplicación, para estudiar los componentes de react-native y su funcionamiento hemos creado dos carpetas, una llamada componentes, donde se van a crear los nuevos componentes que vamos a usar, y otro llamado común, que contiene un documento con una lista de información que se utilizará más adelante. Además, se incluye una subcarpeta de imágenes que la aplicación irá utilizando.</w:t>
-      </w:r>
-    </w:p>
-    <w:p>
-      <w:pPr>
-        <w:jc w:val="both"/>
-      </w:pPr>
-      <w:r>
-        <w:t>El calendariocomponent es un componente que, utilizando list.wiew de react-native-paper, recoge los elementos de la lista de excursiones, dándoles un formato y posicionando una de las imágenes a la izquierda. Se incluyen además sus estilos. Utilizando también FlatList, un componente de react, se disponen en formato vertical.</w:t>
-      </w:r>
-    </w:p>
-    <w:p>
-      <w:pPr>
-        <w:jc w:val="both"/>
-      </w:pPr>
-      <w:r>
-        <w:t>En CampobaseComponent</w:t>
-      </w:r>
+      <w:proofErr w:type="spellStart"/>
+      <w:r>
+        <w:t>Commit</w:t>
+      </w:r>
+      <w:proofErr w:type="spellEnd"/>
+      <w:r>
+        <w:t xml:space="preserve"> 2. </w:t>
+      </w:r>
+      <w:r>
+        <w:t xml:space="preserve">"Componentes </w:t>
+      </w:r>
+      <w:proofErr w:type="spellStart"/>
+      <w:r>
+        <w:t>React</w:t>
+      </w:r>
+      <w:proofErr w:type="spellEnd"/>
+      <w:r>
+        <w:t xml:space="preserve"> Native"</w:t>
+      </w:r>
+    </w:p>
+    <w:p>
+      <w:pPr>
+        <w:jc w:val="both"/>
+      </w:pPr>
+      <w:r>
+        <w:t xml:space="preserve">Continuamos avanzando con la aplicación, para estudiar los componentes de </w:t>
+      </w:r>
+      <w:proofErr w:type="spellStart"/>
+      <w:r>
+        <w:t>react</w:t>
+      </w:r>
+      <w:proofErr w:type="spellEnd"/>
+      <w:r>
+        <w:t>-native y su funcionamiento hemos creado dos carpetas, una llamada componentes, donde se van a crear los nuevos componentes que vamos a usar, y otro llamado común, que contiene un documento con una lista de información que se utilizará más adelante. Además, se incluye una subcarpeta de imágenes que la aplicación irá utilizando.</w:t>
+      </w:r>
+    </w:p>
+    <w:p>
+      <w:pPr>
+        <w:jc w:val="both"/>
+      </w:pPr>
+      <w:r>
+        <w:t xml:space="preserve">El </w:t>
+      </w:r>
+      <w:proofErr w:type="spellStart"/>
+      <w:r>
+        <w:t>calendariocomponent</w:t>
+      </w:r>
+      <w:proofErr w:type="spellEnd"/>
+      <w:r>
+        <w:t xml:space="preserve"> es un componente que, utilizando </w:t>
+      </w:r>
+      <w:proofErr w:type="spellStart"/>
+      <w:r>
+        <w:t>list.wiew</w:t>
+      </w:r>
+      <w:proofErr w:type="spellEnd"/>
+      <w:r>
+        <w:t xml:space="preserve"> de </w:t>
+      </w:r>
+      <w:proofErr w:type="spellStart"/>
+      <w:r>
+        <w:t>react</w:t>
+      </w:r>
+      <w:proofErr w:type="spellEnd"/>
+      <w:r>
+        <w:t>-native-</w:t>
+      </w:r>
+      <w:proofErr w:type="spellStart"/>
+      <w:r>
+        <w:t>paper</w:t>
+      </w:r>
+      <w:proofErr w:type="spellEnd"/>
+      <w:r>
+        <w:t xml:space="preserve">, recoge los elementos de la lista de excursiones, dándoles un formato y posicionando una de las imágenes a la izquierda. Se incluyen además sus estilos. Utilizando también </w:t>
+      </w:r>
+      <w:proofErr w:type="spellStart"/>
+      <w:r>
+        <w:t>FlatList</w:t>
+      </w:r>
+      <w:proofErr w:type="spellEnd"/>
+      <w:r>
+        <w:t xml:space="preserve">, un componente de </w:t>
+      </w:r>
+      <w:proofErr w:type="spellStart"/>
+      <w:r>
+        <w:t>react</w:t>
+      </w:r>
+      <w:proofErr w:type="spellEnd"/>
+      <w:r>
+        <w:t>, se disponen en formato vertical.</w:t>
+      </w:r>
+    </w:p>
+    <w:p>
+      <w:pPr>
+        <w:jc w:val="both"/>
+      </w:pPr>
+      <w:r>
+        <w:t xml:space="preserve">En </w:t>
+      </w:r>
+      <w:proofErr w:type="spellStart"/>
+      <w:r>
+        <w:t>CampobaseComponent</w:t>
+      </w:r>
+      <w:proofErr w:type="spellEnd"/>
       <w:r>
         <w:t xml:space="preserve"> se guarda la lista de excursiones y se pasan al componente calendario para que este las muestre.</w:t>
       </w:r>
@@ -93,7 +201,55 @@
         <w:jc w:val="both"/>
       </w:pPr>
       <w:r>
-        <w:t>También se ha modificado el fichero App.js para que se muestre la app correctamente, SafeAreaProvider sirve para que no se solape con la barra superior, notch y los bordes del móvil, PaperProvider activa el sistema de estilos de react native paper. En ese momento se incluye el componente campobase que, renderiza un calendario y le pasa cada una de las excursiones para que se dispongan en forma de lista como se ha explicado.</w:t>
+        <w:t xml:space="preserve">También se ha modificado el fichero App.js para que se muestre la app correctamente, </w:t>
+      </w:r>
+      <w:proofErr w:type="spellStart"/>
+      <w:r>
+        <w:t>SafeAreaProvider</w:t>
+      </w:r>
+      <w:proofErr w:type="spellEnd"/>
+      <w:r>
+        <w:t xml:space="preserve"> sirve para que no se solape con la barra superior, </w:t>
+      </w:r>
+      <w:proofErr w:type="spellStart"/>
+      <w:r>
+        <w:t>notch</w:t>
+      </w:r>
+      <w:proofErr w:type="spellEnd"/>
+      <w:r>
+        <w:t xml:space="preserve"> y los bordes del móvil, </w:t>
+      </w:r>
+      <w:proofErr w:type="spellStart"/>
+      <w:r>
+        <w:t>PaperProvider</w:t>
+      </w:r>
+      <w:proofErr w:type="spellEnd"/>
+      <w:r>
+        <w:t xml:space="preserve"> activa el sistema de estilos de </w:t>
+      </w:r>
+      <w:proofErr w:type="spellStart"/>
+      <w:r>
+        <w:t>react</w:t>
+      </w:r>
+      <w:proofErr w:type="spellEnd"/>
+      <w:r>
+        <w:t xml:space="preserve"> native </w:t>
+      </w:r>
+      <w:proofErr w:type="spellStart"/>
+      <w:r>
+        <w:t>paper</w:t>
+      </w:r>
+      <w:proofErr w:type="spellEnd"/>
+      <w:r>
+        <w:t xml:space="preserve">. En ese momento se incluye el componente </w:t>
+      </w:r>
+      <w:proofErr w:type="spellStart"/>
+      <w:r>
+        <w:t>campobase</w:t>
+      </w:r>
+      <w:proofErr w:type="spellEnd"/>
+      <w:r>
+        <w:t xml:space="preserve"> que, renderiza un calendario y le pasa cada una de las excursiones para que se dispongan en forma de lista como se ha explicado.</w:t>
       </w:r>
     </w:p>
     <w:p>
@@ -101,19 +257,48 @@
         <w:pStyle w:val="Ttulo1"/>
         <w:jc w:val="both"/>
       </w:pPr>
-      <w:r>
-        <w:t>Commit 3. “</w:t>
-      </w:r>
-      <w:r>
-        <w:t>Componentes funcionales en React Native”</w:t>
-      </w:r>
-    </w:p>
-    <w:p>
-      <w:pPr>
-        <w:jc w:val="both"/>
-      </w:pPr>
-      <w:r>
-        <w:t>En esta parte del trabajo se va a profundizar más en los componentes funcionales de react-native. En el commit anterior ya creamos uno, el calendario. En el día de hoy se va a crear otro y se va a realizar comunicación entre ellos.</w:t>
+      <w:proofErr w:type="spellStart"/>
+      <w:r>
+        <w:t>Commit</w:t>
+      </w:r>
+      <w:proofErr w:type="spellEnd"/>
+      <w:r>
+        <w:t xml:space="preserve"> 3. “</w:t>
+      </w:r>
+      <w:r>
+        <w:t xml:space="preserve">Componentes funcionales en </w:t>
+      </w:r>
+      <w:proofErr w:type="spellStart"/>
+      <w:r>
+        <w:t>React</w:t>
+      </w:r>
+      <w:proofErr w:type="spellEnd"/>
+      <w:r>
+        <w:t xml:space="preserve"> Native”</w:t>
+      </w:r>
+    </w:p>
+    <w:p>
+      <w:pPr>
+        <w:jc w:val="both"/>
+      </w:pPr>
+      <w:r>
+        <w:t xml:space="preserve">En esta parte del trabajo se va a profundizar más en los componentes funcionales de </w:t>
+      </w:r>
+      <w:proofErr w:type="spellStart"/>
+      <w:r>
+        <w:t>react</w:t>
+      </w:r>
+      <w:proofErr w:type="spellEnd"/>
+      <w:r>
+        <w:t xml:space="preserve">-native. En el </w:t>
+      </w:r>
+      <w:proofErr w:type="spellStart"/>
+      <w:r>
+        <w:t>commit</w:t>
+      </w:r>
+      <w:proofErr w:type="spellEnd"/>
+      <w:r>
+        <w:t xml:space="preserve"> anterior ya creamos uno, el calendario. En el día de hoy se va a crear otro y se va a realizar comunicación entre ellos.</w:t>
       </w:r>
     </w:p>
     <w:p>
@@ -133,18 +318,50 @@
         <w:jc w:val="both"/>
       </w:pPr>
       <w:r>
-        <w:t xml:space="preserve">El componente se llama DetalleExcursionComponent, que </w:t>
-      </w:r>
-      <w:r>
-        <w:t>muestra una tarjeta (Card) con los datos de una excursión (nombre, imagen y descripción) usando react-native-paper.</w:t>
-      </w:r>
-    </w:p>
-    <w:p>
-      <w:pPr>
-        <w:jc w:val="both"/>
-      </w:pPr>
-      <w:r>
-        <w:t>Si recibe una excursión válida por props, la renderiza</w:t>
+        <w:t xml:space="preserve">El componente se llama </w:t>
+      </w:r>
+      <w:proofErr w:type="spellStart"/>
+      <w:r>
+        <w:t>DetalleExcursionComponent</w:t>
+      </w:r>
+      <w:proofErr w:type="spellEnd"/>
+      <w:r>
+        <w:t xml:space="preserve">, que </w:t>
+      </w:r>
+      <w:r>
+        <w:t xml:space="preserve">muestra una tarjeta (Card) con los datos de una excursión (nombre, imagen y descripción) usando </w:t>
+      </w:r>
+      <w:proofErr w:type="spellStart"/>
+      <w:r>
+        <w:t>react</w:t>
+      </w:r>
+      <w:proofErr w:type="spellEnd"/>
+      <w:r>
+        <w:t>-native-</w:t>
+      </w:r>
+      <w:proofErr w:type="spellStart"/>
+      <w:r>
+        <w:t>paper</w:t>
+      </w:r>
+      <w:proofErr w:type="spellEnd"/>
+      <w:r>
+        <w:t>.</w:t>
+      </w:r>
+    </w:p>
+    <w:p>
+      <w:pPr>
+        <w:jc w:val="both"/>
+      </w:pPr>
+      <w:r>
+        <w:t xml:space="preserve">Si recibe una excursión válida por </w:t>
+      </w:r>
+      <w:proofErr w:type="spellStart"/>
+      <w:r>
+        <w:t>props</w:t>
+      </w:r>
+      <w:proofErr w:type="spellEnd"/>
+      <w:r>
+        <w:t>, la renderiza</w:t>
       </w:r>
       <w:r>
         <w:t>,</w:t>
@@ -156,15 +373,63 @@
         <w:t xml:space="preserve"> </w:t>
       </w:r>
       <w:r>
-        <w:t>Se comunica con otros componentes a través de props: el componente padre le pasa un objeto excursion (props.excursion) y este lo utiliza para mostrar la información.</w:t>
-      </w:r>
-    </w:p>
-    <w:p>
-      <w:pPr>
-        <w:jc w:val="both"/>
-      </w:pPr>
-      <w:r>
-        <w:t>Además, DetalleExcursion actúa como intermediario, recibiendo las props y pasándoselas a RenderExcursion, manteniendo así la comunicación entre componentes.</w:t>
+        <w:t xml:space="preserve">Se comunica con otros componentes a través de </w:t>
+      </w:r>
+      <w:proofErr w:type="spellStart"/>
+      <w:r>
+        <w:t>props</w:t>
+      </w:r>
+      <w:proofErr w:type="spellEnd"/>
+      <w:r>
+        <w:t xml:space="preserve">: el componente padre le pasa un objeto </w:t>
+      </w:r>
+      <w:proofErr w:type="spellStart"/>
+      <w:r>
+        <w:t>excursion</w:t>
+      </w:r>
+      <w:proofErr w:type="spellEnd"/>
+      <w:r>
+        <w:t xml:space="preserve"> (</w:t>
+      </w:r>
+      <w:proofErr w:type="spellStart"/>
+      <w:r>
+        <w:t>props.excursion</w:t>
+      </w:r>
+      <w:proofErr w:type="spellEnd"/>
+      <w:r>
+        <w:t>) y este lo utiliza para mostrar la información.</w:t>
+      </w:r>
+    </w:p>
+    <w:p>
+      <w:pPr>
+        <w:jc w:val="both"/>
+      </w:pPr>
+      <w:r>
+        <w:t xml:space="preserve">Además, </w:t>
+      </w:r>
+      <w:proofErr w:type="spellStart"/>
+      <w:r>
+        <w:t>DetalleExcursion</w:t>
+      </w:r>
+      <w:proofErr w:type="spellEnd"/>
+      <w:r>
+        <w:t xml:space="preserve"> actúa como intermediario, recibiendo las </w:t>
+      </w:r>
+      <w:proofErr w:type="spellStart"/>
+      <w:r>
+        <w:t>props</w:t>
+      </w:r>
+      <w:proofErr w:type="spellEnd"/>
+      <w:r>
+        <w:t xml:space="preserve"> y pasándoselas a </w:t>
+      </w:r>
+      <w:proofErr w:type="spellStart"/>
+      <w:r>
+        <w:t>RenderExcursion</w:t>
+      </w:r>
+      <w:proofErr w:type="spellEnd"/>
+      <w:r>
+        <w:t>, manteniendo así la comunicación entre componentes.</w:t>
       </w:r>
     </w:p>
     <w:p>
@@ -185,7 +450,15 @@
         <w:jc w:val="both"/>
       </w:pPr>
       <w:r>
-        <w:t xml:space="preserve">Se añade un estado (seleccionExcursion) que guarda qué excursión está seleccionada. </w:t>
+        <w:t>Se añade un estado (</w:t>
+      </w:r>
+      <w:proofErr w:type="spellStart"/>
+      <w:r>
+        <w:t>seleccionExcursion</w:t>
+      </w:r>
+      <w:proofErr w:type="spellEnd"/>
+      <w:r>
+        <w:t xml:space="preserve">) que guarda qué excursión está seleccionada. </w:t>
       </w:r>
     </w:p>
     <w:p>
@@ -198,7 +471,15 @@
         <w:jc w:val="both"/>
       </w:pPr>
       <w:r>
-        <w:t xml:space="preserve">Cuando el usuario pulsa en Calendario, se llama a onSeleccionExcursion, que actualiza ese estado con el id. </w:t>
+        <w:t xml:space="preserve">Cuando el usuario pulsa en Calendario, se llama a </w:t>
+      </w:r>
+      <w:proofErr w:type="spellStart"/>
+      <w:r>
+        <w:t>onSeleccionExcursion</w:t>
+      </w:r>
+      <w:proofErr w:type="spellEnd"/>
+      <w:r>
+        <w:t xml:space="preserve">, que actualiza ese estado con el id. </w:t>
       </w:r>
     </w:p>
     <w:p>
@@ -211,7 +492,23 @@
         <w:jc w:val="both"/>
       </w:pPr>
       <w:r>
-        <w:t>Luego, DetalleExcursion recibe por props la excursión filtrada según ese id y muestra su información.</w:t>
+        <w:t xml:space="preserve">Luego, </w:t>
+      </w:r>
+      <w:proofErr w:type="spellStart"/>
+      <w:r>
+        <w:t>DetalleExcursion</w:t>
+      </w:r>
+      <w:proofErr w:type="spellEnd"/>
+      <w:r>
+        <w:t xml:space="preserve"> recibe por </w:t>
+      </w:r>
+      <w:proofErr w:type="spellStart"/>
+      <w:r>
+        <w:t>props</w:t>
+      </w:r>
+      <w:proofErr w:type="spellEnd"/>
+      <w:r>
+        <w:t xml:space="preserve"> la excursión filtrada según ese id y muestra su información.</w:t>
       </w:r>
     </w:p>
     <w:p>
@@ -228,7 +525,39 @@
           <w:rFonts w:eastAsia="Times New Roman" w:cstheme="minorHAnsi"/>
           <w:lang w:eastAsia="es-ES"/>
         </w:rPr>
-        <w:t>La excursión seleccionada se obtiene mediante el método filter de JavaScript aplicado al array this.state.excursiones.</w:t>
+        <w:t xml:space="preserve">La excursión seleccionada se obtiene mediante el método </w:t>
+      </w:r>
+      <w:proofErr w:type="spellStart"/>
+      <w:r>
+        <w:rPr>
+          <w:rFonts w:eastAsia="Times New Roman" w:cstheme="minorHAnsi"/>
+          <w:lang w:eastAsia="es-ES"/>
+        </w:rPr>
+        <w:t>filter</w:t>
+      </w:r>
+      <w:proofErr w:type="spellEnd"/>
+      <w:r>
+        <w:rPr>
+          <w:rFonts w:eastAsia="Times New Roman" w:cstheme="minorHAnsi"/>
+          <w:lang w:eastAsia="es-ES"/>
+        </w:rPr>
+        <w:t xml:space="preserve"> de JavaScript aplicado al array </w:t>
+      </w:r>
+      <w:proofErr w:type="spellStart"/>
+      <w:r>
+        <w:rPr>
+          <w:rFonts w:eastAsia="Times New Roman" w:cstheme="minorHAnsi"/>
+          <w:lang w:eastAsia="es-ES"/>
+        </w:rPr>
+        <w:t>this.state.excursiones</w:t>
+      </w:r>
+      <w:proofErr w:type="spellEnd"/>
+      <w:r>
+        <w:rPr>
+          <w:rFonts w:eastAsia="Times New Roman" w:cstheme="minorHAnsi"/>
+          <w:lang w:eastAsia="es-ES"/>
+        </w:rPr>
+        <w:t>.</w:t>
       </w:r>
     </w:p>
     <w:p>
@@ -245,7 +574,39 @@
           <w:rFonts w:eastAsia="Times New Roman" w:cstheme="minorHAnsi"/>
           <w:lang w:eastAsia="es-ES"/>
         </w:rPr>
-        <w:t>Este filtro recorre todas las excursiones y devuelve solo aquellas cuyo id coincide con seleccionExcursion. Como filter devuelve un array, se accede al primer elemento con [0] para obtener directamente el objeto de la excursión.</w:t>
+        <w:t xml:space="preserve">Este filtro recorre todas las excursiones y devuelve solo aquellas cuyo id coincide con </w:t>
+      </w:r>
+      <w:proofErr w:type="spellStart"/>
+      <w:r>
+        <w:rPr>
+          <w:rFonts w:eastAsia="Times New Roman" w:cstheme="minorHAnsi"/>
+          <w:lang w:eastAsia="es-ES"/>
+        </w:rPr>
+        <w:t>seleccionExcursion</w:t>
+      </w:r>
+      <w:proofErr w:type="spellEnd"/>
+      <w:r>
+        <w:rPr>
+          <w:rFonts w:eastAsia="Times New Roman" w:cstheme="minorHAnsi"/>
+          <w:lang w:eastAsia="es-ES"/>
+        </w:rPr>
+        <w:t xml:space="preserve">. Como </w:t>
+      </w:r>
+      <w:proofErr w:type="spellStart"/>
+      <w:r>
+        <w:rPr>
+          <w:rFonts w:eastAsia="Times New Roman" w:cstheme="minorHAnsi"/>
+          <w:lang w:eastAsia="es-ES"/>
+        </w:rPr>
+        <w:t>filter</w:t>
+      </w:r>
+      <w:proofErr w:type="spellEnd"/>
+      <w:r>
+        <w:rPr>
+          <w:rFonts w:eastAsia="Times New Roman" w:cstheme="minorHAnsi"/>
+          <w:lang w:eastAsia="es-ES"/>
+        </w:rPr>
+        <w:t xml:space="preserve"> devuelve un array, se accede al primer elemento con [0] para obtener directamente el objeto de la excursión.</w:t>
       </w:r>
     </w:p>
     <w:p>
@@ -262,7 +623,23 @@
           <w:rFonts w:eastAsia="Times New Roman" w:cstheme="minorHAnsi"/>
           <w:lang w:eastAsia="es-ES"/>
         </w:rPr>
-        <w:t>Se definen dos funciones onPress con usos diferentes:</w:t>
+        <w:t xml:space="preserve">Se definen dos funciones </w:t>
+      </w:r>
+      <w:proofErr w:type="spellStart"/>
+      <w:r>
+        <w:rPr>
+          <w:rFonts w:eastAsia="Times New Roman" w:cstheme="minorHAnsi"/>
+          <w:lang w:eastAsia="es-ES"/>
+        </w:rPr>
+        <w:t>onPress</w:t>
+      </w:r>
+      <w:proofErr w:type="spellEnd"/>
+      <w:r>
+        <w:rPr>
+          <w:rFonts w:eastAsia="Times New Roman" w:cstheme="minorHAnsi"/>
+          <w:lang w:eastAsia="es-ES"/>
+        </w:rPr>
+        <w:t xml:space="preserve"> con usos diferentes:</w:t>
       </w:r>
     </w:p>
     <w:p>
@@ -279,12 +656,69 @@
           <w:lang w:eastAsia="es-ES"/>
         </w:rPr>
       </w:pPr>
+      <w:proofErr w:type="spellStart"/>
       <w:r>
         <w:rPr>
           <w:rFonts w:eastAsia="Times New Roman" w:cstheme="minorHAnsi"/>
           <w:lang w:eastAsia="es-ES"/>
         </w:rPr>
-        <w:t xml:space="preserve">onPress de List.Item: es una prop ya definida por React Native Paper, que se ejecuta automáticamente cuando el usuario pulsa el elemento. </w:t>
+        <w:t>onPress</w:t>
+      </w:r>
+      <w:proofErr w:type="spellEnd"/>
+      <w:r>
+        <w:rPr>
+          <w:rFonts w:eastAsia="Times New Roman" w:cstheme="minorHAnsi"/>
+          <w:lang w:eastAsia="es-ES"/>
+        </w:rPr>
+        <w:t xml:space="preserve"> de </w:t>
+      </w:r>
+      <w:proofErr w:type="spellStart"/>
+      <w:r>
+        <w:rPr>
+          <w:rFonts w:eastAsia="Times New Roman" w:cstheme="minorHAnsi"/>
+          <w:lang w:eastAsia="es-ES"/>
+        </w:rPr>
+        <w:t>List.Item</w:t>
+      </w:r>
+      <w:proofErr w:type="spellEnd"/>
+      <w:r>
+        <w:rPr>
+          <w:rFonts w:eastAsia="Times New Roman" w:cstheme="minorHAnsi"/>
+          <w:lang w:eastAsia="es-ES"/>
+        </w:rPr>
+        <w:t xml:space="preserve">: es una </w:t>
+      </w:r>
+      <w:proofErr w:type="spellStart"/>
+      <w:r>
+        <w:rPr>
+          <w:rFonts w:eastAsia="Times New Roman" w:cstheme="minorHAnsi"/>
+          <w:lang w:eastAsia="es-ES"/>
+        </w:rPr>
+        <w:t>prop</w:t>
+      </w:r>
+      <w:proofErr w:type="spellEnd"/>
+      <w:r>
+        <w:rPr>
+          <w:rFonts w:eastAsia="Times New Roman" w:cstheme="minorHAnsi"/>
+          <w:lang w:eastAsia="es-ES"/>
+        </w:rPr>
+        <w:t xml:space="preserve"> ya definida por </w:t>
+      </w:r>
+      <w:proofErr w:type="spellStart"/>
+      <w:r>
+        <w:rPr>
+          <w:rFonts w:eastAsia="Times New Roman" w:cstheme="minorHAnsi"/>
+          <w:lang w:eastAsia="es-ES"/>
+        </w:rPr>
+        <w:t>React</w:t>
+      </w:r>
+      <w:proofErr w:type="spellEnd"/>
+      <w:r>
+        <w:rPr>
+          <w:rFonts w:eastAsia="Times New Roman" w:cstheme="minorHAnsi"/>
+          <w:lang w:eastAsia="es-ES"/>
+        </w:rPr>
+        <w:t xml:space="preserve"> Native Paper, que se ejecuta automáticamente cuando el usuario pulsa el elemento. </w:t>
       </w:r>
     </w:p>
     <w:p>
@@ -301,12 +735,53 @@
           <w:lang w:eastAsia="es-ES"/>
         </w:rPr>
       </w:pPr>
+      <w:proofErr w:type="spellStart"/>
       <w:r>
         <w:rPr>
           <w:rFonts w:eastAsia="Times New Roman" w:cstheme="minorHAnsi"/>
           <w:lang w:eastAsia="es-ES"/>
         </w:rPr>
-        <w:t>onPress del componente Calendario: es una función personalizada (prop) que tú defines y pasas desde el componente padre (Campobase). Su nombre es arbitrario.</w:t>
+        <w:t>onPress</w:t>
+      </w:r>
+      <w:proofErr w:type="spellEnd"/>
+      <w:r>
+        <w:rPr>
+          <w:rFonts w:eastAsia="Times New Roman" w:cstheme="minorHAnsi"/>
+          <w:lang w:eastAsia="es-ES"/>
+        </w:rPr>
+        <w:t xml:space="preserve"> del componente Calendario: es una función personalizada (</w:t>
+      </w:r>
+      <w:proofErr w:type="spellStart"/>
+      <w:r>
+        <w:rPr>
+          <w:rFonts w:eastAsia="Times New Roman" w:cstheme="minorHAnsi"/>
+          <w:lang w:eastAsia="es-ES"/>
+        </w:rPr>
+        <w:t>prop</w:t>
+      </w:r>
+      <w:proofErr w:type="spellEnd"/>
+      <w:r>
+        <w:rPr>
+          <w:rFonts w:eastAsia="Times New Roman" w:cstheme="minorHAnsi"/>
+          <w:lang w:eastAsia="es-ES"/>
+        </w:rPr>
+        <w:t>) que tú defines y pasas desde el componente padre (</w:t>
+      </w:r>
+      <w:proofErr w:type="spellStart"/>
+      <w:r>
+        <w:rPr>
+          <w:rFonts w:eastAsia="Times New Roman" w:cstheme="minorHAnsi"/>
+          <w:lang w:eastAsia="es-ES"/>
+        </w:rPr>
+        <w:t>Campobase</w:t>
+      </w:r>
+      <w:proofErr w:type="spellEnd"/>
+      <w:r>
+        <w:rPr>
+          <w:rFonts w:eastAsia="Times New Roman" w:cstheme="minorHAnsi"/>
+          <w:lang w:eastAsia="es-ES"/>
+        </w:rPr>
+        <w:t>). Su nombre es arbitrario.</w:t>
       </w:r>
     </w:p>
     <w:p>
@@ -317,47 +792,114 @@
           <w:lang w:eastAsia="es-ES"/>
         </w:rPr>
       </w:pPr>
+      <w:proofErr w:type="spellStart"/>
       <w:r>
         <w:rPr>
           <w:rFonts w:eastAsia="Times New Roman"/>
           <w:lang w:eastAsia="es-ES"/>
         </w:rPr>
-        <w:t>Commit 04: “Stack Navigation”</w:t>
-      </w:r>
-    </w:p>
-    <w:p>
-      <w:pPr>
-        <w:rPr>
-          <w:lang w:eastAsia="es-ES"/>
-        </w:rPr>
-      </w:pPr>
-    </w:p>
-    <w:p>
-      <w:pPr>
-        <w:jc w:val="both"/>
-        <w:rPr>
-          <w:lang w:eastAsia="es-ES"/>
-        </w:rPr>
-      </w:pPr>
-      <w:r>
-        <w:rPr>
-          <w:lang w:eastAsia="es-ES"/>
-        </w:rPr>
-        <w:t>En este commit se han modificado los archivos que veníamos trabajando, como son campobasecomponent, el calendario y el componente que detalla las excursiones. El objetivo es crear una pila de navegación que permita a la aplicación “superponer” diferentes pantallas.</w:t>
-      </w:r>
-    </w:p>
-    <w:p>
-      <w:pPr>
-        <w:jc w:val="both"/>
-        <w:rPr>
-          <w:lang w:eastAsia="es-ES"/>
-        </w:rPr>
-      </w:pPr>
-      <w:r>
-        <w:rPr>
-          <w:lang w:eastAsia="es-ES"/>
-        </w:rPr>
-        <w:t>En el archivo campobase se crea el navegador tipo pila, concretamente en la línea:</w:t>
+        <w:t>Commit</w:t>
+      </w:r>
+      <w:proofErr w:type="spellEnd"/>
+      <w:r>
+        <w:rPr>
+          <w:rFonts w:eastAsia="Times New Roman"/>
+          <w:lang w:eastAsia="es-ES"/>
+        </w:rPr>
+        <w:t xml:space="preserve"> 04: “Stack </w:t>
+      </w:r>
+      <w:proofErr w:type="spellStart"/>
+      <w:r>
+        <w:rPr>
+          <w:rFonts w:eastAsia="Times New Roman"/>
+          <w:lang w:eastAsia="es-ES"/>
+        </w:rPr>
+        <w:t>Navigation</w:t>
+      </w:r>
+      <w:proofErr w:type="spellEnd"/>
+      <w:r>
+        <w:rPr>
+          <w:rFonts w:eastAsia="Times New Roman"/>
+          <w:lang w:eastAsia="es-ES"/>
+        </w:rPr>
+        <w:t>”</w:t>
+      </w:r>
+    </w:p>
+    <w:p>
+      <w:pPr>
+        <w:rPr>
+          <w:lang w:eastAsia="es-ES"/>
+        </w:rPr>
+      </w:pPr>
+    </w:p>
+    <w:p>
+      <w:pPr>
+        <w:jc w:val="both"/>
+        <w:rPr>
+          <w:lang w:eastAsia="es-ES"/>
+        </w:rPr>
+      </w:pPr>
+      <w:r>
+        <w:rPr>
+          <w:lang w:eastAsia="es-ES"/>
+        </w:rPr>
+        <w:t xml:space="preserve">En este </w:t>
+      </w:r>
+      <w:proofErr w:type="spellStart"/>
+      <w:r>
+        <w:rPr>
+          <w:lang w:eastAsia="es-ES"/>
+        </w:rPr>
+        <w:t>commit</w:t>
+      </w:r>
+      <w:proofErr w:type="spellEnd"/>
+      <w:r>
+        <w:rPr>
+          <w:lang w:eastAsia="es-ES"/>
+        </w:rPr>
+        <w:t xml:space="preserve"> se han modificado los archivos que veníamos trabajando, como son </w:t>
+      </w:r>
+      <w:proofErr w:type="spellStart"/>
+      <w:r>
+        <w:rPr>
+          <w:lang w:eastAsia="es-ES"/>
+        </w:rPr>
+        <w:t>campobasecomponent</w:t>
+      </w:r>
+      <w:proofErr w:type="spellEnd"/>
+      <w:r>
+        <w:rPr>
+          <w:lang w:eastAsia="es-ES"/>
+        </w:rPr>
+        <w:t>, el calendario y el componente que detalla las excursiones. El objetivo es crear una pila de navegación que permita a la aplicación “superponer” diferentes pantallas.</w:t>
+      </w:r>
+    </w:p>
+    <w:p>
+      <w:pPr>
+        <w:jc w:val="both"/>
+        <w:rPr>
+          <w:lang w:eastAsia="es-ES"/>
+        </w:rPr>
+      </w:pPr>
+      <w:r>
+        <w:rPr>
+          <w:lang w:eastAsia="es-ES"/>
+        </w:rPr>
+        <w:t xml:space="preserve">En el archivo </w:t>
+      </w:r>
+      <w:proofErr w:type="spellStart"/>
+      <w:r>
+        <w:rPr>
+          <w:lang w:eastAsia="es-ES"/>
+        </w:rPr>
+        <w:t>campobase</w:t>
+      </w:r>
+      <w:proofErr w:type="spellEnd"/>
+      <w:r>
+        <w:rPr>
+          <w:lang w:eastAsia="es-ES"/>
+        </w:rPr>
+        <w:t xml:space="preserve"> se crea el navegador tipo pila, concretamente en la línea:</w:t>
       </w:r>
       <w:r>
         <w:rPr>
@@ -445,7 +987,21 @@
           <w:lang w:eastAsia="es-ES"/>
         </w:rPr>
         <w:lastRenderedPageBreak/>
-        <w:t xml:space="preserve">Para entender lo que se esta haciendo se plantean </w:t>
+        <w:t xml:space="preserve">Para entender lo que se </w:t>
+      </w:r>
+      <w:proofErr w:type="spellStart"/>
+      <w:r>
+        <w:rPr>
+          <w:lang w:eastAsia="es-ES"/>
+        </w:rPr>
+        <w:t>esta</w:t>
+      </w:r>
+      <w:proofErr w:type="spellEnd"/>
+      <w:r>
+        <w:rPr>
+          <w:lang w:eastAsia="es-ES"/>
+        </w:rPr>
+        <w:t xml:space="preserve"> haciendo se plantean </w:t>
       </w:r>
       <w:r>
         <w:rPr>
@@ -487,59 +1043,259 @@
           <w:bCs/>
           <w:lang w:eastAsia="es-ES"/>
         </w:rPr>
-        <w:t>Comprender la forma en que se crea un menú de navegación en stack mediante el componente createNativeStackNavigator. o ¿Qué es el NavigationContainer? o ¿Qué son las Screens?</w:t>
-      </w:r>
-    </w:p>
-    <w:p>
-      <w:pPr>
-        <w:jc w:val="both"/>
+        <w:t xml:space="preserve">Comprender la forma en que se crea un menú de navegación en </w:t>
+      </w:r>
+      <w:proofErr w:type="spellStart"/>
+      <w:r>
         <w:rPr>
           <w:b/>
           <w:bCs/>
           <w:lang w:eastAsia="es-ES"/>
         </w:rPr>
-      </w:pPr>
+        <w:t>stack</w:t>
+      </w:r>
+      <w:proofErr w:type="spellEnd"/>
       <w:r>
         <w:rPr>
           <w:b/>
           <w:bCs/>
           <w:lang w:eastAsia="es-ES"/>
         </w:rPr>
-        <w:t>Analizar la manera en que Calendario envía un parámetro a DetalleExcursion y la forma en que este componente es capaz de obtenerlo y hacer uso de él. En concreto, analizar cómo cada Screen recibe la propiedad route. Calendario navega hacia DetalleExcursion enviando el identificador de la excursión en route.params, y la pantalla de detalle recupera dicho identificador para localizar la excursión correspondiente..</w:t>
-      </w:r>
-    </w:p>
-    <w:p>
-      <w:pPr>
-        <w:jc w:val="both"/>
-        <w:rPr>
-          <w:lang w:eastAsia="es-ES"/>
-        </w:rPr>
-      </w:pPr>
-      <w:r>
-        <w:rPr>
-          <w:lang w:eastAsia="es-ES"/>
-        </w:rPr>
-        <w:t xml:space="preserve">El NavigationContainer gestiona el estado de la navegación, es el componente principal que permite el cambio entre pantallas. Es esencial envolver todo el código en este contenedor para que funcione correctamente. </w:t>
-      </w:r>
-    </w:p>
-    <w:p>
-      <w:pPr>
-        <w:jc w:val="both"/>
-        <w:rPr>
-          <w:lang w:eastAsia="es-ES"/>
-        </w:rPr>
-      </w:pPr>
-      <w:r>
-        <w:rPr>
-          <w:lang w:eastAsia="es-ES"/>
-        </w:rPr>
-        <w:t xml:space="preserve">En el interior de este componente se encuentran las screens, </w:t>
-      </w:r>
-      <w:r>
-        <w:rPr>
-          <w:lang w:eastAsia="es-ES"/>
-        </w:rPr>
-        <w:t>cada una constituye una pantalla dentro de la aplicación.  En nuestro caso tenemos dos, una llamada calendario, que muestra la lista de excursiones disponibles, y cuando se le da click a una de ellas se abre la llamada detalle excursión, que muestra los detalles de la excursión que se ha pulsado. Esta información se recoge en la siguiente línea, presente en calendariocomponent:</w:t>
+        <w:t xml:space="preserve"> mediante el componente </w:t>
+      </w:r>
+      <w:proofErr w:type="spellStart"/>
+      <w:r>
+        <w:rPr>
+          <w:b/>
+          <w:bCs/>
+          <w:lang w:eastAsia="es-ES"/>
+        </w:rPr>
+        <w:t>createNativeStackNavigator</w:t>
+      </w:r>
+      <w:proofErr w:type="spellEnd"/>
+      <w:r>
+        <w:rPr>
+          <w:b/>
+          <w:bCs/>
+          <w:lang w:eastAsia="es-ES"/>
+        </w:rPr>
+        <w:t xml:space="preserve">. o ¿Qué es el </w:t>
+      </w:r>
+      <w:proofErr w:type="spellStart"/>
+      <w:r>
+        <w:rPr>
+          <w:b/>
+          <w:bCs/>
+          <w:lang w:eastAsia="es-ES"/>
+        </w:rPr>
+        <w:t>NavigationContainer</w:t>
+      </w:r>
+      <w:proofErr w:type="spellEnd"/>
+      <w:r>
+        <w:rPr>
+          <w:b/>
+          <w:bCs/>
+          <w:lang w:eastAsia="es-ES"/>
+        </w:rPr>
+        <w:t xml:space="preserve">? o ¿Qué son las </w:t>
+      </w:r>
+      <w:proofErr w:type="spellStart"/>
+      <w:r>
+        <w:rPr>
+          <w:b/>
+          <w:bCs/>
+          <w:lang w:eastAsia="es-ES"/>
+        </w:rPr>
+        <w:t>Screens</w:t>
+      </w:r>
+      <w:proofErr w:type="spellEnd"/>
+      <w:r>
+        <w:rPr>
+          <w:b/>
+          <w:bCs/>
+          <w:lang w:eastAsia="es-ES"/>
+        </w:rPr>
+        <w:t>?</w:t>
+      </w:r>
+    </w:p>
+    <w:p>
+      <w:pPr>
+        <w:jc w:val="both"/>
+        <w:rPr>
+          <w:b/>
+          <w:bCs/>
+          <w:lang w:eastAsia="es-ES"/>
+        </w:rPr>
+      </w:pPr>
+      <w:r>
+        <w:rPr>
+          <w:b/>
+          <w:bCs/>
+          <w:lang w:eastAsia="es-ES"/>
+        </w:rPr>
+        <w:t xml:space="preserve">Analizar la manera en que Calendario envía un parámetro a </w:t>
+      </w:r>
+      <w:proofErr w:type="spellStart"/>
+      <w:r>
+        <w:rPr>
+          <w:b/>
+          <w:bCs/>
+          <w:lang w:eastAsia="es-ES"/>
+        </w:rPr>
+        <w:t>DetalleExcursion</w:t>
+      </w:r>
+      <w:proofErr w:type="spellEnd"/>
+      <w:r>
+        <w:rPr>
+          <w:b/>
+          <w:bCs/>
+          <w:lang w:eastAsia="es-ES"/>
+        </w:rPr>
+        <w:t xml:space="preserve"> y la forma en que este componente es capaz de obtenerlo y hacer uso de él. En concreto, analizar cómo cada Screen recibe la propiedad </w:t>
+      </w:r>
+      <w:proofErr w:type="spellStart"/>
+      <w:r>
+        <w:rPr>
+          <w:b/>
+          <w:bCs/>
+          <w:lang w:eastAsia="es-ES"/>
+        </w:rPr>
+        <w:t>route</w:t>
+      </w:r>
+      <w:proofErr w:type="spellEnd"/>
+      <w:r>
+        <w:rPr>
+          <w:b/>
+          <w:bCs/>
+          <w:lang w:eastAsia="es-ES"/>
+        </w:rPr>
+        <w:t xml:space="preserve">. Calendario navega hacia </w:t>
+      </w:r>
+      <w:proofErr w:type="spellStart"/>
+      <w:r>
+        <w:rPr>
+          <w:b/>
+          <w:bCs/>
+          <w:lang w:eastAsia="es-ES"/>
+        </w:rPr>
+        <w:t>DetalleExcursion</w:t>
+      </w:r>
+      <w:proofErr w:type="spellEnd"/>
+      <w:r>
+        <w:rPr>
+          <w:b/>
+          <w:bCs/>
+          <w:lang w:eastAsia="es-ES"/>
+        </w:rPr>
+        <w:t xml:space="preserve"> enviando el identificador de la excursión en </w:t>
+      </w:r>
+      <w:proofErr w:type="spellStart"/>
+      <w:r>
+        <w:rPr>
+          <w:b/>
+          <w:bCs/>
+          <w:lang w:eastAsia="es-ES"/>
+        </w:rPr>
+        <w:t>route.params</w:t>
+      </w:r>
+      <w:proofErr w:type="spellEnd"/>
+      <w:r>
+        <w:rPr>
+          <w:b/>
+          <w:bCs/>
+          <w:lang w:eastAsia="es-ES"/>
+        </w:rPr>
+        <w:t>, y la pantalla de detalle recupera dicho identificador para localizar la excursión correspondiente..</w:t>
+      </w:r>
+    </w:p>
+    <w:p>
+      <w:pPr>
+        <w:jc w:val="both"/>
+        <w:rPr>
+          <w:lang w:eastAsia="es-ES"/>
+        </w:rPr>
+      </w:pPr>
+      <w:r>
+        <w:rPr>
+          <w:lang w:eastAsia="es-ES"/>
+        </w:rPr>
+        <w:t xml:space="preserve">El </w:t>
+      </w:r>
+      <w:proofErr w:type="spellStart"/>
+      <w:r>
+        <w:rPr>
+          <w:lang w:eastAsia="es-ES"/>
+        </w:rPr>
+        <w:t>NavigationContainer</w:t>
+      </w:r>
+      <w:proofErr w:type="spellEnd"/>
+      <w:r>
+        <w:rPr>
+          <w:lang w:eastAsia="es-ES"/>
+        </w:rPr>
+        <w:t xml:space="preserve"> gestiona el estado de la navegación, es el componente principal que permite el cambio entre pantallas. Es esencial envolver todo el código en este contenedor para que funcione correctamente. </w:t>
+      </w:r>
+    </w:p>
+    <w:p>
+      <w:pPr>
+        <w:jc w:val="both"/>
+        <w:rPr>
+          <w:lang w:eastAsia="es-ES"/>
+        </w:rPr>
+      </w:pPr>
+      <w:r>
+        <w:rPr>
+          <w:lang w:eastAsia="es-ES"/>
+        </w:rPr>
+        <w:t xml:space="preserve">En el interior de este componente se encuentran las </w:t>
+      </w:r>
+      <w:proofErr w:type="spellStart"/>
+      <w:r>
+        <w:rPr>
+          <w:lang w:eastAsia="es-ES"/>
+        </w:rPr>
+        <w:t>screens</w:t>
+      </w:r>
+      <w:proofErr w:type="spellEnd"/>
+      <w:r>
+        <w:rPr>
+          <w:lang w:eastAsia="es-ES"/>
+        </w:rPr>
+        <w:t xml:space="preserve">, </w:t>
+      </w:r>
+      <w:r>
+        <w:rPr>
+          <w:lang w:eastAsia="es-ES"/>
+        </w:rPr>
+        <w:t xml:space="preserve">cada una constituye una pantalla dentro de la aplicación.  En nuestro caso tenemos dos, una llamada calendario, que muestra la lista de excursiones disponibles, y cuando se le da </w:t>
+      </w:r>
+      <w:proofErr w:type="spellStart"/>
+      <w:r>
+        <w:rPr>
+          <w:lang w:eastAsia="es-ES"/>
+        </w:rPr>
+        <w:t>click</w:t>
+      </w:r>
+      <w:proofErr w:type="spellEnd"/>
+      <w:r>
+        <w:rPr>
+          <w:lang w:eastAsia="es-ES"/>
+        </w:rPr>
+        <w:t xml:space="preserve"> a una de ellas se abre la llamada detalle excursión, que muestra los detalles de la excursión que se ha pulsado. Esta información se recoge en la siguiente línea, presente en </w:t>
+      </w:r>
+      <w:proofErr w:type="spellStart"/>
+      <w:r>
+        <w:rPr>
+          <w:lang w:eastAsia="es-ES"/>
+        </w:rPr>
+        <w:t>calendariocomponent</w:t>
+      </w:r>
+      <w:proofErr w:type="spellEnd"/>
+      <w:r>
+        <w:rPr>
+          <w:lang w:eastAsia="es-ES"/>
+        </w:rPr>
+        <w:t>:</w:t>
       </w:r>
     </w:p>
     <w:p>
@@ -602,7 +1358,21 @@
         <w:rPr>
           <w:lang w:eastAsia="es-ES"/>
         </w:rPr>
-        <w:t>Este id se recoge en DetalleExcursionComponent mediante:</w:t>
+        <w:t xml:space="preserve">Este id se recoge en </w:t>
+      </w:r>
+      <w:proofErr w:type="spellStart"/>
+      <w:r>
+        <w:rPr>
+          <w:lang w:eastAsia="es-ES"/>
+        </w:rPr>
+        <w:t>DetalleExcursionComponent</w:t>
+      </w:r>
+      <w:proofErr w:type="spellEnd"/>
+      <w:r>
+        <w:rPr>
+          <w:lang w:eastAsia="es-ES"/>
+        </w:rPr>
+        <w:t xml:space="preserve"> mediante:</w:t>
       </w:r>
     </w:p>
     <w:p>
@@ -665,7 +1435,21 @@
         <w:rPr>
           <w:lang w:eastAsia="es-ES"/>
         </w:rPr>
-        <w:t>Route params contiene los datos enviados de la navegación.</w:t>
+        <w:t xml:space="preserve">Route </w:t>
+      </w:r>
+      <w:proofErr w:type="spellStart"/>
+      <w:r>
+        <w:rPr>
+          <w:lang w:eastAsia="es-ES"/>
+        </w:rPr>
+        <w:t>params</w:t>
+      </w:r>
+      <w:proofErr w:type="spellEnd"/>
+      <w:r>
+        <w:rPr>
+          <w:lang w:eastAsia="es-ES"/>
+        </w:rPr>
+        <w:t xml:space="preserve"> contiene los datos enviados de la navegación.</w:t>
       </w:r>
       <w:r>
         <w:rPr>
@@ -685,7 +1469,21 @@
         <w:rPr>
           <w:lang w:eastAsia="es-ES"/>
         </w:rPr>
-        <w:t>El excursiónid recibido se convierte a número, mediante el que se accede al array de excursiones y se le pasa ese índice al componente que renderiza la pantalla.</w:t>
+        <w:t xml:space="preserve">El </w:t>
+      </w:r>
+      <w:proofErr w:type="spellStart"/>
+      <w:r>
+        <w:rPr>
+          <w:lang w:eastAsia="es-ES"/>
+        </w:rPr>
+        <w:t>excursiónid</w:t>
+      </w:r>
+      <w:proofErr w:type="spellEnd"/>
+      <w:r>
+        <w:rPr>
+          <w:lang w:eastAsia="es-ES"/>
+        </w:rPr>
+        <w:t xml:space="preserve"> recibido se convierte a número, mediante el que se accede al array de excursiones y se le pasa ese índice al componente que renderiza la pantalla.</w:t>
       </w:r>
     </w:p>
     <w:p>
@@ -695,58 +1493,214 @@
           <w:lang w:eastAsia="es-ES"/>
         </w:rPr>
       </w:pPr>
-      <w:r>
-        <w:rPr>
-          <w:lang w:eastAsia="es-ES"/>
-        </w:rPr>
-        <w:t>Commit 05: “Drawer Navigation”</w:t>
-      </w:r>
-    </w:p>
-    <w:p>
-      <w:pPr>
-        <w:rPr>
-          <w:lang w:eastAsia="es-ES"/>
-        </w:rPr>
-      </w:pPr>
-    </w:p>
-    <w:p>
-      <w:pPr>
-        <w:jc w:val="both"/>
-        <w:rPr>
-          <w:lang w:eastAsia="es-ES"/>
-        </w:rPr>
-      </w:pPr>
-      <w:r>
-        <w:rPr>
-          <w:lang w:eastAsia="es-ES"/>
-        </w:rPr>
-        <w:t>En este commit se va a implementar una barra lateral en la aplicación que cambie entre vistas, una de ellas la que teníamos implementada hasta el commit anterior, llamada Calendario Gaztaroa, que muestra una lista de los eventos disponibles en la que puedes clickar para mostrar más información, la otra llamada Campo Base con una lista de paneles informativos con una imagen.</w:t>
-      </w:r>
-    </w:p>
-    <w:p>
-      <w:pPr>
-        <w:jc w:val="both"/>
-        <w:rPr>
-          <w:lang w:eastAsia="es-ES"/>
-        </w:rPr>
-      </w:pPr>
-      <w:r>
-        <w:rPr>
-          <w:lang w:eastAsia="es-ES"/>
-        </w:rPr>
-        <w:t>Se han añadido tres ficheros, dos de ellos contienen jsons informativos referentes a actividades y cabeceras. El otro es un fichero que contiene un nuevo componente</w:t>
-      </w:r>
-      <w:r>
-        <w:rPr>
-          <w:lang w:eastAsia="es-ES"/>
-        </w:rPr>
-        <w:t>, HomeComponent</w:t>
-      </w:r>
-      <w:r>
-        <w:rPr>
-          <w:lang w:eastAsia="es-ES"/>
-        </w:rPr>
-        <w:t>, que renderiza la interfaz según la información de los json. Se accede a el en Campo Base desde el Drawer.</w:t>
+      <w:proofErr w:type="spellStart"/>
+      <w:r>
+        <w:rPr>
+          <w:lang w:eastAsia="es-ES"/>
+        </w:rPr>
+        <w:t>Commit</w:t>
+      </w:r>
+      <w:proofErr w:type="spellEnd"/>
+      <w:r>
+        <w:rPr>
+          <w:lang w:eastAsia="es-ES"/>
+        </w:rPr>
+        <w:t xml:space="preserve"> 05: “</w:t>
+      </w:r>
+      <w:proofErr w:type="spellStart"/>
+      <w:r>
+        <w:rPr>
+          <w:lang w:eastAsia="es-ES"/>
+        </w:rPr>
+        <w:t>Drawer</w:t>
+      </w:r>
+      <w:proofErr w:type="spellEnd"/>
+      <w:r>
+        <w:rPr>
+          <w:lang w:eastAsia="es-ES"/>
+        </w:rPr>
+        <w:t xml:space="preserve"> </w:t>
+      </w:r>
+      <w:proofErr w:type="spellStart"/>
+      <w:r>
+        <w:rPr>
+          <w:lang w:eastAsia="es-ES"/>
+        </w:rPr>
+        <w:t>Navigation</w:t>
+      </w:r>
+      <w:proofErr w:type="spellEnd"/>
+      <w:r>
+        <w:rPr>
+          <w:lang w:eastAsia="es-ES"/>
+        </w:rPr>
+        <w:t>”</w:t>
+      </w:r>
+    </w:p>
+    <w:p>
+      <w:pPr>
+        <w:rPr>
+          <w:lang w:eastAsia="es-ES"/>
+        </w:rPr>
+      </w:pPr>
+    </w:p>
+    <w:p>
+      <w:pPr>
+        <w:jc w:val="both"/>
+        <w:rPr>
+          <w:lang w:eastAsia="es-ES"/>
+        </w:rPr>
+      </w:pPr>
+      <w:r>
+        <w:rPr>
+          <w:lang w:eastAsia="es-ES"/>
+        </w:rPr>
+        <w:t xml:space="preserve">En este </w:t>
+      </w:r>
+      <w:proofErr w:type="spellStart"/>
+      <w:r>
+        <w:rPr>
+          <w:lang w:eastAsia="es-ES"/>
+        </w:rPr>
+        <w:t>commit</w:t>
+      </w:r>
+      <w:proofErr w:type="spellEnd"/>
+      <w:r>
+        <w:rPr>
+          <w:lang w:eastAsia="es-ES"/>
+        </w:rPr>
+        <w:t xml:space="preserve"> se va a implementar una barra lateral en la aplicación que cambie entre vistas, una de ellas la que teníamos implementada hasta el </w:t>
+      </w:r>
+      <w:proofErr w:type="spellStart"/>
+      <w:r>
+        <w:rPr>
+          <w:lang w:eastAsia="es-ES"/>
+        </w:rPr>
+        <w:t>commit</w:t>
+      </w:r>
+      <w:proofErr w:type="spellEnd"/>
+      <w:r>
+        <w:rPr>
+          <w:lang w:eastAsia="es-ES"/>
+        </w:rPr>
+        <w:t xml:space="preserve"> anterior, llamada Calendario </w:t>
+      </w:r>
+      <w:proofErr w:type="spellStart"/>
+      <w:r>
+        <w:rPr>
+          <w:lang w:eastAsia="es-ES"/>
+        </w:rPr>
+        <w:t>Gaztaroa</w:t>
+      </w:r>
+      <w:proofErr w:type="spellEnd"/>
+      <w:r>
+        <w:rPr>
+          <w:lang w:eastAsia="es-ES"/>
+        </w:rPr>
+        <w:t xml:space="preserve">, que muestra una lista de los eventos disponibles en la que puedes </w:t>
+      </w:r>
+      <w:proofErr w:type="spellStart"/>
+      <w:r>
+        <w:rPr>
+          <w:lang w:eastAsia="es-ES"/>
+        </w:rPr>
+        <w:t>clickar</w:t>
+      </w:r>
+      <w:proofErr w:type="spellEnd"/>
+      <w:r>
+        <w:rPr>
+          <w:lang w:eastAsia="es-ES"/>
+        </w:rPr>
+        <w:t xml:space="preserve"> para mostrar más información, la otra llamada Campo Base con una lista de paneles informativos con una imagen.</w:t>
+      </w:r>
+    </w:p>
+    <w:p>
+      <w:pPr>
+        <w:jc w:val="both"/>
+        <w:rPr>
+          <w:lang w:eastAsia="es-ES"/>
+        </w:rPr>
+      </w:pPr>
+      <w:r>
+        <w:rPr>
+          <w:lang w:eastAsia="es-ES"/>
+        </w:rPr>
+        <w:t xml:space="preserve">Se han añadido tres ficheros, dos de ellos contienen </w:t>
+      </w:r>
+      <w:proofErr w:type="spellStart"/>
+      <w:r>
+        <w:rPr>
+          <w:lang w:eastAsia="es-ES"/>
+        </w:rPr>
+        <w:t>jsons</w:t>
+      </w:r>
+      <w:proofErr w:type="spellEnd"/>
+      <w:r>
+        <w:rPr>
+          <w:lang w:eastAsia="es-ES"/>
+        </w:rPr>
+        <w:t xml:space="preserve"> informativos referentes a actividades y cabeceras. El otro es un fichero que contiene un nuevo componente</w:t>
+      </w:r>
+      <w:r>
+        <w:rPr>
+          <w:lang w:eastAsia="es-ES"/>
+        </w:rPr>
+        <w:t xml:space="preserve">, </w:t>
+      </w:r>
+      <w:proofErr w:type="spellStart"/>
+      <w:r>
+        <w:rPr>
+          <w:lang w:eastAsia="es-ES"/>
+        </w:rPr>
+        <w:t>HomeComponent</w:t>
+      </w:r>
+      <w:proofErr w:type="spellEnd"/>
+      <w:r>
+        <w:rPr>
+          <w:lang w:eastAsia="es-ES"/>
+        </w:rPr>
+        <w:t xml:space="preserve">, que renderiza la interfaz según la información de los </w:t>
+      </w:r>
+      <w:proofErr w:type="spellStart"/>
+      <w:r>
+        <w:rPr>
+          <w:lang w:eastAsia="es-ES"/>
+        </w:rPr>
+        <w:t>json</w:t>
+      </w:r>
+      <w:proofErr w:type="spellEnd"/>
+      <w:r>
+        <w:rPr>
+          <w:lang w:eastAsia="es-ES"/>
+        </w:rPr>
+        <w:t xml:space="preserve">. Se accede a </w:t>
+      </w:r>
+      <w:proofErr w:type="spellStart"/>
+      <w:r>
+        <w:rPr>
+          <w:lang w:eastAsia="es-ES"/>
+        </w:rPr>
+        <w:t>el en</w:t>
+      </w:r>
+      <w:proofErr w:type="spellEnd"/>
+      <w:r>
+        <w:rPr>
+          <w:lang w:eastAsia="es-ES"/>
+        </w:rPr>
+        <w:t xml:space="preserve"> Campo Base desde el </w:t>
+      </w:r>
+      <w:proofErr w:type="spellStart"/>
+      <w:r>
+        <w:rPr>
+          <w:lang w:eastAsia="es-ES"/>
+        </w:rPr>
+        <w:t>Drawer</w:t>
+      </w:r>
+      <w:proofErr w:type="spellEnd"/>
+      <w:r>
+        <w:rPr>
+          <w:lang w:eastAsia="es-ES"/>
+        </w:rPr>
+        <w:t>.</w:t>
       </w:r>
     </w:p>
     <w:p>
@@ -770,7 +1724,61 @@
           <w:lang w:eastAsia="es-ES"/>
         </w:rPr>
         <w:lastRenderedPageBreak/>
-        <w:t>Dentro del NavigationContainer debe renderizarse un único árbol de navegación. Por ello, cuando necesitamos combinar varios navegadores, debemos anidarlos (nest navigators). Obsérvese en el código, y en la documentación señalada al final del ejercicio, la forma en que se resuelve esta cuestión.</w:t>
+        <w:t xml:space="preserve">Dentro del </w:t>
+      </w:r>
+      <w:proofErr w:type="spellStart"/>
+      <w:r>
+        <w:rPr>
+          <w:b/>
+          <w:bCs/>
+          <w:lang w:eastAsia="es-ES"/>
+        </w:rPr>
+        <w:t>NavigationContainer</w:t>
+      </w:r>
+      <w:proofErr w:type="spellEnd"/>
+      <w:r>
+        <w:rPr>
+          <w:b/>
+          <w:bCs/>
+          <w:lang w:eastAsia="es-ES"/>
+        </w:rPr>
+        <w:t xml:space="preserve"> debe renderizarse un único árbol de navegación. Por ello, cuando necesitamos combinar varios navegadores, debemos anidarlos (</w:t>
+      </w:r>
+      <w:proofErr w:type="spellStart"/>
+      <w:r>
+        <w:rPr>
+          <w:b/>
+          <w:bCs/>
+          <w:lang w:eastAsia="es-ES"/>
+        </w:rPr>
+        <w:t>nest</w:t>
+      </w:r>
+      <w:proofErr w:type="spellEnd"/>
+      <w:r>
+        <w:rPr>
+          <w:b/>
+          <w:bCs/>
+          <w:lang w:eastAsia="es-ES"/>
+        </w:rPr>
+        <w:t xml:space="preserve"> </w:t>
+      </w:r>
+      <w:proofErr w:type="spellStart"/>
+      <w:r>
+        <w:rPr>
+          <w:b/>
+          <w:bCs/>
+          <w:lang w:eastAsia="es-ES"/>
+        </w:rPr>
+        <w:t>navigators</w:t>
+      </w:r>
+      <w:proofErr w:type="spellEnd"/>
+      <w:r>
+        <w:rPr>
+          <w:b/>
+          <w:bCs/>
+          <w:lang w:eastAsia="es-ES"/>
+        </w:rPr>
+        <w:t>). Obsérvese en el código, y en la documentación señalada al final del ejercicio, la forma en que se resuelve esta cuestión.</w:t>
       </w:r>
     </w:p>
     <w:p>
@@ -793,7 +1801,43 @@
           <w:bCs/>
           <w:lang w:eastAsia="es-ES"/>
         </w:rPr>
-        <w:t xml:space="preserve">Nótese que hemos añadido un stack navigator para el componente Home que acabamos de crear. </w:t>
+        <w:t xml:space="preserve">Nótese que hemos añadido un </w:t>
+      </w:r>
+      <w:proofErr w:type="spellStart"/>
+      <w:r>
+        <w:rPr>
+          <w:b/>
+          <w:bCs/>
+          <w:lang w:eastAsia="es-ES"/>
+        </w:rPr>
+        <w:t>stack</w:t>
+      </w:r>
+      <w:proofErr w:type="spellEnd"/>
+      <w:r>
+        <w:rPr>
+          <w:b/>
+          <w:bCs/>
+          <w:lang w:eastAsia="es-ES"/>
+        </w:rPr>
+        <w:t xml:space="preserve"> </w:t>
+      </w:r>
+      <w:proofErr w:type="spellStart"/>
+      <w:r>
+        <w:rPr>
+          <w:b/>
+          <w:bCs/>
+          <w:lang w:eastAsia="es-ES"/>
+        </w:rPr>
+        <w:t>navigator</w:t>
+      </w:r>
+      <w:proofErr w:type="spellEnd"/>
+      <w:r>
+        <w:rPr>
+          <w:b/>
+          <w:bCs/>
+          <w:lang w:eastAsia="es-ES"/>
+        </w:rPr>
+        <w:t xml:space="preserve"> para el componente Home que acabamos de crear. </w:t>
       </w:r>
     </w:p>
     <w:p>
@@ -816,35 +1860,177 @@
           <w:bCs/>
           <w:lang w:eastAsia="es-ES"/>
         </w:rPr>
-        <w:t>En el Drawer.Navigator establecemos headerShown: false para evitar que el drawer genere una cabecera adicional, ya que la cabecera que queremos mostrar es la de cada Stack.Navigator interno.</w:t>
-      </w:r>
-    </w:p>
-    <w:p>
-      <w:pPr>
-        <w:jc w:val="both"/>
-        <w:rPr>
-          <w:lang w:eastAsia="es-ES"/>
-        </w:rPr>
-      </w:pPr>
-      <w:r>
-        <w:rPr>
-          <w:lang w:eastAsia="es-ES"/>
-        </w:rPr>
-        <w:t>Dentro del NavigationContainer existe un único árbol de navegación encargado de gestionar el estado de la navegación de la aplicación. Si se intentasen usar varios del mismo nivel simultáneamente se producirían conflictos en la gestión de las rutas. Es por eso que se anidan navegadores, Drawer actúa como principal y dentro de cada una de sus opciones se renderiza un Stack Navigator.</w:t>
-      </w:r>
-    </w:p>
-    <w:p>
-      <w:pPr>
-        <w:jc w:val="both"/>
-        <w:rPr>
-          <w:lang w:eastAsia="es-ES"/>
-        </w:rPr>
-      </w:pPr>
-      <w:r>
-        <w:rPr>
-          <w:lang w:eastAsia="es-ES"/>
-        </w:rPr>
-        <w:t xml:space="preserve">El componente home también contiene un stack navigator para mantener una estructura homogénea. De esta forma se mantiene la coherencia con el resto de las secciones y, aunque no hacemos uso de ella, se podría usar una sola cabecera gestionada automáticamente. También facilita la </w:t>
+        <w:t xml:space="preserve">En el </w:t>
+      </w:r>
+      <w:proofErr w:type="spellStart"/>
+      <w:r>
+        <w:rPr>
+          <w:b/>
+          <w:bCs/>
+          <w:lang w:eastAsia="es-ES"/>
+        </w:rPr>
+        <w:t>Drawer.Navigator</w:t>
+      </w:r>
+      <w:proofErr w:type="spellEnd"/>
+      <w:r>
+        <w:rPr>
+          <w:b/>
+          <w:bCs/>
+          <w:lang w:eastAsia="es-ES"/>
+        </w:rPr>
+        <w:t xml:space="preserve"> establecemos </w:t>
+      </w:r>
+      <w:proofErr w:type="spellStart"/>
+      <w:r>
+        <w:rPr>
+          <w:b/>
+          <w:bCs/>
+          <w:lang w:eastAsia="es-ES"/>
+        </w:rPr>
+        <w:t>headerShown</w:t>
+      </w:r>
+      <w:proofErr w:type="spellEnd"/>
+      <w:r>
+        <w:rPr>
+          <w:b/>
+          <w:bCs/>
+          <w:lang w:eastAsia="es-ES"/>
+        </w:rPr>
+        <w:t xml:space="preserve">: false para evitar que el </w:t>
+      </w:r>
+      <w:proofErr w:type="spellStart"/>
+      <w:r>
+        <w:rPr>
+          <w:b/>
+          <w:bCs/>
+          <w:lang w:eastAsia="es-ES"/>
+        </w:rPr>
+        <w:t>drawer</w:t>
+      </w:r>
+      <w:proofErr w:type="spellEnd"/>
+      <w:r>
+        <w:rPr>
+          <w:b/>
+          <w:bCs/>
+          <w:lang w:eastAsia="es-ES"/>
+        </w:rPr>
+        <w:t xml:space="preserve"> genere una cabecera adicional, ya que la cabecera que queremos mostrar es la de cada </w:t>
+      </w:r>
+      <w:proofErr w:type="spellStart"/>
+      <w:r>
+        <w:rPr>
+          <w:b/>
+          <w:bCs/>
+          <w:lang w:eastAsia="es-ES"/>
+        </w:rPr>
+        <w:t>Stack.Navigator</w:t>
+      </w:r>
+      <w:proofErr w:type="spellEnd"/>
+      <w:r>
+        <w:rPr>
+          <w:b/>
+          <w:bCs/>
+          <w:lang w:eastAsia="es-ES"/>
+        </w:rPr>
+        <w:t xml:space="preserve"> interno.</w:t>
+      </w:r>
+    </w:p>
+    <w:p>
+      <w:pPr>
+        <w:jc w:val="both"/>
+        <w:rPr>
+          <w:lang w:eastAsia="es-ES"/>
+        </w:rPr>
+      </w:pPr>
+      <w:r>
+        <w:rPr>
+          <w:lang w:eastAsia="es-ES"/>
+        </w:rPr>
+        <w:t xml:space="preserve">Dentro del </w:t>
+      </w:r>
+      <w:proofErr w:type="spellStart"/>
+      <w:r>
+        <w:rPr>
+          <w:lang w:eastAsia="es-ES"/>
+        </w:rPr>
+        <w:t>NavigationContainer</w:t>
+      </w:r>
+      <w:proofErr w:type="spellEnd"/>
+      <w:r>
+        <w:rPr>
+          <w:lang w:eastAsia="es-ES"/>
+        </w:rPr>
+        <w:t xml:space="preserve"> existe un único árbol de navegación encargado de gestionar el estado de la navegación de la aplicación. Si se intentasen usar varios del mismo nivel simultáneamente se producirían conflictos en la gestión de las rutas. Es por eso que se anidan navegadores, </w:t>
+      </w:r>
+      <w:proofErr w:type="spellStart"/>
+      <w:r>
+        <w:rPr>
+          <w:lang w:eastAsia="es-ES"/>
+        </w:rPr>
+        <w:t>Drawer</w:t>
+      </w:r>
+      <w:proofErr w:type="spellEnd"/>
+      <w:r>
+        <w:rPr>
+          <w:lang w:eastAsia="es-ES"/>
+        </w:rPr>
+        <w:t xml:space="preserve"> actúa como principal y dentro de cada una de sus opciones se renderiza un Stack </w:t>
+      </w:r>
+      <w:proofErr w:type="spellStart"/>
+      <w:r>
+        <w:rPr>
+          <w:lang w:eastAsia="es-ES"/>
+        </w:rPr>
+        <w:t>Navigator</w:t>
+      </w:r>
+      <w:proofErr w:type="spellEnd"/>
+      <w:r>
+        <w:rPr>
+          <w:lang w:eastAsia="es-ES"/>
+        </w:rPr>
+        <w:t>.</w:t>
+      </w:r>
+    </w:p>
+    <w:p>
+      <w:pPr>
+        <w:jc w:val="both"/>
+        <w:rPr>
+          <w:lang w:eastAsia="es-ES"/>
+        </w:rPr>
+      </w:pPr>
+      <w:r>
+        <w:rPr>
+          <w:lang w:eastAsia="es-ES"/>
+        </w:rPr>
+        <w:t xml:space="preserve">El componente home también contiene un </w:t>
+      </w:r>
+      <w:proofErr w:type="spellStart"/>
+      <w:r>
+        <w:rPr>
+          <w:lang w:eastAsia="es-ES"/>
+        </w:rPr>
+        <w:t>stack</w:t>
+      </w:r>
+      <w:proofErr w:type="spellEnd"/>
+      <w:r>
+        <w:rPr>
+          <w:lang w:eastAsia="es-ES"/>
+        </w:rPr>
+        <w:t xml:space="preserve"> </w:t>
+      </w:r>
+      <w:proofErr w:type="spellStart"/>
+      <w:r>
+        <w:rPr>
+          <w:lang w:eastAsia="es-ES"/>
+        </w:rPr>
+        <w:t>navigator</w:t>
+      </w:r>
+      <w:proofErr w:type="spellEnd"/>
+      <w:r>
+        <w:rPr>
+          <w:lang w:eastAsia="es-ES"/>
+        </w:rPr>
+        <w:t xml:space="preserve"> para mantener una estructura homogénea. De esta forma se mantiene la coherencia con el resto de las secciones y, aunque no hacemos uso de ella, se podría usar una sola cabecera gestionada automáticamente. También facilita la </w:t>
       </w:r>
       <w:r>
         <w:rPr>
@@ -860,12 +2046,56 @@
           <w:lang w:eastAsia="es-ES"/>
         </w:rPr>
       </w:pPr>
-      <w:r>
-        <w:rPr>
-          <w:lang w:eastAsia="es-ES"/>
-        </w:rPr>
-        <w:t>Drawer por defecto crea su propia cabecera. Si esta opción esta desactivada se mostrarían dos cabeceras distintas, una de drawer y otra de cada stack interno. Se opta por esconder la del drawer</w:t>
-      </w:r>
+      <w:proofErr w:type="spellStart"/>
+      <w:r>
+        <w:rPr>
+          <w:lang w:eastAsia="es-ES"/>
+        </w:rPr>
+        <w:t>Drawer</w:t>
+      </w:r>
+      <w:proofErr w:type="spellEnd"/>
+      <w:r>
+        <w:rPr>
+          <w:lang w:eastAsia="es-ES"/>
+        </w:rPr>
+        <w:t xml:space="preserve"> por defecto crea su propia cabecera. Si esta opción esta desactivada se mostrarían dos cabeceras distintas, una de </w:t>
+      </w:r>
+      <w:proofErr w:type="spellStart"/>
+      <w:r>
+        <w:rPr>
+          <w:lang w:eastAsia="es-ES"/>
+        </w:rPr>
+        <w:t>drawer</w:t>
+      </w:r>
+      <w:proofErr w:type="spellEnd"/>
+      <w:r>
+        <w:rPr>
+          <w:lang w:eastAsia="es-ES"/>
+        </w:rPr>
+        <w:t xml:space="preserve"> y otra de cada </w:t>
+      </w:r>
+      <w:proofErr w:type="spellStart"/>
+      <w:r>
+        <w:rPr>
+          <w:lang w:eastAsia="es-ES"/>
+        </w:rPr>
+        <w:t>stack</w:t>
+      </w:r>
+      <w:proofErr w:type="spellEnd"/>
+      <w:r>
+        <w:rPr>
+          <w:lang w:eastAsia="es-ES"/>
+        </w:rPr>
+        <w:t xml:space="preserve"> interno. Se opta por esconder la del </w:t>
+      </w:r>
+      <w:proofErr w:type="spellStart"/>
+      <w:r>
+        <w:rPr>
+          <w:lang w:eastAsia="es-ES"/>
+        </w:rPr>
+        <w:t>drawer</w:t>
+      </w:r>
+      <w:proofErr w:type="spellEnd"/>
     </w:p>
     <w:p>
       <w:pPr>
@@ -874,46 +2104,152 @@
           <w:lang w:eastAsia="es-ES"/>
         </w:rPr>
       </w:pPr>
-      <w:r>
-        <w:rPr>
-          <w:lang w:eastAsia="es-ES"/>
-        </w:rPr>
-        <w:t>Commit 06: “Ejercicio Componentes y Navegacion”</w:t>
-      </w:r>
-    </w:p>
-    <w:p>
-      <w:pPr>
-        <w:rPr>
-          <w:lang w:eastAsia="es-ES"/>
-        </w:rPr>
-      </w:pPr>
-    </w:p>
-    <w:p>
-      <w:pPr>
-        <w:jc w:val="both"/>
-        <w:rPr>
-          <w:lang w:eastAsia="es-ES"/>
-        </w:rPr>
-      </w:pPr>
-      <w:r>
-        <w:rPr>
-          <w:lang w:eastAsia="es-ES"/>
-        </w:rPr>
-        <w:t>El objetivo de esta práctica es añadir dos componentes más a la navegación desde cero, creando su estructura y añadiéndolos a la navegación que ya hemos implementado. Uno de los componentes muestra una página de contacto y la otra comenta la historia del club. Como punto adicional, se ha retocado un poco los estilos de la pagina principal que se hizo en la práctica anterior.</w:t>
-      </w:r>
-    </w:p>
-    <w:p>
-      <w:pPr>
-        <w:jc w:val="both"/>
-        <w:rPr>
-          <w:lang w:eastAsia="es-ES"/>
-        </w:rPr>
-      </w:pPr>
-      <w:r>
-        <w:rPr>
-          <w:lang w:eastAsia="es-ES"/>
-        </w:rPr>
-        <w:t>Se ha creado el fichero ContactoComponent.js. Este es un componente de clase que utiliza scrollview para permitir el desplazamiento del contenido por la pantalla. Para la visualización se ha utilizado una carta de React Native Paper con sus apartados Card.title, Card.content y text que permite agrupar la información de forma clara y estructurada.</w:t>
+      <w:proofErr w:type="spellStart"/>
+      <w:r>
+        <w:rPr>
+          <w:lang w:eastAsia="es-ES"/>
+        </w:rPr>
+        <w:t>Commit</w:t>
+      </w:r>
+      <w:proofErr w:type="spellEnd"/>
+      <w:r>
+        <w:rPr>
+          <w:lang w:eastAsia="es-ES"/>
+        </w:rPr>
+        <w:t xml:space="preserve"> 06: “Ejercicio Componentes y </w:t>
+      </w:r>
+      <w:proofErr w:type="spellStart"/>
+      <w:r>
+        <w:rPr>
+          <w:lang w:eastAsia="es-ES"/>
+        </w:rPr>
+        <w:t>Navegacion</w:t>
+      </w:r>
+      <w:proofErr w:type="spellEnd"/>
+      <w:r>
+        <w:rPr>
+          <w:lang w:eastAsia="es-ES"/>
+        </w:rPr>
+        <w:t>”</w:t>
+      </w:r>
+    </w:p>
+    <w:p>
+      <w:pPr>
+        <w:rPr>
+          <w:lang w:eastAsia="es-ES"/>
+        </w:rPr>
+      </w:pPr>
+    </w:p>
+    <w:p>
+      <w:pPr>
+        <w:jc w:val="both"/>
+        <w:rPr>
+          <w:lang w:eastAsia="es-ES"/>
+        </w:rPr>
+      </w:pPr>
+      <w:r>
+        <w:rPr>
+          <w:lang w:eastAsia="es-ES"/>
+        </w:rPr>
+        <w:t xml:space="preserve">El objetivo de esta práctica es añadir dos componentes más a la navegación desde cero, creando su estructura y añadiéndolos a la navegación que ya hemos implementado. Uno de los componentes muestra una página de contacto y la otra comenta la historia del club. Como punto adicional, se ha retocado un poco los estilos de la </w:t>
+      </w:r>
+      <w:proofErr w:type="spellStart"/>
+      <w:r>
+        <w:rPr>
+          <w:lang w:eastAsia="es-ES"/>
+        </w:rPr>
+        <w:t>pagina</w:t>
+      </w:r>
+      <w:proofErr w:type="spellEnd"/>
+      <w:r>
+        <w:rPr>
+          <w:lang w:eastAsia="es-ES"/>
+        </w:rPr>
+        <w:t xml:space="preserve"> principal que se hizo en la práctica anterior.</w:t>
+      </w:r>
+    </w:p>
+    <w:p>
+      <w:pPr>
+        <w:jc w:val="both"/>
+        <w:rPr>
+          <w:lang w:eastAsia="es-ES"/>
+        </w:rPr>
+      </w:pPr>
+      <w:r>
+        <w:rPr>
+          <w:lang w:eastAsia="es-ES"/>
+        </w:rPr>
+        <w:t xml:space="preserve">Se ha creado el fichero ContactoComponent.js. Este es un componente de clase que utiliza </w:t>
+      </w:r>
+      <w:proofErr w:type="spellStart"/>
+      <w:r>
+        <w:rPr>
+          <w:lang w:eastAsia="es-ES"/>
+        </w:rPr>
+        <w:t>scrollview</w:t>
+      </w:r>
+      <w:proofErr w:type="spellEnd"/>
+      <w:r>
+        <w:rPr>
+          <w:lang w:eastAsia="es-ES"/>
+        </w:rPr>
+        <w:t xml:space="preserve"> para permitir el desplazamiento del contenido por la pantalla. Para la visualización se ha utilizado una carta de </w:t>
+      </w:r>
+      <w:proofErr w:type="spellStart"/>
+      <w:r>
+        <w:rPr>
+          <w:lang w:eastAsia="es-ES"/>
+        </w:rPr>
+        <w:t>React</w:t>
+      </w:r>
+      <w:proofErr w:type="spellEnd"/>
+      <w:r>
+        <w:rPr>
+          <w:lang w:eastAsia="es-ES"/>
+        </w:rPr>
+        <w:t xml:space="preserve"> Native Paper con sus apartados </w:t>
+      </w:r>
+      <w:proofErr w:type="spellStart"/>
+      <w:r>
+        <w:rPr>
+          <w:lang w:eastAsia="es-ES"/>
+        </w:rPr>
+        <w:t>Card.title</w:t>
+      </w:r>
+      <w:proofErr w:type="spellEnd"/>
+      <w:r>
+        <w:rPr>
+          <w:lang w:eastAsia="es-ES"/>
+        </w:rPr>
+        <w:t xml:space="preserve">, </w:t>
+      </w:r>
+      <w:proofErr w:type="spellStart"/>
+      <w:r>
+        <w:rPr>
+          <w:lang w:eastAsia="es-ES"/>
+        </w:rPr>
+        <w:t>Card.content</w:t>
+      </w:r>
+      <w:proofErr w:type="spellEnd"/>
+      <w:r>
+        <w:rPr>
+          <w:lang w:eastAsia="es-ES"/>
+        </w:rPr>
+        <w:t xml:space="preserve"> y </w:t>
+      </w:r>
+      <w:proofErr w:type="spellStart"/>
+      <w:r>
+        <w:rPr>
+          <w:lang w:eastAsia="es-ES"/>
+        </w:rPr>
+        <w:t>text</w:t>
+      </w:r>
+      <w:proofErr w:type="spellEnd"/>
+      <w:r>
+        <w:rPr>
+          <w:lang w:eastAsia="es-ES"/>
+        </w:rPr>
+        <w:t xml:space="preserve"> que permite agrupar la información de forma clara y estructurada.</w:t>
       </w:r>
     </w:p>
     <w:p>
@@ -947,21 +2283,63 @@
         <w:rPr>
           <w:lang w:eastAsia="es-ES"/>
         </w:rPr>
-        <w:t xml:space="preserve"> con una card. Este solo renderiza información estática sin estados.</w:t>
-      </w:r>
-    </w:p>
-    <w:p>
-      <w:pPr>
-        <w:jc w:val="both"/>
-        <w:rPr>
-          <w:lang w:eastAsia="es-ES"/>
-        </w:rPr>
-      </w:pPr>
-      <w:r>
-        <w:rPr>
-          <w:lang w:eastAsia="es-ES"/>
-        </w:rPr>
-        <w:t xml:space="preserve">La lista de actividades de QuienesSomos se ha implementado como componente de clase. Este emplea una flat list  con sus ítems que llegan desde actividades.js. Actividades.js se importa, lo que permite acceder al array dentro del componente. </w:t>
+        <w:t xml:space="preserve"> con una </w:t>
+      </w:r>
+      <w:proofErr w:type="spellStart"/>
+      <w:r>
+        <w:rPr>
+          <w:lang w:eastAsia="es-ES"/>
+        </w:rPr>
+        <w:t>card</w:t>
+      </w:r>
+      <w:proofErr w:type="spellEnd"/>
+      <w:r>
+        <w:rPr>
+          <w:lang w:eastAsia="es-ES"/>
+        </w:rPr>
+        <w:t>. Este solo renderiza información estática sin estados.</w:t>
+      </w:r>
+    </w:p>
+    <w:p>
+      <w:pPr>
+        <w:jc w:val="both"/>
+        <w:rPr>
+          <w:lang w:eastAsia="es-ES"/>
+        </w:rPr>
+      </w:pPr>
+      <w:r>
+        <w:rPr>
+          <w:lang w:eastAsia="es-ES"/>
+        </w:rPr>
+        <w:t xml:space="preserve">La lista de actividades de </w:t>
+      </w:r>
+      <w:proofErr w:type="spellStart"/>
+      <w:r>
+        <w:rPr>
+          <w:lang w:eastAsia="es-ES"/>
+        </w:rPr>
+        <w:t>QuienesSomos</w:t>
+      </w:r>
+      <w:proofErr w:type="spellEnd"/>
+      <w:r>
+        <w:rPr>
+          <w:lang w:eastAsia="es-ES"/>
+        </w:rPr>
+        <w:t xml:space="preserve"> se ha implementado como componente de clase. Este emplea una flat </w:t>
+      </w:r>
+      <w:proofErr w:type="spellStart"/>
+      <w:r>
+        <w:rPr>
+          <w:lang w:eastAsia="es-ES"/>
+        </w:rPr>
+        <w:t>list</w:t>
+      </w:r>
+      <w:proofErr w:type="spellEnd"/>
+      <w:r>
+        <w:rPr>
+          <w:lang w:eastAsia="es-ES"/>
+        </w:rPr>
+        <w:t xml:space="preserve">  con sus ítems que llegan desde actividades.js. Actividades.js se importa, lo que permite acceder al array dentro del componente. </w:t>
       </w:r>
     </w:p>
     <w:p>
@@ -976,7 +2354,63 @@
           <w:lang w:eastAsia="es-ES"/>
         </w:rPr>
         <w:lastRenderedPageBreak/>
-        <w:t>Estos nuevos componentes se han añadido al drawer ya existente, de forma que se pueda navegar por ellos y acceder desde el menú lateral. Se han usado navegadores anidados al igual que se hacía con los componentes ya existentes, para ello, las opciones del drawer apuntan a un stack navigator.</w:t>
+        <w:t xml:space="preserve">Estos nuevos componentes se han añadido al </w:t>
+      </w:r>
+      <w:proofErr w:type="spellStart"/>
+      <w:r>
+        <w:rPr>
+          <w:lang w:eastAsia="es-ES"/>
+        </w:rPr>
+        <w:t>drawer</w:t>
+      </w:r>
+      <w:proofErr w:type="spellEnd"/>
+      <w:r>
+        <w:rPr>
+          <w:lang w:eastAsia="es-ES"/>
+        </w:rPr>
+        <w:t xml:space="preserve"> ya existente, de forma que se pueda navegar por ellos y acceder desde el menú lateral. Se han usado navegadores anidados al igual que se hacía con los componentes ya existentes, para ello, las opciones del </w:t>
+      </w:r>
+      <w:proofErr w:type="spellStart"/>
+      <w:r>
+        <w:rPr>
+          <w:lang w:eastAsia="es-ES"/>
+        </w:rPr>
+        <w:t>drawer</w:t>
+      </w:r>
+      <w:proofErr w:type="spellEnd"/>
+      <w:r>
+        <w:rPr>
+          <w:lang w:eastAsia="es-ES"/>
+        </w:rPr>
+        <w:t xml:space="preserve"> apuntan a un </w:t>
+      </w:r>
+      <w:proofErr w:type="spellStart"/>
+      <w:r>
+        <w:rPr>
+          <w:lang w:eastAsia="es-ES"/>
+        </w:rPr>
+        <w:t>stack</w:t>
+      </w:r>
+      <w:proofErr w:type="spellEnd"/>
+      <w:r>
+        <w:rPr>
+          <w:lang w:eastAsia="es-ES"/>
+        </w:rPr>
+        <w:t xml:space="preserve"> </w:t>
+      </w:r>
+      <w:proofErr w:type="spellStart"/>
+      <w:r>
+        <w:rPr>
+          <w:lang w:eastAsia="es-ES"/>
+        </w:rPr>
+        <w:t>navigator</w:t>
+      </w:r>
+      <w:proofErr w:type="spellEnd"/>
+      <w:r>
+        <w:rPr>
+          <w:lang w:eastAsia="es-ES"/>
+        </w:rPr>
+        <w:t>.</w:t>
       </w:r>
     </w:p>
     <w:p>
@@ -996,8 +2430,956 @@
         <w:rPr>
           <w:lang w:eastAsia="es-ES"/>
         </w:rPr>
-        <w:t>imo, se han modificado los componentes Home y DetalleExcursion, cambiando los estilos para conseguir una mejora visual. Se ha usado ImageBackground de react-native, lo que permite usar una imagen como fondo y renderizar contenido encima de ella. Se ha superpuesto de esta forma el texto a la imagen.</w:t>
-      </w:r>
+        <w:t xml:space="preserve">imo, se han modificado los componentes Home y </w:t>
+      </w:r>
+      <w:proofErr w:type="spellStart"/>
+      <w:r>
+        <w:rPr>
+          <w:lang w:eastAsia="es-ES"/>
+        </w:rPr>
+        <w:t>DetalleExcursion</w:t>
+      </w:r>
+      <w:proofErr w:type="spellEnd"/>
+      <w:r>
+        <w:rPr>
+          <w:lang w:eastAsia="es-ES"/>
+        </w:rPr>
+        <w:t xml:space="preserve">, cambiando los estilos para conseguir una mejora visual. Se ha usado </w:t>
+      </w:r>
+      <w:proofErr w:type="spellStart"/>
+      <w:r>
+        <w:rPr>
+          <w:lang w:eastAsia="es-ES"/>
+        </w:rPr>
+        <w:t>ImageBackground</w:t>
+      </w:r>
+      <w:proofErr w:type="spellEnd"/>
+      <w:r>
+        <w:rPr>
+          <w:lang w:eastAsia="es-ES"/>
+        </w:rPr>
+        <w:t xml:space="preserve"> de </w:t>
+      </w:r>
+      <w:proofErr w:type="spellStart"/>
+      <w:r>
+        <w:rPr>
+          <w:lang w:eastAsia="es-ES"/>
+        </w:rPr>
+        <w:t>react</w:t>
+      </w:r>
+      <w:proofErr w:type="spellEnd"/>
+      <w:r>
+        <w:rPr>
+          <w:lang w:eastAsia="es-ES"/>
+        </w:rPr>
+        <w:t>-native, lo que permite usar una imagen como fondo y renderizar contenido encima de ella. Se ha superpuesto de esta forma el texto a la imagen.</w:t>
+      </w:r>
+    </w:p>
+    <w:p>
+      <w:pPr>
+        <w:pStyle w:val="Ttulo1"/>
+        <w:rPr>
+          <w:lang w:eastAsia="es-ES"/>
+        </w:rPr>
+      </w:pPr>
+      <w:proofErr w:type="spellStart"/>
+      <w:r>
+        <w:rPr>
+          <w:lang w:eastAsia="es-ES"/>
+        </w:rPr>
+        <w:t>Commit</w:t>
+      </w:r>
+      <w:proofErr w:type="spellEnd"/>
+      <w:r>
+        <w:rPr>
+          <w:lang w:eastAsia="es-ES"/>
+        </w:rPr>
+        <w:t xml:space="preserve"> 07: “Botones o Iconos”</w:t>
+      </w:r>
+    </w:p>
+    <w:p>
+      <w:pPr>
+        <w:rPr>
+          <w:lang w:eastAsia="es-ES"/>
+        </w:rPr>
+      </w:pPr>
+    </w:p>
+    <w:p>
+      <w:pPr>
+        <w:jc w:val="both"/>
+        <w:rPr>
+          <w:lang w:eastAsia="es-ES"/>
+        </w:rPr>
+      </w:pPr>
+      <w:r>
+        <w:rPr>
+          <w:lang w:eastAsia="es-ES"/>
+        </w:rPr>
+        <w:t xml:space="preserve">El objetivo de este </w:t>
+      </w:r>
+      <w:proofErr w:type="spellStart"/>
+      <w:r>
+        <w:rPr>
+          <w:lang w:eastAsia="es-ES"/>
+        </w:rPr>
+        <w:t>commit</w:t>
+      </w:r>
+      <w:proofErr w:type="spellEnd"/>
+      <w:r>
+        <w:rPr>
+          <w:lang w:eastAsia="es-ES"/>
+        </w:rPr>
+        <w:t xml:space="preserve"> es introducir los botones, la forma más usual y sencilla de interactuar con el usuario. En este caso se van a implementar con iconos. Por último, se renderizará una nueva </w:t>
+      </w:r>
+      <w:proofErr w:type="spellStart"/>
+      <w:r>
+        <w:rPr>
+          <w:lang w:eastAsia="es-ES"/>
+        </w:rPr>
+        <w:t>card</w:t>
+      </w:r>
+      <w:proofErr w:type="spellEnd"/>
+      <w:r>
+        <w:rPr>
+          <w:lang w:eastAsia="es-ES"/>
+        </w:rPr>
+        <w:t xml:space="preserve"> con los comentarios de las distintas excursiones.</w:t>
+      </w:r>
+    </w:p>
+    <w:p>
+      <w:pPr>
+        <w:jc w:val="both"/>
+        <w:rPr>
+          <w:lang w:eastAsia="es-ES"/>
+        </w:rPr>
+      </w:pPr>
+      <w:r>
+        <w:rPr>
+          <w:lang w:eastAsia="es-ES"/>
+        </w:rPr>
+        <w:t>Para renderizar los comentarios</w:t>
+      </w:r>
+      <w:r>
+        <w:rPr>
+          <w:lang w:eastAsia="es-ES"/>
+        </w:rPr>
+        <w:t xml:space="preserve">, se ha creado un nuevo componente funcional denominado </w:t>
+      </w:r>
+      <w:proofErr w:type="spellStart"/>
+      <w:r>
+        <w:rPr>
+          <w:lang w:eastAsia="es-ES"/>
+        </w:rPr>
+        <w:t>RenderComentario</w:t>
+      </w:r>
+      <w:proofErr w:type="spellEnd"/>
+      <w:r>
+        <w:rPr>
+          <w:lang w:eastAsia="es-ES"/>
+        </w:rPr>
+        <w:t>, cuya función es mostrar la información de cada comentario en una tarjeta</w:t>
+      </w:r>
+      <w:r>
+        <w:rPr>
+          <w:lang w:eastAsia="es-ES"/>
+        </w:rPr>
+        <w:t xml:space="preserve">. </w:t>
+      </w:r>
+      <w:r>
+        <w:rPr>
+          <w:lang w:eastAsia="es-ES"/>
+        </w:rPr>
+        <w:t>Los datos de los comentarios se obtienen del fichero comentarios.js y se almacenan en el estado del componente principal.</w:t>
+      </w:r>
+    </w:p>
+    <w:p>
+      <w:pPr>
+        <w:jc w:val="both"/>
+        <w:rPr>
+          <w:lang w:eastAsia="es-ES"/>
+        </w:rPr>
+      </w:pPr>
+      <w:r>
+        <w:rPr>
+          <w:lang w:eastAsia="es-ES"/>
+        </w:rPr>
+        <w:t xml:space="preserve">Para mostrar únicamente los comentarios correspondientes a la excursión seleccionada, se ha utilizado el método </w:t>
+      </w:r>
+      <w:proofErr w:type="spellStart"/>
+      <w:r>
+        <w:rPr>
+          <w:lang w:eastAsia="es-ES"/>
+        </w:rPr>
+        <w:t>filter</w:t>
+      </w:r>
+      <w:proofErr w:type="spellEnd"/>
+      <w:r>
+        <w:rPr>
+          <w:lang w:eastAsia="es-ES"/>
+        </w:rPr>
+        <w:t xml:space="preserve"> </w:t>
+      </w:r>
+      <w:r>
+        <w:rPr>
+          <w:lang w:eastAsia="es-ES"/>
+        </w:rPr>
+        <w:t>de JavaScript</w:t>
+      </w:r>
+      <w:r>
+        <w:rPr>
+          <w:lang w:eastAsia="es-ES"/>
+        </w:rPr>
+        <w:t xml:space="preserve">. </w:t>
+      </w:r>
+      <w:r>
+        <w:rPr>
+          <w:lang w:eastAsia="es-ES"/>
+        </w:rPr>
+        <w:t>Este método permite filtrar el array de comentarios, mostrando únicamente aquellos cuyo identificador coincide con el de la excursión actual.</w:t>
+      </w:r>
+    </w:p>
+    <w:p>
+      <w:pPr>
+        <w:jc w:val="both"/>
+        <w:rPr>
+          <w:lang w:eastAsia="es-ES"/>
+        </w:rPr>
+      </w:pPr>
+      <w:r>
+        <w:rPr>
+          <w:lang w:eastAsia="es-ES"/>
+        </w:rPr>
+        <w:t>Cada comentario muestra:</w:t>
+      </w:r>
+    </w:p>
+    <w:p>
+      <w:pPr>
+        <w:numPr>
+          <w:ilvl w:val="0"/>
+          <w:numId w:val="8"/>
+        </w:numPr>
+        <w:jc w:val="both"/>
+        <w:rPr>
+          <w:lang w:eastAsia="es-ES"/>
+        </w:rPr>
+      </w:pPr>
+      <w:r>
+        <w:rPr>
+          <w:lang w:eastAsia="es-ES"/>
+        </w:rPr>
+        <w:t xml:space="preserve">El texto del comentario </w:t>
+      </w:r>
+    </w:p>
+    <w:p>
+      <w:pPr>
+        <w:numPr>
+          <w:ilvl w:val="0"/>
+          <w:numId w:val="8"/>
+        </w:numPr>
+        <w:jc w:val="both"/>
+        <w:rPr>
+          <w:lang w:eastAsia="es-ES"/>
+        </w:rPr>
+      </w:pPr>
+      <w:r>
+        <w:rPr>
+          <w:lang w:eastAsia="es-ES"/>
+        </w:rPr>
+        <w:t xml:space="preserve">La valoración en estrellas </w:t>
+      </w:r>
+    </w:p>
+    <w:p>
+      <w:pPr>
+        <w:numPr>
+          <w:ilvl w:val="0"/>
+          <w:numId w:val="8"/>
+        </w:numPr>
+        <w:jc w:val="both"/>
+        <w:rPr>
+          <w:lang w:eastAsia="es-ES"/>
+        </w:rPr>
+      </w:pPr>
+      <w:r>
+        <w:rPr>
+          <w:lang w:eastAsia="es-ES"/>
+        </w:rPr>
+        <w:t xml:space="preserve">El autor </w:t>
+      </w:r>
+    </w:p>
+    <w:p>
+      <w:pPr>
+        <w:numPr>
+          <w:ilvl w:val="0"/>
+          <w:numId w:val="8"/>
+        </w:numPr>
+        <w:jc w:val="both"/>
+        <w:rPr>
+          <w:lang w:eastAsia="es-ES"/>
+        </w:rPr>
+      </w:pPr>
+      <w:r>
+        <w:rPr>
+          <w:lang w:eastAsia="es-ES"/>
+        </w:rPr>
+        <w:t xml:space="preserve">La fecha formateada para mejorar la legibilidad </w:t>
+      </w:r>
+    </w:p>
+    <w:p>
+      <w:pPr>
+        <w:jc w:val="both"/>
+        <w:rPr>
+          <w:lang w:eastAsia="es-ES"/>
+        </w:rPr>
+      </w:pPr>
+      <w:r>
+        <w:rPr>
+          <w:lang w:eastAsia="es-ES"/>
+        </w:rPr>
+        <w:t xml:space="preserve">Además, se ha utilizado un </w:t>
+      </w:r>
+      <w:proofErr w:type="spellStart"/>
+      <w:r>
+        <w:rPr>
+          <w:lang w:eastAsia="es-ES"/>
+        </w:rPr>
+        <w:t>ScrollView</w:t>
+      </w:r>
+      <w:proofErr w:type="spellEnd"/>
+      <w:r>
+        <w:rPr>
+          <w:lang w:eastAsia="es-ES"/>
+        </w:rPr>
+        <w:t xml:space="preserve"> para permitir el desplazamiento vertical de la pantalla, ya que ahora contiene tanto la información de la excursión como la lista de comentarios.</w:t>
+      </w:r>
+    </w:p>
+    <w:p>
+      <w:pPr>
+        <w:jc w:val="both"/>
+        <w:rPr>
+          <w:lang w:eastAsia="es-ES"/>
+        </w:rPr>
+      </w:pPr>
+      <w:r>
+        <w:rPr>
+          <w:lang w:eastAsia="es-ES"/>
+        </w:rPr>
+        <w:t xml:space="preserve">Con respecto al uso de botones/íconos, </w:t>
+      </w:r>
+      <w:r>
+        <w:rPr>
+          <w:lang w:eastAsia="es-ES"/>
+        </w:rPr>
+        <w:t xml:space="preserve">se ha añadido funcionalidad interactiva mediante el uso del componente </w:t>
+      </w:r>
+      <w:proofErr w:type="spellStart"/>
+      <w:r>
+        <w:rPr>
+          <w:lang w:eastAsia="es-ES"/>
+        </w:rPr>
+        <w:t>IconButton</w:t>
+      </w:r>
+      <w:proofErr w:type="spellEnd"/>
+      <w:r>
+        <w:rPr>
+          <w:lang w:eastAsia="es-ES"/>
+        </w:rPr>
+        <w:t xml:space="preserve"> de </w:t>
+      </w:r>
+      <w:proofErr w:type="spellStart"/>
+      <w:r>
+        <w:rPr>
+          <w:lang w:eastAsia="es-ES"/>
+        </w:rPr>
+        <w:t>React</w:t>
+      </w:r>
+      <w:proofErr w:type="spellEnd"/>
+      <w:r>
+        <w:rPr>
+          <w:lang w:eastAsia="es-ES"/>
+        </w:rPr>
+        <w:t xml:space="preserve"> Native Paper, en lugar del componente tradicional Button.</w:t>
+      </w:r>
+    </w:p>
+    <w:p>
+      <w:pPr>
+        <w:jc w:val="both"/>
+        <w:rPr>
+          <w:lang w:eastAsia="es-ES"/>
+        </w:rPr>
+      </w:pPr>
+      <w:r>
+        <w:rPr>
+          <w:lang w:eastAsia="es-ES"/>
+        </w:rPr>
+        <w:t>Se ha implementado un botón que permite marcar una excursión como favorita. Para ello, se ha añadido un nuevo atributo en el estado del componente</w:t>
+      </w:r>
+      <w:r>
+        <w:rPr>
+          <w:lang w:eastAsia="es-ES"/>
+        </w:rPr>
+        <w:t xml:space="preserve"> llamado favoritos. </w:t>
+      </w:r>
+      <w:r>
+        <w:rPr>
+          <w:lang w:eastAsia="es-ES"/>
+        </w:rPr>
+        <w:t>Este array almacena los identificadores de las excursiones marcadas como favoritas.</w:t>
+      </w:r>
+    </w:p>
+    <w:p>
+      <w:pPr>
+        <w:jc w:val="both"/>
+        <w:rPr>
+          <w:lang w:eastAsia="es-ES"/>
+        </w:rPr>
+      </w:pPr>
+      <w:r>
+        <w:rPr>
+          <w:lang w:eastAsia="es-ES"/>
+        </w:rPr>
+        <w:t xml:space="preserve">La función </w:t>
+      </w:r>
+      <w:proofErr w:type="spellStart"/>
+      <w:r>
+        <w:rPr>
+          <w:lang w:eastAsia="es-ES"/>
+        </w:rPr>
+        <w:t>marcarFavorito</w:t>
+      </w:r>
+      <w:proofErr w:type="spellEnd"/>
+      <w:r>
+        <w:rPr>
+          <w:lang w:eastAsia="es-ES"/>
+        </w:rPr>
+        <w:t>(</w:t>
+      </w:r>
+      <w:proofErr w:type="spellStart"/>
+      <w:r>
+        <w:rPr>
+          <w:lang w:eastAsia="es-ES"/>
+        </w:rPr>
+        <w:t>excursionId</w:t>
+      </w:r>
+      <w:proofErr w:type="spellEnd"/>
+      <w:r>
+        <w:rPr>
+          <w:lang w:eastAsia="es-ES"/>
+        </w:rPr>
+        <w:t xml:space="preserve">) se encarga de añadir una excursión al array utilizando el método </w:t>
+      </w:r>
+      <w:proofErr w:type="spellStart"/>
+      <w:r>
+        <w:rPr>
+          <w:lang w:eastAsia="es-ES"/>
+        </w:rPr>
+        <w:t>conca</w:t>
+      </w:r>
+      <w:r>
+        <w:rPr>
+          <w:lang w:eastAsia="es-ES"/>
+        </w:rPr>
+        <w:t>t</w:t>
+      </w:r>
+      <w:proofErr w:type="spellEnd"/>
+      <w:r>
+        <w:rPr>
+          <w:lang w:eastAsia="es-ES"/>
+        </w:rPr>
+        <w:t>, evitando modificar directamente el estado</w:t>
+      </w:r>
+      <w:r>
+        <w:rPr>
+          <w:lang w:eastAsia="es-ES"/>
+        </w:rPr>
+        <w:t xml:space="preserve">. </w:t>
+      </w:r>
+      <w:r>
+        <w:rPr>
+          <w:lang w:eastAsia="es-ES"/>
+        </w:rPr>
+        <w:t xml:space="preserve">Para comprobar si una excursión ya está marcada como favorita, se utiliza el método </w:t>
+      </w:r>
+      <w:proofErr w:type="spellStart"/>
+      <w:r>
+        <w:rPr>
+          <w:lang w:eastAsia="es-ES"/>
+        </w:rPr>
+        <w:t>some</w:t>
+      </w:r>
+      <w:proofErr w:type="spellEnd"/>
+      <w:r>
+        <w:rPr>
+          <w:lang w:eastAsia="es-ES"/>
+        </w:rPr>
+        <w:t>.</w:t>
+      </w:r>
+    </w:p>
+    <w:p>
+      <w:pPr>
+        <w:tabs>
+          <w:tab w:val="num" w:pos="720"/>
+        </w:tabs>
+        <w:jc w:val="both"/>
+        <w:rPr>
+          <w:lang w:eastAsia="es-ES"/>
+        </w:rPr>
+      </w:pPr>
+      <w:r>
+        <w:rPr>
+          <w:lang w:eastAsia="es-ES"/>
+        </w:rPr>
+        <w:t>Este método devuelve un valor booleano que se utiliza para</w:t>
+      </w:r>
+      <w:r>
+        <w:rPr>
+          <w:lang w:eastAsia="es-ES"/>
+        </w:rPr>
+        <w:t xml:space="preserve"> c</w:t>
+      </w:r>
+      <w:r>
+        <w:rPr>
+          <w:lang w:eastAsia="es-ES"/>
+        </w:rPr>
+        <w:t>ambiar el icon</w:t>
+      </w:r>
+      <w:r>
+        <w:rPr>
+          <w:lang w:eastAsia="es-ES"/>
+        </w:rPr>
+        <w:t>o y e</w:t>
+      </w:r>
+      <w:r>
+        <w:rPr>
+          <w:lang w:eastAsia="es-ES"/>
+        </w:rPr>
+        <w:t>vitar duplicados al pulsar el botón</w:t>
+      </w:r>
+      <w:r>
+        <w:rPr>
+          <w:lang w:eastAsia="es-ES"/>
+        </w:rPr>
+        <w:t xml:space="preserve">. </w:t>
+      </w:r>
+      <w:r>
+        <w:rPr>
+          <w:lang w:eastAsia="es-ES"/>
+        </w:rPr>
+        <w:t>Si la excursión ya está marcada como favorita, se muestra un mensaje en consola</w:t>
+      </w:r>
+      <w:r>
+        <w:rPr>
+          <w:lang w:eastAsia="es-ES"/>
+        </w:rPr>
+        <w:t>.</w:t>
+      </w:r>
+    </w:p>
+    <w:p>
+      <w:pPr>
+        <w:jc w:val="both"/>
+        <w:rPr>
+          <w:lang w:eastAsia="es-ES"/>
+        </w:rPr>
+      </w:pPr>
+      <w:r>
+        <w:rPr>
+          <w:lang w:eastAsia="es-ES"/>
+        </w:rPr>
+        <w:lastRenderedPageBreak/>
+        <w:t>Es importante destacar que los favoritos solo se almacenan en el estado del componente, por lo que se perderán al abandonar la pantalla</w:t>
+      </w:r>
+      <w:r>
+        <w:rPr>
+          <w:lang w:eastAsia="es-ES"/>
+        </w:rPr>
+        <w:t>.</w:t>
+      </w:r>
+    </w:p>
+    <w:p>
+      <w:pPr>
+        <w:jc w:val="both"/>
+        <w:rPr>
+          <w:lang w:eastAsia="es-ES"/>
+        </w:rPr>
+      </w:pPr>
+      <w:r>
+        <w:rPr>
+          <w:lang w:eastAsia="es-ES"/>
+        </w:rPr>
+        <w:t xml:space="preserve">Para finalizar, se ha cambiado el </w:t>
+      </w:r>
+      <w:proofErr w:type="spellStart"/>
+      <w:r>
+        <w:rPr>
+          <w:lang w:eastAsia="es-ES"/>
+        </w:rPr>
+        <w:t>Drawer</w:t>
+      </w:r>
+      <w:proofErr w:type="spellEnd"/>
+      <w:r>
+        <w:rPr>
+          <w:lang w:eastAsia="es-ES"/>
+        </w:rPr>
+        <w:t xml:space="preserve"> </w:t>
+      </w:r>
+      <w:proofErr w:type="spellStart"/>
+      <w:r>
+        <w:rPr>
+          <w:lang w:eastAsia="es-ES"/>
+        </w:rPr>
+        <w:t>Menu</w:t>
+      </w:r>
+      <w:proofErr w:type="spellEnd"/>
+      <w:r>
+        <w:rPr>
+          <w:lang w:eastAsia="es-ES"/>
+        </w:rPr>
+        <w:t>, realizando varias modificaciones para mejorar su aspecto.</w:t>
+      </w:r>
+    </w:p>
+    <w:p>
+      <w:pPr>
+        <w:jc w:val="both"/>
+        <w:rPr>
+          <w:lang w:eastAsia="es-ES"/>
+        </w:rPr>
+      </w:pPr>
+      <w:r>
+        <w:rPr>
+          <w:lang w:eastAsia="es-ES"/>
+        </w:rPr>
+        <w:t xml:space="preserve">Se han añadido iconos a cada opción del </w:t>
+      </w:r>
+      <w:proofErr w:type="spellStart"/>
+      <w:r>
+        <w:rPr>
+          <w:lang w:eastAsia="es-ES"/>
+        </w:rPr>
+        <w:t>Drawer</w:t>
+      </w:r>
+      <w:proofErr w:type="spellEnd"/>
+      <w:r>
+        <w:rPr>
+          <w:lang w:eastAsia="es-ES"/>
+        </w:rPr>
+        <w:t xml:space="preserve"> utilizando la librería </w:t>
+      </w:r>
+      <w:proofErr w:type="spellStart"/>
+      <w:r>
+        <w:rPr>
+          <w:lang w:eastAsia="es-ES"/>
+        </w:rPr>
+        <w:t>MaterialCommunityIcons</w:t>
+      </w:r>
+      <w:proofErr w:type="spellEnd"/>
+      <w:r>
+        <w:rPr>
+          <w:lang w:eastAsia="es-ES"/>
+        </w:rPr>
+        <w:t xml:space="preserve">. Cada pantalla tiene un icono representativo (home, calendar, </w:t>
+      </w:r>
+      <w:proofErr w:type="spellStart"/>
+      <w:r>
+        <w:rPr>
+          <w:lang w:eastAsia="es-ES"/>
+        </w:rPr>
+        <w:t>information</w:t>
+      </w:r>
+      <w:proofErr w:type="spellEnd"/>
+      <w:r>
+        <w:rPr>
+          <w:lang w:eastAsia="es-ES"/>
+        </w:rPr>
+        <w:t>, etc.).</w:t>
+      </w:r>
+    </w:p>
+    <w:p>
+      <w:pPr>
+        <w:tabs>
+          <w:tab w:val="num" w:pos="720"/>
+        </w:tabs>
+        <w:jc w:val="both"/>
+        <w:rPr>
+          <w:lang w:eastAsia="es-ES"/>
+        </w:rPr>
+      </w:pPr>
+      <w:r>
+        <w:rPr>
+          <w:lang w:eastAsia="es-ES"/>
+        </w:rPr>
+        <w:t xml:space="preserve">Se ha creado un componente </w:t>
+      </w:r>
+      <w:proofErr w:type="spellStart"/>
+      <w:r>
+        <w:rPr>
+          <w:lang w:eastAsia="es-ES"/>
+        </w:rPr>
+        <w:t>CustomDrawerContent</w:t>
+      </w:r>
+      <w:proofErr w:type="spellEnd"/>
+      <w:r>
+        <w:rPr>
+          <w:lang w:eastAsia="es-ES"/>
+        </w:rPr>
+        <w:t xml:space="preserve"> que permite personalizar el contenido del </w:t>
+      </w:r>
+      <w:proofErr w:type="spellStart"/>
+      <w:r>
+        <w:rPr>
+          <w:lang w:eastAsia="es-ES"/>
+        </w:rPr>
+        <w:t>Drawer</w:t>
+      </w:r>
+      <w:proofErr w:type="spellEnd"/>
+      <w:r>
+        <w:rPr>
+          <w:lang w:eastAsia="es-ES"/>
+        </w:rPr>
+        <w:t>. En la parte superior se ha añadido</w:t>
+      </w:r>
+      <w:r>
+        <w:rPr>
+          <w:lang w:eastAsia="es-ES"/>
+        </w:rPr>
+        <w:t xml:space="preserve"> e</w:t>
+      </w:r>
+      <w:r>
+        <w:rPr>
+          <w:lang w:eastAsia="es-ES"/>
+        </w:rPr>
+        <w:t xml:space="preserve">l logotipo de la aplicación </w:t>
+      </w:r>
+      <w:r>
+        <w:rPr>
+          <w:lang w:eastAsia="es-ES"/>
+        </w:rPr>
+        <w:t>y e</w:t>
+      </w:r>
+      <w:r>
+        <w:rPr>
+          <w:lang w:eastAsia="es-ES"/>
+        </w:rPr>
+        <w:t>l nombre "</w:t>
+      </w:r>
+      <w:proofErr w:type="spellStart"/>
+      <w:r>
+        <w:rPr>
+          <w:lang w:eastAsia="es-ES"/>
+        </w:rPr>
+        <w:t>Gaztaroa</w:t>
+      </w:r>
+      <w:proofErr w:type="spellEnd"/>
+      <w:r>
+        <w:rPr>
+          <w:lang w:eastAsia="es-ES"/>
+        </w:rPr>
+        <w:t>"</w:t>
+      </w:r>
+      <w:r>
+        <w:rPr>
+          <w:lang w:eastAsia="es-ES"/>
+        </w:rPr>
+        <w:t xml:space="preserve">. </w:t>
+      </w:r>
+      <w:r>
+        <w:rPr>
+          <w:lang w:eastAsia="es-ES"/>
+        </w:rPr>
+        <w:t xml:space="preserve">Para evitar espacios innecesarios en la parte superior, se ha configurado el </w:t>
+      </w:r>
+      <w:proofErr w:type="spellStart"/>
+      <w:r>
+        <w:rPr>
+          <w:lang w:eastAsia="es-ES"/>
+        </w:rPr>
+        <w:t>SafeAreaView</w:t>
+      </w:r>
+      <w:proofErr w:type="spellEnd"/>
+      <w:r>
+        <w:rPr>
+          <w:lang w:eastAsia="es-ES"/>
+        </w:rPr>
+        <w:t xml:space="preserve"> para no aplicar </w:t>
+      </w:r>
+      <w:proofErr w:type="spellStart"/>
+      <w:r>
+        <w:rPr>
+          <w:lang w:eastAsia="es-ES"/>
+        </w:rPr>
+        <w:t>padding</w:t>
+      </w:r>
+      <w:proofErr w:type="spellEnd"/>
+      <w:r>
+        <w:rPr>
+          <w:lang w:eastAsia="es-ES"/>
+        </w:rPr>
+        <w:t xml:space="preserve"> superior.</w:t>
+      </w:r>
+    </w:p>
+    <w:p>
+      <w:pPr>
+        <w:tabs>
+          <w:tab w:val="num" w:pos="720"/>
+        </w:tabs>
+        <w:jc w:val="both"/>
+        <w:rPr>
+          <w:lang w:eastAsia="es-ES"/>
+        </w:rPr>
+      </w:pPr>
+      <w:r>
+        <w:rPr>
+          <w:lang w:eastAsia="es-ES"/>
+        </w:rPr>
+        <w:t xml:space="preserve">Se ha implementado un componente </w:t>
+      </w:r>
+      <w:proofErr w:type="spellStart"/>
+      <w:r>
+        <w:rPr>
+          <w:lang w:eastAsia="es-ES"/>
+        </w:rPr>
+        <w:t>BotonMenu</w:t>
+      </w:r>
+      <w:proofErr w:type="spellEnd"/>
+      <w:r>
+        <w:rPr>
+          <w:lang w:eastAsia="es-ES"/>
+        </w:rPr>
+        <w:t xml:space="preserve">, que muestra un icono de menú en la cabecera de las pantallas. Este botón permite abrir y cerrar el </w:t>
+      </w:r>
+      <w:proofErr w:type="spellStart"/>
+      <w:r>
+        <w:rPr>
+          <w:lang w:eastAsia="es-ES"/>
+        </w:rPr>
+        <w:t>Drawer</w:t>
+      </w:r>
+      <w:proofErr w:type="spellEnd"/>
+      <w:r>
+        <w:rPr>
+          <w:lang w:eastAsia="es-ES"/>
+        </w:rPr>
+        <w:t>.</w:t>
+      </w:r>
+    </w:p>
+    <w:p>
+      <w:pPr>
+        <w:tabs>
+          <w:tab w:val="num" w:pos="720"/>
+        </w:tabs>
+        <w:jc w:val="both"/>
+        <w:rPr>
+          <w:lang w:eastAsia="es-ES"/>
+        </w:rPr>
+      </w:pPr>
+      <w:r>
+        <w:rPr>
+          <w:lang w:eastAsia="es-ES"/>
+        </w:rPr>
+        <w:t xml:space="preserve">Se ha creado la función </w:t>
+      </w:r>
+      <w:proofErr w:type="spellStart"/>
+      <w:r>
+        <w:rPr>
+          <w:lang w:eastAsia="es-ES"/>
+        </w:rPr>
+        <w:t>menuHeaderOptions</w:t>
+      </w:r>
+      <w:proofErr w:type="spellEnd"/>
+      <w:r>
+        <w:rPr>
+          <w:lang w:eastAsia="es-ES"/>
+        </w:rPr>
+        <w:t>, que permite reutilizar la configuración de la cabecera en diferentes pantallas, evitando duplicación de código.</w:t>
+      </w:r>
+    </w:p>
+    <w:p>
+      <w:pPr>
+        <w:tabs>
+          <w:tab w:val="num" w:pos="720"/>
+        </w:tabs>
+        <w:jc w:val="both"/>
+        <w:rPr>
+          <w:lang w:eastAsia="es-ES"/>
+        </w:rPr>
+      </w:pPr>
+      <w:r>
+        <w:rPr>
+          <w:lang w:eastAsia="es-ES"/>
+        </w:rPr>
+        <w:t xml:space="preserve">Cabe destacar que la pantalla </w:t>
+      </w:r>
+      <w:proofErr w:type="spellStart"/>
+      <w:r>
+        <w:rPr>
+          <w:lang w:eastAsia="es-ES"/>
+        </w:rPr>
+        <w:t>DetalleExcursion</w:t>
+      </w:r>
+      <w:proofErr w:type="spellEnd"/>
+      <w:r>
+        <w:rPr>
+          <w:lang w:eastAsia="es-ES"/>
+        </w:rPr>
+        <w:t xml:space="preserve"> mantiene el botón de navegación hacia atrás por defecto</w:t>
+      </w:r>
+    </w:p>
+    <w:p>
+      <w:pPr>
+        <w:tabs>
+          <w:tab w:val="num" w:pos="720"/>
+        </w:tabs>
+        <w:jc w:val="both"/>
+        <w:rPr>
+          <w:lang w:eastAsia="es-ES"/>
+        </w:rPr>
+      </w:pPr>
+    </w:p>
+    <w:p>
+      <w:pPr>
+        <w:jc w:val="both"/>
+        <w:rPr>
+          <w:lang w:eastAsia="es-ES"/>
+        </w:rPr>
+      </w:pPr>
+    </w:p>
+    <w:p>
+      <w:pPr>
+        <w:jc w:val="both"/>
+        <w:rPr>
+          <w:lang w:eastAsia="es-ES"/>
+        </w:rPr>
+      </w:pPr>
+    </w:p>
+    <w:p>
+      <w:pPr>
+        <w:jc w:val="both"/>
+        <w:rPr>
+          <w:lang w:eastAsia="es-ES"/>
+        </w:rPr>
+      </w:pPr>
+    </w:p>
+    <w:p>
+      <w:pPr>
+        <w:jc w:val="both"/>
+        <w:rPr>
+          <w:lang w:eastAsia="es-ES"/>
+        </w:rPr>
+      </w:pPr>
+    </w:p>
+    <w:p>
+      <w:pPr>
+        <w:jc w:val="both"/>
+        <w:rPr>
+          <w:lang w:eastAsia="es-ES"/>
+        </w:rPr>
+      </w:pPr>
+    </w:p>
+    <w:p>
+      <w:pPr>
+        <w:jc w:val="both"/>
+        <w:rPr>
+          <w:lang w:eastAsia="es-ES"/>
+        </w:rPr>
+      </w:pPr>
     </w:p>
     <w:p>
       <w:pPr>
@@ -1341,6 +3723,304 @@
     </w:lvl>
   </w:abstractNum>
   <w:abstractNum w:abstractNumId="2" w15:restartNumberingAfterBreak="0">
+    <w:nsid w:val="1E0F5BAE"/>
+    <w:multiLevelType w:val="multilevel"/>
+    <w:tmpl w:val="BBCE70C8"/>
+    <w:lvl w:ilvl="0">
+      <w:start w:val="1"/>
+      <w:numFmt w:val="bullet"/>
+      <w:lvlText w:val=""/>
+      <w:lvlJc w:val="left"/>
+      <w:pPr>
+        <w:tabs>
+          <w:tab w:val="num" w:pos="720"/>
+        </w:tabs>
+        <w:ind w:left="720" w:hanging="360"/>
+      </w:pPr>
+      <w:rPr>
+        <w:rFonts w:ascii="Symbol" w:hAnsi="Symbol" w:hint="default"/>
+        <w:sz w:val="20"/>
+      </w:rPr>
+    </w:lvl>
+    <w:lvl w:ilvl="1" w:tentative="1">
+      <w:start w:val="1"/>
+      <w:numFmt w:val="bullet"/>
+      <w:lvlText w:val="o"/>
+      <w:lvlJc w:val="left"/>
+      <w:pPr>
+        <w:tabs>
+          <w:tab w:val="num" w:pos="1440"/>
+        </w:tabs>
+        <w:ind w:left="1440" w:hanging="360"/>
+      </w:pPr>
+      <w:rPr>
+        <w:rFonts w:ascii="Courier New" w:hAnsi="Courier New" w:hint="default"/>
+        <w:sz w:val="20"/>
+      </w:rPr>
+    </w:lvl>
+    <w:lvl w:ilvl="2" w:tentative="1">
+      <w:start w:val="1"/>
+      <w:numFmt w:val="bullet"/>
+      <w:lvlText w:val=""/>
+      <w:lvlJc w:val="left"/>
+      <w:pPr>
+        <w:tabs>
+          <w:tab w:val="num" w:pos="2160"/>
+        </w:tabs>
+        <w:ind w:left="2160" w:hanging="360"/>
+      </w:pPr>
+      <w:rPr>
+        <w:rFonts w:ascii="Wingdings" w:hAnsi="Wingdings" w:hint="default"/>
+        <w:sz w:val="20"/>
+      </w:rPr>
+    </w:lvl>
+    <w:lvl w:ilvl="3" w:tentative="1">
+      <w:start w:val="1"/>
+      <w:numFmt w:val="bullet"/>
+      <w:lvlText w:val=""/>
+      <w:lvlJc w:val="left"/>
+      <w:pPr>
+        <w:tabs>
+          <w:tab w:val="num" w:pos="2880"/>
+        </w:tabs>
+        <w:ind w:left="2880" w:hanging="360"/>
+      </w:pPr>
+      <w:rPr>
+        <w:rFonts w:ascii="Wingdings" w:hAnsi="Wingdings" w:hint="default"/>
+        <w:sz w:val="20"/>
+      </w:rPr>
+    </w:lvl>
+    <w:lvl w:ilvl="4" w:tentative="1">
+      <w:start w:val="1"/>
+      <w:numFmt w:val="bullet"/>
+      <w:lvlText w:val=""/>
+      <w:lvlJc w:val="left"/>
+      <w:pPr>
+        <w:tabs>
+          <w:tab w:val="num" w:pos="3600"/>
+        </w:tabs>
+        <w:ind w:left="3600" w:hanging="360"/>
+      </w:pPr>
+      <w:rPr>
+        <w:rFonts w:ascii="Wingdings" w:hAnsi="Wingdings" w:hint="default"/>
+        <w:sz w:val="20"/>
+      </w:rPr>
+    </w:lvl>
+    <w:lvl w:ilvl="5" w:tentative="1">
+      <w:start w:val="1"/>
+      <w:numFmt w:val="bullet"/>
+      <w:lvlText w:val=""/>
+      <w:lvlJc w:val="left"/>
+      <w:pPr>
+        <w:tabs>
+          <w:tab w:val="num" w:pos="4320"/>
+        </w:tabs>
+        <w:ind w:left="4320" w:hanging="360"/>
+      </w:pPr>
+      <w:rPr>
+        <w:rFonts w:ascii="Wingdings" w:hAnsi="Wingdings" w:hint="default"/>
+        <w:sz w:val="20"/>
+      </w:rPr>
+    </w:lvl>
+    <w:lvl w:ilvl="6" w:tentative="1">
+      <w:start w:val="1"/>
+      <w:numFmt w:val="bullet"/>
+      <w:lvlText w:val=""/>
+      <w:lvlJc w:val="left"/>
+      <w:pPr>
+        <w:tabs>
+          <w:tab w:val="num" w:pos="5040"/>
+        </w:tabs>
+        <w:ind w:left="5040" w:hanging="360"/>
+      </w:pPr>
+      <w:rPr>
+        <w:rFonts w:ascii="Wingdings" w:hAnsi="Wingdings" w:hint="default"/>
+        <w:sz w:val="20"/>
+      </w:rPr>
+    </w:lvl>
+    <w:lvl w:ilvl="7" w:tentative="1">
+      <w:start w:val="1"/>
+      <w:numFmt w:val="bullet"/>
+      <w:lvlText w:val=""/>
+      <w:lvlJc w:val="left"/>
+      <w:pPr>
+        <w:tabs>
+          <w:tab w:val="num" w:pos="5760"/>
+        </w:tabs>
+        <w:ind w:left="5760" w:hanging="360"/>
+      </w:pPr>
+      <w:rPr>
+        <w:rFonts w:ascii="Wingdings" w:hAnsi="Wingdings" w:hint="default"/>
+        <w:sz w:val="20"/>
+      </w:rPr>
+    </w:lvl>
+    <w:lvl w:ilvl="8" w:tentative="1">
+      <w:start w:val="1"/>
+      <w:numFmt w:val="bullet"/>
+      <w:lvlText w:val=""/>
+      <w:lvlJc w:val="left"/>
+      <w:pPr>
+        <w:tabs>
+          <w:tab w:val="num" w:pos="6480"/>
+        </w:tabs>
+        <w:ind w:left="6480" w:hanging="360"/>
+      </w:pPr>
+      <w:rPr>
+        <w:rFonts w:ascii="Wingdings" w:hAnsi="Wingdings" w:hint="default"/>
+        <w:sz w:val="20"/>
+      </w:rPr>
+    </w:lvl>
+  </w:abstractNum>
+  <w:abstractNum w:abstractNumId="3" w15:restartNumberingAfterBreak="0">
+    <w:nsid w:val="255851BE"/>
+    <w:multiLevelType w:val="multilevel"/>
+    <w:tmpl w:val="48E8665C"/>
+    <w:lvl w:ilvl="0">
+      <w:start w:val="1"/>
+      <w:numFmt w:val="bullet"/>
+      <w:lvlText w:val=""/>
+      <w:lvlJc w:val="left"/>
+      <w:pPr>
+        <w:tabs>
+          <w:tab w:val="num" w:pos="720"/>
+        </w:tabs>
+        <w:ind w:left="720" w:hanging="360"/>
+      </w:pPr>
+      <w:rPr>
+        <w:rFonts w:ascii="Symbol" w:hAnsi="Symbol" w:hint="default"/>
+        <w:sz w:val="20"/>
+      </w:rPr>
+    </w:lvl>
+    <w:lvl w:ilvl="1" w:tentative="1">
+      <w:start w:val="1"/>
+      <w:numFmt w:val="bullet"/>
+      <w:lvlText w:val="o"/>
+      <w:lvlJc w:val="left"/>
+      <w:pPr>
+        <w:tabs>
+          <w:tab w:val="num" w:pos="1440"/>
+        </w:tabs>
+        <w:ind w:left="1440" w:hanging="360"/>
+      </w:pPr>
+      <w:rPr>
+        <w:rFonts w:ascii="Courier New" w:hAnsi="Courier New" w:hint="default"/>
+        <w:sz w:val="20"/>
+      </w:rPr>
+    </w:lvl>
+    <w:lvl w:ilvl="2" w:tentative="1">
+      <w:start w:val="1"/>
+      <w:numFmt w:val="bullet"/>
+      <w:lvlText w:val=""/>
+      <w:lvlJc w:val="left"/>
+      <w:pPr>
+        <w:tabs>
+          <w:tab w:val="num" w:pos="2160"/>
+        </w:tabs>
+        <w:ind w:left="2160" w:hanging="360"/>
+      </w:pPr>
+      <w:rPr>
+        <w:rFonts w:ascii="Wingdings" w:hAnsi="Wingdings" w:hint="default"/>
+        <w:sz w:val="20"/>
+      </w:rPr>
+    </w:lvl>
+    <w:lvl w:ilvl="3" w:tentative="1">
+      <w:start w:val="1"/>
+      <w:numFmt w:val="bullet"/>
+      <w:lvlText w:val=""/>
+      <w:lvlJc w:val="left"/>
+      <w:pPr>
+        <w:tabs>
+          <w:tab w:val="num" w:pos="2880"/>
+        </w:tabs>
+        <w:ind w:left="2880" w:hanging="360"/>
+      </w:pPr>
+      <w:rPr>
+        <w:rFonts w:ascii="Wingdings" w:hAnsi="Wingdings" w:hint="default"/>
+        <w:sz w:val="20"/>
+      </w:rPr>
+    </w:lvl>
+    <w:lvl w:ilvl="4" w:tentative="1">
+      <w:start w:val="1"/>
+      <w:numFmt w:val="bullet"/>
+      <w:lvlText w:val=""/>
+      <w:lvlJc w:val="left"/>
+      <w:pPr>
+        <w:tabs>
+          <w:tab w:val="num" w:pos="3600"/>
+        </w:tabs>
+        <w:ind w:left="3600" w:hanging="360"/>
+      </w:pPr>
+      <w:rPr>
+        <w:rFonts w:ascii="Wingdings" w:hAnsi="Wingdings" w:hint="default"/>
+        <w:sz w:val="20"/>
+      </w:rPr>
+    </w:lvl>
+    <w:lvl w:ilvl="5" w:tentative="1">
+      <w:start w:val="1"/>
+      <w:numFmt w:val="bullet"/>
+      <w:lvlText w:val=""/>
+      <w:lvlJc w:val="left"/>
+      <w:pPr>
+        <w:tabs>
+          <w:tab w:val="num" w:pos="4320"/>
+        </w:tabs>
+        <w:ind w:left="4320" w:hanging="360"/>
+      </w:pPr>
+      <w:rPr>
+        <w:rFonts w:ascii="Wingdings" w:hAnsi="Wingdings" w:hint="default"/>
+        <w:sz w:val="20"/>
+      </w:rPr>
+    </w:lvl>
+    <w:lvl w:ilvl="6" w:tentative="1">
+      <w:start w:val="1"/>
+      <w:numFmt w:val="bullet"/>
+      <w:lvlText w:val=""/>
+      <w:lvlJc w:val="left"/>
+      <w:pPr>
+        <w:tabs>
+          <w:tab w:val="num" w:pos="5040"/>
+        </w:tabs>
+        <w:ind w:left="5040" w:hanging="360"/>
+      </w:pPr>
+      <w:rPr>
+        <w:rFonts w:ascii="Wingdings" w:hAnsi="Wingdings" w:hint="default"/>
+        <w:sz w:val="20"/>
+      </w:rPr>
+    </w:lvl>
+    <w:lvl w:ilvl="7" w:tentative="1">
+      <w:start w:val="1"/>
+      <w:numFmt w:val="bullet"/>
+      <w:lvlText w:val=""/>
+      <w:lvlJc w:val="left"/>
+      <w:pPr>
+        <w:tabs>
+          <w:tab w:val="num" w:pos="5760"/>
+        </w:tabs>
+        <w:ind w:left="5760" w:hanging="360"/>
+      </w:pPr>
+      <w:rPr>
+        <w:rFonts w:ascii="Wingdings" w:hAnsi="Wingdings" w:hint="default"/>
+        <w:sz w:val="20"/>
+      </w:rPr>
+    </w:lvl>
+    <w:lvl w:ilvl="8" w:tentative="1">
+      <w:start w:val="1"/>
+      <w:numFmt w:val="bullet"/>
+      <w:lvlText w:val=""/>
+      <w:lvlJc w:val="left"/>
+      <w:pPr>
+        <w:tabs>
+          <w:tab w:val="num" w:pos="6480"/>
+        </w:tabs>
+        <w:ind w:left="6480" w:hanging="360"/>
+      </w:pPr>
+      <w:rPr>
+        <w:rFonts w:ascii="Wingdings" w:hAnsi="Wingdings" w:hint="default"/>
+        <w:sz w:val="20"/>
+      </w:rPr>
+    </w:lvl>
+  </w:abstractNum>
+  <w:abstractNum w:abstractNumId="4" w15:restartNumberingAfterBreak="0">
     <w:nsid w:val="325472AD"/>
     <w:multiLevelType w:val="hybridMultilevel"/>
     <w:tmpl w:val="4878754C"/>
@@ -1453,7 +4133,156 @@
       </w:rPr>
     </w:lvl>
   </w:abstractNum>
-  <w:abstractNum w:abstractNumId="3" w15:restartNumberingAfterBreak="0">
+  <w:abstractNum w:abstractNumId="5" w15:restartNumberingAfterBreak="0">
+    <w:nsid w:val="34E863AF"/>
+    <w:multiLevelType w:val="multilevel"/>
+    <w:tmpl w:val="E35023A4"/>
+    <w:lvl w:ilvl="0">
+      <w:start w:val="1"/>
+      <w:numFmt w:val="bullet"/>
+      <w:lvlText w:val=""/>
+      <w:lvlJc w:val="left"/>
+      <w:pPr>
+        <w:tabs>
+          <w:tab w:val="num" w:pos="720"/>
+        </w:tabs>
+        <w:ind w:left="720" w:hanging="360"/>
+      </w:pPr>
+      <w:rPr>
+        <w:rFonts w:ascii="Symbol" w:hAnsi="Symbol" w:hint="default"/>
+        <w:sz w:val="20"/>
+      </w:rPr>
+    </w:lvl>
+    <w:lvl w:ilvl="1" w:tentative="1">
+      <w:start w:val="1"/>
+      <w:numFmt w:val="bullet"/>
+      <w:lvlText w:val="o"/>
+      <w:lvlJc w:val="left"/>
+      <w:pPr>
+        <w:tabs>
+          <w:tab w:val="num" w:pos="1440"/>
+        </w:tabs>
+        <w:ind w:left="1440" w:hanging="360"/>
+      </w:pPr>
+      <w:rPr>
+        <w:rFonts w:ascii="Courier New" w:hAnsi="Courier New" w:hint="default"/>
+        <w:sz w:val="20"/>
+      </w:rPr>
+    </w:lvl>
+    <w:lvl w:ilvl="2" w:tentative="1">
+      <w:start w:val="1"/>
+      <w:numFmt w:val="bullet"/>
+      <w:lvlText w:val=""/>
+      <w:lvlJc w:val="left"/>
+      <w:pPr>
+        <w:tabs>
+          <w:tab w:val="num" w:pos="2160"/>
+        </w:tabs>
+        <w:ind w:left="2160" w:hanging="360"/>
+      </w:pPr>
+      <w:rPr>
+        <w:rFonts w:ascii="Wingdings" w:hAnsi="Wingdings" w:hint="default"/>
+        <w:sz w:val="20"/>
+      </w:rPr>
+    </w:lvl>
+    <w:lvl w:ilvl="3" w:tentative="1">
+      <w:start w:val="1"/>
+      <w:numFmt w:val="bullet"/>
+      <w:lvlText w:val=""/>
+      <w:lvlJc w:val="left"/>
+      <w:pPr>
+        <w:tabs>
+          <w:tab w:val="num" w:pos="2880"/>
+        </w:tabs>
+        <w:ind w:left="2880" w:hanging="360"/>
+      </w:pPr>
+      <w:rPr>
+        <w:rFonts w:ascii="Wingdings" w:hAnsi="Wingdings" w:hint="default"/>
+        <w:sz w:val="20"/>
+      </w:rPr>
+    </w:lvl>
+    <w:lvl w:ilvl="4" w:tentative="1">
+      <w:start w:val="1"/>
+      <w:numFmt w:val="bullet"/>
+      <w:lvlText w:val=""/>
+      <w:lvlJc w:val="left"/>
+      <w:pPr>
+        <w:tabs>
+          <w:tab w:val="num" w:pos="3600"/>
+        </w:tabs>
+        <w:ind w:left="3600" w:hanging="360"/>
+      </w:pPr>
+      <w:rPr>
+        <w:rFonts w:ascii="Wingdings" w:hAnsi="Wingdings" w:hint="default"/>
+        <w:sz w:val="20"/>
+      </w:rPr>
+    </w:lvl>
+    <w:lvl w:ilvl="5" w:tentative="1">
+      <w:start w:val="1"/>
+      <w:numFmt w:val="bullet"/>
+      <w:lvlText w:val=""/>
+      <w:lvlJc w:val="left"/>
+      <w:pPr>
+        <w:tabs>
+          <w:tab w:val="num" w:pos="4320"/>
+        </w:tabs>
+        <w:ind w:left="4320" w:hanging="360"/>
+      </w:pPr>
+      <w:rPr>
+        <w:rFonts w:ascii="Wingdings" w:hAnsi="Wingdings" w:hint="default"/>
+        <w:sz w:val="20"/>
+      </w:rPr>
+    </w:lvl>
+    <w:lvl w:ilvl="6" w:tentative="1">
+      <w:start w:val="1"/>
+      <w:numFmt w:val="bullet"/>
+      <w:lvlText w:val=""/>
+      <w:lvlJc w:val="left"/>
+      <w:pPr>
+        <w:tabs>
+          <w:tab w:val="num" w:pos="5040"/>
+        </w:tabs>
+        <w:ind w:left="5040" w:hanging="360"/>
+      </w:pPr>
+      <w:rPr>
+        <w:rFonts w:ascii="Wingdings" w:hAnsi="Wingdings" w:hint="default"/>
+        <w:sz w:val="20"/>
+      </w:rPr>
+    </w:lvl>
+    <w:lvl w:ilvl="7" w:tentative="1">
+      <w:start w:val="1"/>
+      <w:numFmt w:val="bullet"/>
+      <w:lvlText w:val=""/>
+      <w:lvlJc w:val="left"/>
+      <w:pPr>
+        <w:tabs>
+          <w:tab w:val="num" w:pos="5760"/>
+        </w:tabs>
+        <w:ind w:left="5760" w:hanging="360"/>
+      </w:pPr>
+      <w:rPr>
+        <w:rFonts w:ascii="Wingdings" w:hAnsi="Wingdings" w:hint="default"/>
+        <w:sz w:val="20"/>
+      </w:rPr>
+    </w:lvl>
+    <w:lvl w:ilvl="8" w:tentative="1">
+      <w:start w:val="1"/>
+      <w:numFmt w:val="bullet"/>
+      <w:lvlText w:val=""/>
+      <w:lvlJc w:val="left"/>
+      <w:pPr>
+        <w:tabs>
+          <w:tab w:val="num" w:pos="6480"/>
+        </w:tabs>
+        <w:ind w:left="6480" w:hanging="360"/>
+      </w:pPr>
+      <w:rPr>
+        <w:rFonts w:ascii="Wingdings" w:hAnsi="Wingdings" w:hint="default"/>
+        <w:sz w:val="20"/>
+      </w:rPr>
+    </w:lvl>
+  </w:abstractNum>
+  <w:abstractNum w:abstractNumId="6" w15:restartNumberingAfterBreak="0">
     <w:nsid w:val="36DD7F07"/>
     <w:multiLevelType w:val="hybridMultilevel"/>
     <w:tmpl w:val="CF686978"/>
@@ -1566,7 +4395,7 @@
       </w:rPr>
     </w:lvl>
   </w:abstractNum>
-  <w:abstractNum w:abstractNumId="4" w15:restartNumberingAfterBreak="0">
+  <w:abstractNum w:abstractNumId="7" w15:restartNumberingAfterBreak="0">
     <w:nsid w:val="3ACC6F0A"/>
     <w:multiLevelType w:val="hybridMultilevel"/>
     <w:tmpl w:val="5DBA38D0"/>
@@ -1679,7 +4508,7 @@
       </w:rPr>
     </w:lvl>
   </w:abstractNum>
-  <w:abstractNum w:abstractNumId="5" w15:restartNumberingAfterBreak="0">
+  <w:abstractNum w:abstractNumId="8" w15:restartNumberingAfterBreak="0">
     <w:nsid w:val="5A6A6B00"/>
     <w:multiLevelType w:val="hybridMultilevel"/>
     <w:tmpl w:val="7420735E"/>
@@ -1792,7 +4621,7 @@
       </w:rPr>
     </w:lvl>
   </w:abstractNum>
-  <w:abstractNum w:abstractNumId="6" w15:restartNumberingAfterBreak="0">
+  <w:abstractNum w:abstractNumId="9" w15:restartNumberingAfterBreak="0">
     <w:nsid w:val="78E12896"/>
     <w:multiLevelType w:val="hybridMultilevel"/>
     <w:tmpl w:val="936299E4"/>
@@ -1906,25 +4735,34 @@
     </w:lvl>
   </w:abstractNum>
   <w:num w:numId="1" w16cid:durableId="1174687561">
-    <w:abstractNumId w:val="5"/>
+    <w:abstractNumId w:val="8"/>
   </w:num>
   <w:num w:numId="2" w16cid:durableId="1452284289">
     <w:abstractNumId w:val="1"/>
   </w:num>
   <w:num w:numId="3" w16cid:durableId="1368523310">
-    <w:abstractNumId w:val="4"/>
+    <w:abstractNumId w:val="7"/>
   </w:num>
   <w:num w:numId="4" w16cid:durableId="1622690477">
     <w:abstractNumId w:val="0"/>
   </w:num>
   <w:num w:numId="5" w16cid:durableId="559099641">
-    <w:abstractNumId w:val="2"/>
+    <w:abstractNumId w:val="4"/>
   </w:num>
   <w:num w:numId="6" w16cid:durableId="423036140">
+    <w:abstractNumId w:val="9"/>
+  </w:num>
+  <w:num w:numId="7" w16cid:durableId="1493718539">
     <w:abstractNumId w:val="6"/>
   </w:num>
-  <w:num w:numId="7" w16cid:durableId="1493718539">
+  <w:num w:numId="8" w16cid:durableId="1780682702">
+    <w:abstractNumId w:val="5"/>
+  </w:num>
+  <w:num w:numId="9" w16cid:durableId="753165287">
     <w:abstractNumId w:val="3"/>
+  </w:num>
+  <w:num w:numId="10" w16cid:durableId="443500220">
+    <w:abstractNumId w:val="2"/>
   </w:num>
 </w:numbering>
 </file>
@@ -2530,7 +5368,6 @@
   <w:style w:type="character" w:default="1" w:styleId="Fuentedeprrafopredeter">
     <w:name w:val="Default Paragraph Font"/>
     <w:uiPriority w:val="1"/>
-    <w:semiHidden/>
     <w:unhideWhenUsed/>
   </w:style>
   <w:style w:type="table" w:default="1" w:styleId="Tablanormal">

</xml_diff>

<commit_message>
Commit 08: “Servidor JSON”
</commit_message>
<xml_diff>
--- a/Comentario sobre las prácticas.docx
+++ b/Comentario sobre las prácticas.docx
@@ -3324,26 +3324,388 @@
     </w:p>
     <w:p>
       <w:pPr>
-        <w:tabs>
-          <w:tab w:val="num" w:pos="720"/>
-        </w:tabs>
-        <w:jc w:val="both"/>
-        <w:rPr>
-          <w:lang w:eastAsia="es-ES"/>
-        </w:rPr>
-      </w:pPr>
-    </w:p>
-    <w:p>
-      <w:pPr>
-        <w:jc w:val="both"/>
-        <w:rPr>
-          <w:lang w:eastAsia="es-ES"/>
-        </w:rPr>
-      </w:pPr>
-    </w:p>
-    <w:p>
-      <w:pPr>
-        <w:jc w:val="both"/>
+        <w:pStyle w:val="Ttulo1"/>
+        <w:rPr>
+          <w:lang w:eastAsia="es-ES"/>
+        </w:rPr>
+      </w:pPr>
+      <w:proofErr w:type="spellStart"/>
+      <w:r>
+        <w:rPr>
+          <w:lang w:eastAsia="es-ES"/>
+        </w:rPr>
+        <w:t>Commit</w:t>
+      </w:r>
+      <w:proofErr w:type="spellEnd"/>
+      <w:r>
+        <w:rPr>
+          <w:lang w:eastAsia="es-ES"/>
+        </w:rPr>
+        <w:t xml:space="preserve"> 08: “Servidor JSON”</w:t>
+      </w:r>
+    </w:p>
+    <w:p>
+      <w:pPr>
+        <w:rPr>
+          <w:lang w:eastAsia="es-ES"/>
+        </w:rPr>
+      </w:pPr>
+    </w:p>
+    <w:p>
+      <w:pPr>
+        <w:jc w:val="both"/>
+        <w:rPr>
+          <w:lang w:eastAsia="es-ES"/>
+        </w:rPr>
+      </w:pPr>
+      <w:r>
+        <w:rPr>
+          <w:lang w:eastAsia="es-ES"/>
+        </w:rPr>
+        <w:t>En esta práctica se ha configurado un servidor local utilizando JSON</w:t>
+      </w:r>
+      <w:r>
+        <w:rPr>
+          <w:b/>
+          <w:bCs/>
+          <w:lang w:eastAsia="es-ES"/>
+        </w:rPr>
+        <w:t xml:space="preserve"> </w:t>
+      </w:r>
+      <w:r>
+        <w:rPr>
+          <w:lang w:eastAsia="es-ES"/>
+        </w:rPr>
+        <w:t xml:space="preserve">Server, con el objetivo de simular una API REST sin necesidad de implementar un </w:t>
+      </w:r>
+      <w:proofErr w:type="spellStart"/>
+      <w:r>
+        <w:rPr>
+          <w:lang w:eastAsia="es-ES"/>
+        </w:rPr>
+        <w:t>backend</w:t>
+      </w:r>
+      <w:proofErr w:type="spellEnd"/>
+      <w:r>
+        <w:rPr>
+          <w:lang w:eastAsia="es-ES"/>
+        </w:rPr>
+        <w:t xml:space="preserve"> real. Este servidor permite exponer los datos de la aplicación a través de </w:t>
+      </w:r>
+      <w:proofErr w:type="spellStart"/>
+      <w:r>
+        <w:rPr>
+          <w:lang w:eastAsia="es-ES"/>
+        </w:rPr>
+        <w:t>endpoints</w:t>
+      </w:r>
+      <w:proofErr w:type="spellEnd"/>
+      <w:r>
+        <w:rPr>
+          <w:lang w:eastAsia="es-ES"/>
+        </w:rPr>
+        <w:t xml:space="preserve"> HTTP y servir contenido estático, como imágenes.</w:t>
+      </w:r>
+    </w:p>
+    <w:p>
+      <w:pPr>
+        <w:jc w:val="both"/>
+        <w:rPr>
+          <w:lang w:eastAsia="es-ES"/>
+        </w:rPr>
+      </w:pPr>
+      <w:r>
+        <w:rPr>
+          <w:lang w:eastAsia="es-ES"/>
+        </w:rPr>
+        <w:t>Además, se ha modificado la aplicación para dejar de utilizar recursos locales en ciertos casos, centralizando la configuración y preparando el proyecto para futuras prácticas en las que se consumirá la API REST.</w:t>
+      </w:r>
+    </w:p>
+    <w:p>
+      <w:pPr>
+        <w:jc w:val="both"/>
+        <w:rPr>
+          <w:lang w:eastAsia="es-ES"/>
+        </w:rPr>
+      </w:pPr>
+      <w:r>
+        <w:rPr>
+          <w:lang w:eastAsia="es-ES"/>
+        </w:rPr>
+        <w:t xml:space="preserve">Se ha instalado el paquete </w:t>
+      </w:r>
+      <w:proofErr w:type="spellStart"/>
+      <w:r>
+        <w:rPr>
+          <w:lang w:eastAsia="es-ES"/>
+        </w:rPr>
+        <w:t>json</w:t>
+      </w:r>
+      <w:proofErr w:type="spellEnd"/>
+      <w:r>
+        <w:rPr>
+          <w:lang w:eastAsia="es-ES"/>
+        </w:rPr>
+        <w:t xml:space="preserve">-server como dependencia de desarrollo y se ha configurado un servidor local que expone los datos contenidos en el fichero </w:t>
+      </w:r>
+      <w:proofErr w:type="spellStart"/>
+      <w:r>
+        <w:rPr>
+          <w:lang w:eastAsia="es-ES"/>
+        </w:rPr>
+        <w:t>db.json</w:t>
+      </w:r>
+      <w:proofErr w:type="spellEnd"/>
+      <w:r>
+        <w:rPr>
+          <w:lang w:eastAsia="es-ES"/>
+        </w:rPr>
+        <w:t>.</w:t>
+      </w:r>
+    </w:p>
+    <w:p>
+      <w:pPr>
+        <w:jc w:val="both"/>
+        <w:rPr>
+          <w:lang w:eastAsia="es-ES"/>
+        </w:rPr>
+      </w:pPr>
+      <w:r>
+        <w:rPr>
+          <w:lang w:eastAsia="es-ES"/>
+        </w:rPr>
+        <w:t xml:space="preserve">Este servidor permite acceder a los recursos mediante </w:t>
+      </w:r>
+      <w:proofErr w:type="spellStart"/>
+      <w:r>
+        <w:rPr>
+          <w:lang w:eastAsia="es-ES"/>
+        </w:rPr>
+        <w:t>URLs</w:t>
+      </w:r>
+      <w:proofErr w:type="spellEnd"/>
+      <w:r>
+        <w:rPr>
+          <w:lang w:eastAsia="es-ES"/>
+        </w:rPr>
+        <w:t xml:space="preserve"> como:</w:t>
+      </w:r>
+    </w:p>
+    <w:p>
+      <w:pPr>
+        <w:numPr>
+          <w:ilvl w:val="0"/>
+          <w:numId w:val="11"/>
+        </w:numPr>
+        <w:jc w:val="both"/>
+        <w:rPr>
+          <w:lang w:eastAsia="es-ES"/>
+        </w:rPr>
+      </w:pPr>
+      <w:r>
+        <w:rPr>
+          <w:lang w:eastAsia="es-ES"/>
+        </w:rPr>
+        <w:t xml:space="preserve">/excursiones </w:t>
+      </w:r>
+    </w:p>
+    <w:p>
+      <w:pPr>
+        <w:numPr>
+          <w:ilvl w:val="0"/>
+          <w:numId w:val="11"/>
+        </w:numPr>
+        <w:jc w:val="both"/>
+        <w:rPr>
+          <w:lang w:eastAsia="es-ES"/>
+        </w:rPr>
+      </w:pPr>
+      <w:r>
+        <w:rPr>
+          <w:lang w:eastAsia="es-ES"/>
+        </w:rPr>
+        <w:t xml:space="preserve">/comentarios </w:t>
+      </w:r>
+    </w:p>
+    <w:p>
+      <w:pPr>
+        <w:numPr>
+          <w:ilvl w:val="0"/>
+          <w:numId w:val="11"/>
+        </w:numPr>
+        <w:jc w:val="both"/>
+        <w:rPr>
+          <w:lang w:eastAsia="es-ES"/>
+        </w:rPr>
+      </w:pPr>
+      <w:r>
+        <w:rPr>
+          <w:lang w:eastAsia="es-ES"/>
+        </w:rPr>
+        <w:t xml:space="preserve">/actividades </w:t>
+      </w:r>
+    </w:p>
+    <w:p>
+      <w:pPr>
+        <w:numPr>
+          <w:ilvl w:val="0"/>
+          <w:numId w:val="11"/>
+        </w:numPr>
+        <w:jc w:val="both"/>
+        <w:rPr>
+          <w:lang w:eastAsia="es-ES"/>
+        </w:rPr>
+      </w:pPr>
+      <w:r>
+        <w:rPr>
+          <w:lang w:eastAsia="es-ES"/>
+        </w:rPr>
+        <w:t xml:space="preserve">/cabeceras </w:t>
+      </w:r>
+    </w:p>
+    <w:p>
+      <w:pPr>
+        <w:jc w:val="both"/>
+        <w:rPr>
+          <w:lang w:eastAsia="es-ES"/>
+        </w:rPr>
+      </w:pPr>
+      <w:r>
+        <w:rPr>
+          <w:lang w:eastAsia="es-ES"/>
+        </w:rPr>
+        <w:t>De este modo, se simula el comportamiento de un servidor real, facilitando el desarrollo y las pruebas de la aplicación.</w:t>
+      </w:r>
+    </w:p>
+    <w:p>
+      <w:pPr>
+        <w:jc w:val="both"/>
+        <w:rPr>
+          <w:lang w:eastAsia="es-ES"/>
+        </w:rPr>
+      </w:pPr>
+      <w:r>
+        <w:rPr>
+          <w:lang w:eastAsia="es-ES"/>
+        </w:rPr>
+        <w:t xml:space="preserve">Además de exponer datos, el servidor JSON permite servir archivos estáticos desde la carpeta </w:t>
+      </w:r>
+      <w:proofErr w:type="spellStart"/>
+      <w:r>
+        <w:rPr>
+          <w:lang w:eastAsia="es-ES"/>
+        </w:rPr>
+        <w:t>public</w:t>
+      </w:r>
+      <w:proofErr w:type="spellEnd"/>
+      <w:r>
+        <w:rPr>
+          <w:lang w:eastAsia="es-ES"/>
+        </w:rPr>
+        <w:t xml:space="preserve">. En esta práctica, se han movido las imágenes a dicha carpeta, permitiendo acceder a ellas mediante </w:t>
+      </w:r>
+      <w:proofErr w:type="spellStart"/>
+      <w:r>
+        <w:rPr>
+          <w:lang w:eastAsia="es-ES"/>
+        </w:rPr>
+        <w:t>URLs</w:t>
+      </w:r>
+      <w:proofErr w:type="spellEnd"/>
+      <w:r>
+        <w:rPr>
+          <w:lang w:eastAsia="es-ES"/>
+        </w:rPr>
+        <w:t>.</w:t>
+      </w:r>
+    </w:p>
+    <w:p>
+      <w:pPr>
+        <w:jc w:val="both"/>
+        <w:rPr>
+          <w:lang w:eastAsia="es-ES"/>
+        </w:rPr>
+      </w:pPr>
+      <w:r>
+        <w:rPr>
+          <w:lang w:eastAsia="es-ES"/>
+        </w:rPr>
+        <w:lastRenderedPageBreak/>
+        <w:t>Se ha modificado el código para que las imágenes se carguen dinámicamente desde el servidor</w:t>
+      </w:r>
+      <w:r>
+        <w:rPr>
+          <w:lang w:eastAsia="es-ES"/>
+        </w:rPr>
+        <w:t xml:space="preserve"> </w:t>
+      </w:r>
+      <w:r>
+        <w:rPr>
+          <w:lang w:eastAsia="es-ES"/>
+        </w:rPr>
+        <w:t xml:space="preserve">en lugar de usar el método </w:t>
+      </w:r>
+      <w:proofErr w:type="spellStart"/>
+      <w:r>
+        <w:rPr>
+          <w:lang w:eastAsia="es-ES"/>
+        </w:rPr>
+        <w:t>require</w:t>
+      </w:r>
+      <w:proofErr w:type="spellEnd"/>
+      <w:r>
+        <w:rPr>
+          <w:lang w:eastAsia="es-ES"/>
+        </w:rPr>
+        <w:t>(). Esto permite que cada elemento muestre su propia imagen de forma dinámica.</w:t>
+      </w:r>
+    </w:p>
+    <w:p>
+      <w:pPr>
+        <w:jc w:val="both"/>
+        <w:rPr>
+          <w:lang w:eastAsia="es-ES"/>
+        </w:rPr>
+      </w:pPr>
+      <w:r>
+        <w:rPr>
+          <w:lang w:eastAsia="es-ES"/>
+        </w:rPr>
+        <w:t>Aunque se ha configurado un servidor REST, en esta práctica los datos siguen obteniéndose de archivos locales. El uso de la API REST se abordará en la siguiente práctica</w:t>
+      </w:r>
+      <w:r>
+        <w:rPr>
+          <w:lang w:eastAsia="es-ES"/>
+        </w:rPr>
+        <w:t>.</w:t>
+      </w:r>
+    </w:p>
+    <w:p>
+      <w:pPr>
+        <w:jc w:val="both"/>
+        <w:rPr>
+          <w:lang w:eastAsia="es-ES"/>
+        </w:rPr>
+      </w:pPr>
+    </w:p>
+    <w:p>
+      <w:pPr>
+        <w:jc w:val="both"/>
+        <w:rPr>
+          <w:lang w:eastAsia="es-ES"/>
+        </w:rPr>
+      </w:pPr>
+    </w:p>
+    <w:p>
+      <w:pPr>
+        <w:jc w:val="both"/>
+        <w:rPr>
+          <w:lang w:eastAsia="es-ES"/>
+        </w:rPr>
+      </w:pPr>
+    </w:p>
+    <w:p>
+      <w:pPr>
         <w:rPr>
           <w:lang w:eastAsia="es-ES"/>
         </w:rPr>
@@ -3611,6 +3973,155 @@
     </w:lvl>
   </w:abstractNum>
   <w:abstractNum w:abstractNumId="1" w15:restartNumberingAfterBreak="0">
+    <w:nsid w:val="0DED74A8"/>
+    <w:multiLevelType w:val="multilevel"/>
+    <w:tmpl w:val="2208CD8A"/>
+    <w:lvl w:ilvl="0">
+      <w:start w:val="1"/>
+      <w:numFmt w:val="bullet"/>
+      <w:lvlText w:val=""/>
+      <w:lvlJc w:val="left"/>
+      <w:pPr>
+        <w:tabs>
+          <w:tab w:val="num" w:pos="720"/>
+        </w:tabs>
+        <w:ind w:left="720" w:hanging="360"/>
+      </w:pPr>
+      <w:rPr>
+        <w:rFonts w:ascii="Symbol" w:hAnsi="Symbol" w:hint="default"/>
+        <w:sz w:val="20"/>
+      </w:rPr>
+    </w:lvl>
+    <w:lvl w:ilvl="1" w:tentative="1">
+      <w:start w:val="1"/>
+      <w:numFmt w:val="bullet"/>
+      <w:lvlText w:val="o"/>
+      <w:lvlJc w:val="left"/>
+      <w:pPr>
+        <w:tabs>
+          <w:tab w:val="num" w:pos="1440"/>
+        </w:tabs>
+        <w:ind w:left="1440" w:hanging="360"/>
+      </w:pPr>
+      <w:rPr>
+        <w:rFonts w:ascii="Courier New" w:hAnsi="Courier New" w:hint="default"/>
+        <w:sz w:val="20"/>
+      </w:rPr>
+    </w:lvl>
+    <w:lvl w:ilvl="2" w:tentative="1">
+      <w:start w:val="1"/>
+      <w:numFmt w:val="bullet"/>
+      <w:lvlText w:val=""/>
+      <w:lvlJc w:val="left"/>
+      <w:pPr>
+        <w:tabs>
+          <w:tab w:val="num" w:pos="2160"/>
+        </w:tabs>
+        <w:ind w:left="2160" w:hanging="360"/>
+      </w:pPr>
+      <w:rPr>
+        <w:rFonts w:ascii="Wingdings" w:hAnsi="Wingdings" w:hint="default"/>
+        <w:sz w:val="20"/>
+      </w:rPr>
+    </w:lvl>
+    <w:lvl w:ilvl="3" w:tentative="1">
+      <w:start w:val="1"/>
+      <w:numFmt w:val="bullet"/>
+      <w:lvlText w:val=""/>
+      <w:lvlJc w:val="left"/>
+      <w:pPr>
+        <w:tabs>
+          <w:tab w:val="num" w:pos="2880"/>
+        </w:tabs>
+        <w:ind w:left="2880" w:hanging="360"/>
+      </w:pPr>
+      <w:rPr>
+        <w:rFonts w:ascii="Wingdings" w:hAnsi="Wingdings" w:hint="default"/>
+        <w:sz w:val="20"/>
+      </w:rPr>
+    </w:lvl>
+    <w:lvl w:ilvl="4" w:tentative="1">
+      <w:start w:val="1"/>
+      <w:numFmt w:val="bullet"/>
+      <w:lvlText w:val=""/>
+      <w:lvlJc w:val="left"/>
+      <w:pPr>
+        <w:tabs>
+          <w:tab w:val="num" w:pos="3600"/>
+        </w:tabs>
+        <w:ind w:left="3600" w:hanging="360"/>
+      </w:pPr>
+      <w:rPr>
+        <w:rFonts w:ascii="Wingdings" w:hAnsi="Wingdings" w:hint="default"/>
+        <w:sz w:val="20"/>
+      </w:rPr>
+    </w:lvl>
+    <w:lvl w:ilvl="5" w:tentative="1">
+      <w:start w:val="1"/>
+      <w:numFmt w:val="bullet"/>
+      <w:lvlText w:val=""/>
+      <w:lvlJc w:val="left"/>
+      <w:pPr>
+        <w:tabs>
+          <w:tab w:val="num" w:pos="4320"/>
+        </w:tabs>
+        <w:ind w:left="4320" w:hanging="360"/>
+      </w:pPr>
+      <w:rPr>
+        <w:rFonts w:ascii="Wingdings" w:hAnsi="Wingdings" w:hint="default"/>
+        <w:sz w:val="20"/>
+      </w:rPr>
+    </w:lvl>
+    <w:lvl w:ilvl="6" w:tentative="1">
+      <w:start w:val="1"/>
+      <w:numFmt w:val="bullet"/>
+      <w:lvlText w:val=""/>
+      <w:lvlJc w:val="left"/>
+      <w:pPr>
+        <w:tabs>
+          <w:tab w:val="num" w:pos="5040"/>
+        </w:tabs>
+        <w:ind w:left="5040" w:hanging="360"/>
+      </w:pPr>
+      <w:rPr>
+        <w:rFonts w:ascii="Wingdings" w:hAnsi="Wingdings" w:hint="default"/>
+        <w:sz w:val="20"/>
+      </w:rPr>
+    </w:lvl>
+    <w:lvl w:ilvl="7" w:tentative="1">
+      <w:start w:val="1"/>
+      <w:numFmt w:val="bullet"/>
+      <w:lvlText w:val=""/>
+      <w:lvlJc w:val="left"/>
+      <w:pPr>
+        <w:tabs>
+          <w:tab w:val="num" w:pos="5760"/>
+        </w:tabs>
+        <w:ind w:left="5760" w:hanging="360"/>
+      </w:pPr>
+      <w:rPr>
+        <w:rFonts w:ascii="Wingdings" w:hAnsi="Wingdings" w:hint="default"/>
+        <w:sz w:val="20"/>
+      </w:rPr>
+    </w:lvl>
+    <w:lvl w:ilvl="8" w:tentative="1">
+      <w:start w:val="1"/>
+      <w:numFmt w:val="bullet"/>
+      <w:lvlText w:val=""/>
+      <w:lvlJc w:val="left"/>
+      <w:pPr>
+        <w:tabs>
+          <w:tab w:val="num" w:pos="6480"/>
+        </w:tabs>
+        <w:ind w:left="6480" w:hanging="360"/>
+      </w:pPr>
+      <w:rPr>
+        <w:rFonts w:ascii="Wingdings" w:hAnsi="Wingdings" w:hint="default"/>
+        <w:sz w:val="20"/>
+      </w:rPr>
+    </w:lvl>
+  </w:abstractNum>
+  <w:abstractNum w:abstractNumId="2" w15:restartNumberingAfterBreak="0">
     <w:nsid w:val="12E162AD"/>
     <w:multiLevelType w:val="hybridMultilevel"/>
     <w:tmpl w:val="C59EEED6"/>
@@ -3722,7 +4233,7 @@
       </w:rPr>
     </w:lvl>
   </w:abstractNum>
-  <w:abstractNum w:abstractNumId="2" w15:restartNumberingAfterBreak="0">
+  <w:abstractNum w:abstractNumId="3" w15:restartNumberingAfterBreak="0">
     <w:nsid w:val="1E0F5BAE"/>
     <w:multiLevelType w:val="multilevel"/>
     <w:tmpl w:val="BBCE70C8"/>
@@ -3871,7 +4382,7 @@
       </w:rPr>
     </w:lvl>
   </w:abstractNum>
-  <w:abstractNum w:abstractNumId="3" w15:restartNumberingAfterBreak="0">
+  <w:abstractNum w:abstractNumId="4" w15:restartNumberingAfterBreak="0">
     <w:nsid w:val="255851BE"/>
     <w:multiLevelType w:val="multilevel"/>
     <w:tmpl w:val="48E8665C"/>
@@ -4020,7 +4531,7 @@
       </w:rPr>
     </w:lvl>
   </w:abstractNum>
-  <w:abstractNum w:abstractNumId="4" w15:restartNumberingAfterBreak="0">
+  <w:abstractNum w:abstractNumId="5" w15:restartNumberingAfterBreak="0">
     <w:nsid w:val="325472AD"/>
     <w:multiLevelType w:val="hybridMultilevel"/>
     <w:tmpl w:val="4878754C"/>
@@ -4133,7 +4644,7 @@
       </w:rPr>
     </w:lvl>
   </w:abstractNum>
-  <w:abstractNum w:abstractNumId="5" w15:restartNumberingAfterBreak="0">
+  <w:abstractNum w:abstractNumId="6" w15:restartNumberingAfterBreak="0">
     <w:nsid w:val="34E863AF"/>
     <w:multiLevelType w:val="multilevel"/>
     <w:tmpl w:val="E35023A4"/>
@@ -4282,7 +4793,7 @@
       </w:rPr>
     </w:lvl>
   </w:abstractNum>
-  <w:abstractNum w:abstractNumId="6" w15:restartNumberingAfterBreak="0">
+  <w:abstractNum w:abstractNumId="7" w15:restartNumberingAfterBreak="0">
     <w:nsid w:val="36DD7F07"/>
     <w:multiLevelType w:val="hybridMultilevel"/>
     <w:tmpl w:val="CF686978"/>
@@ -4395,7 +4906,7 @@
       </w:rPr>
     </w:lvl>
   </w:abstractNum>
-  <w:abstractNum w:abstractNumId="7" w15:restartNumberingAfterBreak="0">
+  <w:abstractNum w:abstractNumId="8" w15:restartNumberingAfterBreak="0">
     <w:nsid w:val="3ACC6F0A"/>
     <w:multiLevelType w:val="hybridMultilevel"/>
     <w:tmpl w:val="5DBA38D0"/>
@@ -4508,7 +5019,7 @@
       </w:rPr>
     </w:lvl>
   </w:abstractNum>
-  <w:abstractNum w:abstractNumId="8" w15:restartNumberingAfterBreak="0">
+  <w:abstractNum w:abstractNumId="9" w15:restartNumberingAfterBreak="0">
     <w:nsid w:val="5A6A6B00"/>
     <w:multiLevelType w:val="hybridMultilevel"/>
     <w:tmpl w:val="7420735E"/>
@@ -4621,7 +5132,7 @@
       </w:rPr>
     </w:lvl>
   </w:abstractNum>
-  <w:abstractNum w:abstractNumId="9" w15:restartNumberingAfterBreak="0">
+  <w:abstractNum w:abstractNumId="10" w15:restartNumberingAfterBreak="0">
     <w:nsid w:val="78E12896"/>
     <w:multiLevelType w:val="hybridMultilevel"/>
     <w:tmpl w:val="936299E4"/>
@@ -4735,34 +5246,37 @@
     </w:lvl>
   </w:abstractNum>
   <w:num w:numId="1" w16cid:durableId="1174687561">
-    <w:abstractNumId w:val="8"/>
+    <w:abstractNumId w:val="9"/>
   </w:num>
   <w:num w:numId="2" w16cid:durableId="1452284289">
-    <w:abstractNumId w:val="1"/>
+    <w:abstractNumId w:val="2"/>
   </w:num>
   <w:num w:numId="3" w16cid:durableId="1368523310">
-    <w:abstractNumId w:val="7"/>
+    <w:abstractNumId w:val="8"/>
   </w:num>
   <w:num w:numId="4" w16cid:durableId="1622690477">
     <w:abstractNumId w:val="0"/>
   </w:num>
   <w:num w:numId="5" w16cid:durableId="559099641">
+    <w:abstractNumId w:val="5"/>
+  </w:num>
+  <w:num w:numId="6" w16cid:durableId="423036140">
+    <w:abstractNumId w:val="10"/>
+  </w:num>
+  <w:num w:numId="7" w16cid:durableId="1493718539">
+    <w:abstractNumId w:val="7"/>
+  </w:num>
+  <w:num w:numId="8" w16cid:durableId="1780682702">
+    <w:abstractNumId w:val="6"/>
+  </w:num>
+  <w:num w:numId="9" w16cid:durableId="753165287">
     <w:abstractNumId w:val="4"/>
   </w:num>
-  <w:num w:numId="6" w16cid:durableId="423036140">
-    <w:abstractNumId w:val="9"/>
-  </w:num>
-  <w:num w:numId="7" w16cid:durableId="1493718539">
-    <w:abstractNumId w:val="6"/>
-  </w:num>
-  <w:num w:numId="8" w16cid:durableId="1780682702">
-    <w:abstractNumId w:val="5"/>
-  </w:num>
-  <w:num w:numId="9" w16cid:durableId="753165287">
+  <w:num w:numId="10" w16cid:durableId="443500220">
     <w:abstractNumId w:val="3"/>
   </w:num>
-  <w:num w:numId="10" w16cid:durableId="443500220">
-    <w:abstractNumId w:val="2"/>
+  <w:num w:numId="11" w16cid:durableId="1564482762">
+    <w:abstractNumId w:val="1"/>
   </w:num>
 </w:numbering>
 </file>

</xml_diff>